<commit_message>
docs(investigacion): agregar Tema 3 - patrones de arquitectura para aplicaciones web
</commit_message>
<xml_diff>
--- a/informe-investigacion/Informe_Investigacion_Unidad_III.docx
+++ b/informe-investigacion/Informe_Investigacion_Unidad_III.docx
@@ -238,7 +238,7 @@
           </mc:Choice>
           <mc:Fallback>
             <w:pict>
-              <v:group w14:anchorId="4C453FFA" id="Group 17289" o:spid="_x0000_s1026" style="position:absolute;margin-left:0;margin-top:73.25pt;width:453.5pt;height:0;z-index:251658240;mso-position-horizontal:left;mso-position-horizontal-relative:margin" coordorigin="-45262,381" coordsize="57599,0" o:gfxdata="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">
+              <v:group w14:anchorId="6350B1C8" id="Group 17289" o:spid="_x0000_s1026" style="position:absolute;margin-left:0;margin-top:73.25pt;width:453.5pt;height:0;z-index:251658240;mso-position-horizontal:left;mso-position-horizontal-relative:margin" coordorigin="-45262,381" coordsize="57599,0" o:gfxdata="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">
                 <v:shape id="Shape 14" o:spid="_x0000_s1027" style="position:absolute;left:-45262;top:381;width:57599;height:0;visibility:visible;mso-wrap-style:square;v-text-anchor:top" coordsize="5759996,0" o:gfxdata="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" path="m,l5759996,e" filled="f" strokeweight=".17569mm">
                   <v:stroke miterlimit="83231f" joinstyle="miter"/>
                   <v:path arrowok="t" textboxrect="0,0,5759996,0"/>
@@ -593,43 +593,28 @@
         <w:t xml:space="preserve">, exponiendo métodos como </w:t>
       </w:r>
       <w:proofErr w:type="spellStart"/>
-      <w:proofErr w:type="gramStart"/>
       <w:r>
         <w:t>getParameter</w:t>
       </w:r>
       <w:proofErr w:type="spellEnd"/>
       <w:r>
-        <w:t>(</w:t>
-      </w:r>
-      <w:proofErr w:type="gramEnd"/>
-      <w:r>
-        <w:t xml:space="preserve">) para leer datos de un formulario, </w:t>
+        <w:t xml:space="preserve">() para leer datos de un formulario, </w:t>
       </w:r>
       <w:proofErr w:type="spellStart"/>
-      <w:proofErr w:type="gramStart"/>
       <w:r>
         <w:t>getHeader</w:t>
       </w:r>
       <w:proofErr w:type="spellEnd"/>
       <w:r>
-        <w:t>(</w:t>
-      </w:r>
-      <w:proofErr w:type="gramEnd"/>
-      <w:r>
-        <w:t xml:space="preserve">) para leer una cabecera específica, o </w:t>
+        <w:t xml:space="preserve">() para leer una cabecera específica, o </w:t>
       </w:r>
       <w:proofErr w:type="spellStart"/>
-      <w:proofErr w:type="gramStart"/>
       <w:r>
         <w:t>getMethod</w:t>
       </w:r>
       <w:proofErr w:type="spellEnd"/>
       <w:r>
-        <w:t>(</w:t>
-      </w:r>
-      <w:proofErr w:type="gramEnd"/>
-      <w:r>
-        <w:t>) para saber si la petición fue GET o POST</w:t>
+        <w:t>() para saber si la petición fue GET o POST</w:t>
       </w:r>
       <w:sdt>
         <w:sdtPr>
@@ -792,17 +777,12 @@
         <w:t xml:space="preserve">. Esto obliga a que toda la lógica de decisión (por ejemplo, decidir si algo salió bien o mal) ocurra antes de empezar a escribir el cuerpo de la respuesta. En PHP ocurre algo parecido: todo lo que el script imprime se convierte en el cuerpo de la respuesta, y la función </w:t>
       </w:r>
       <w:proofErr w:type="spellStart"/>
-      <w:proofErr w:type="gramStart"/>
       <w:r>
         <w:t>header</w:t>
       </w:r>
       <w:proofErr w:type="spellEnd"/>
       <w:r>
-        <w:t>(</w:t>
-      </w:r>
-      <w:proofErr w:type="gramEnd"/>
-      <w:r>
-        <w:t xml:space="preserve">) debe llamarse antes de que se haya impreso cualquier contenido, o PHP genera un error, reflejando la misma restricción de fondo. En ASP.NET Core, la propiedad </w:t>
+        <w:t xml:space="preserve">() debe llamarse antes de que se haya impreso cualquier contenido, o PHP genera un error, reflejando la misma restricción de fondo. En ASP.NET Core, la propiedad </w:t>
       </w:r>
       <w:proofErr w:type="spellStart"/>
       <w:r>
@@ -939,12 +919,10 @@
         <w:t xml:space="preserve">, obtenido llamando a </w:t>
       </w:r>
       <w:proofErr w:type="spellStart"/>
-      <w:proofErr w:type="gramStart"/>
       <w:r>
         <w:t>request.getSession</w:t>
       </w:r>
       <w:proofErr w:type="spellEnd"/>
-      <w:proofErr w:type="gramEnd"/>
       <w:r>
         <w:t xml:space="preserve">() </w:t>
       </w:r>
@@ -975,19 +953,11 @@
       </w:r>
       <w:proofErr w:type="spellStart"/>
       <w:r>
-        <w:t>session_</w:t>
-      </w:r>
-      <w:proofErr w:type="gramStart"/>
-      <w:r>
-        <w:t>start</w:t>
+        <w:t>session_start</w:t>
       </w:r>
       <w:proofErr w:type="spellEnd"/>
       <w:r>
-        <w:t>(</w:t>
-      </w:r>
-      <w:proofErr w:type="gramEnd"/>
-      <w:r>
-        <w:t xml:space="preserve">) </w:t>
+        <w:t xml:space="preserve">() </w:t>
       </w:r>
       <w:sdt>
         <w:sdtPr>
@@ -1541,7 +1511,6 @@
         <w:t xml:space="preserve">, creado a partir de </w:t>
       </w:r>
       <w:proofErr w:type="spellStart"/>
-      <w:proofErr w:type="gramStart"/>
       <w:r>
         <w:rPr>
           <w:sz w:val="24"/>
@@ -1549,7 +1518,6 @@
         <w:t>connection.prepareStatement</w:t>
       </w:r>
       <w:proofErr w:type="spellEnd"/>
-      <w:proofErr w:type="gramEnd"/>
       <w:r>
         <w:rPr>
           <w:sz w:val="24"/>
@@ -1557,7 +1525,6 @@
         <w:t xml:space="preserve">(), donde los valores se asignan uno por uno con métodos como </w:t>
       </w:r>
       <w:proofErr w:type="spellStart"/>
-      <w:proofErr w:type="gramStart"/>
       <w:r>
         <w:rPr>
           <w:sz w:val="24"/>
@@ -1569,17 +1536,9 @@
         <w:rPr>
           <w:sz w:val="24"/>
         </w:rPr>
-        <w:t>(</w:t>
-      </w:r>
-      <w:proofErr w:type="gramEnd"/>
-      <w:r>
-        <w:rPr>
-          <w:sz w:val="24"/>
-        </w:rPr>
-        <w:t xml:space="preserve">) o </w:t>
+        <w:t xml:space="preserve">() o </w:t>
       </w:r>
       <w:proofErr w:type="spellStart"/>
-      <w:proofErr w:type="gramStart"/>
       <w:r>
         <w:rPr>
           <w:sz w:val="24"/>
@@ -1591,14 +1550,7 @@
         <w:rPr>
           <w:sz w:val="24"/>
         </w:rPr>
-        <w:t>(</w:t>
-      </w:r>
-      <w:proofErr w:type="gramEnd"/>
-      <w:r>
-        <w:rPr>
-          <w:sz w:val="24"/>
-        </w:rPr>
-        <w:t xml:space="preserve">) antes de ejecutar la consulta </w:t>
+        <w:t xml:space="preserve">() antes de ejecutar la consulta </w:t>
       </w:r>
       <w:sdt>
         <w:sdtPr>
@@ -1624,24 +1576,9 @@
         <w:rPr>
           <w:sz w:val="24"/>
         </w:rPr>
-        <w:t xml:space="preserve">. En PDO, el mismo patrón se logra con </w:t>
-      </w:r>
-      <w:proofErr w:type="gramStart"/>
-      <w:r>
-        <w:rPr>
-          <w:sz w:val="24"/>
-        </w:rPr>
-        <w:t>prepare(</w:t>
-      </w:r>
-      <w:proofErr w:type="gramEnd"/>
-      <w:r>
-        <w:rPr>
-          <w:sz w:val="24"/>
-        </w:rPr>
-        <w:t xml:space="preserve">), </w:t>
+        <w:t xml:space="preserve">. En PDO, el mismo patrón se logra con prepare(), </w:t>
       </w:r>
       <w:proofErr w:type="spellStart"/>
-      <w:proofErr w:type="gramStart"/>
       <w:r>
         <w:rPr>
           <w:sz w:val="24"/>
@@ -1653,17 +1590,9 @@
         <w:rPr>
           <w:sz w:val="24"/>
         </w:rPr>
-        <w:t>(</w:t>
-      </w:r>
-      <w:proofErr w:type="gramEnd"/>
-      <w:r>
-        <w:rPr>
-          <w:sz w:val="24"/>
-        </w:rPr>
-        <w:t xml:space="preserve">) y </w:t>
+        <w:t xml:space="preserve">() y </w:t>
       </w:r>
       <w:proofErr w:type="spellStart"/>
-      <w:proofErr w:type="gramStart"/>
       <w:r>
         <w:rPr>
           <w:sz w:val="24"/>
@@ -1675,14 +1604,7 @@
         <w:rPr>
           <w:sz w:val="24"/>
         </w:rPr>
-        <w:t>(</w:t>
-      </w:r>
-      <w:proofErr w:type="gramEnd"/>
-      <w:r>
-        <w:rPr>
-          <w:sz w:val="24"/>
-        </w:rPr>
-        <w:t xml:space="preserve">) </w:t>
+        <w:t xml:space="preserve">() </w:t>
       </w:r>
       <w:sdt>
         <w:sdtPr>
@@ -1900,14 +1822,397 @@
     </w:p>
     <w:p>
       <w:pPr>
-        <w:spacing w:after="109" w:line="259" w:lineRule="auto"/>
-        <w:ind w:left="435" w:right="0" w:firstLine="0"/>
+        <w:pStyle w:val="Ttulo1"/>
+      </w:pPr>
+      <w:r>
+        <w:t xml:space="preserve">Tema </w:t>
+      </w:r>
+      <w:r>
+        <w:t>3</w:t>
+      </w:r>
+      <w:r>
+        <w:t xml:space="preserve">: </w:t>
+      </w:r>
+      <w:r>
+        <w:t>Patrones de Arquitectura para Aplicaciones Web</w:t>
+      </w:r>
+    </w:p>
+    <w:p>
+      <w:r>
+        <w:t>La arquitectura de software determina qué tan fácil (o difícil) será mantener y hacer crecer una aplicación web con el tiempo, mucho más allá de si el código funciona correctamente en el momento en que se escribe. Este tema revisa los principios generales detrás de esa disciplina, y las principales formas de organizar un sistema, desde la arquitectura por capas —la más común en aplicaciones web tradicionales— hasta alternativas como los microservicios o las arquitecturas orientadas a eventos.</w:t>
+      </w:r>
+    </w:p>
+    <w:p>
+      <w:pPr>
+        <w:ind w:left="0" w:firstLine="0"/>
+        <w:rPr>
+          <w:b/>
+          <w:bCs/>
+        </w:rPr>
+      </w:pPr>
+      <w:r>
+        <w:rPr>
+          <w:b/>
+          <w:bCs/>
+        </w:rPr>
+        <w:t>4.1 Principios de arquitectura de software</w:t>
+      </w:r>
+    </w:p>
+    <w:p>
+      <w:pPr>
+        <w:ind w:left="0" w:firstLine="0"/>
+      </w:pPr>
+      <w:r>
+        <w:t xml:space="preserve">La arquitectura de software se define como el conjunto de decisiones estructurales fundamentales sobre cómo se organiza un sistema: qué elementos lo componen, cómo se relacionan entre sí, y qué principios guían su diseño y evolución </w:t>
+      </w:r>
+      <w:sdt>
+        <w:sdtPr>
+          <w:tag w:val="MENDELEY_CITATION_v3_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"/>
+          <w:id w:val="-1017999732"/>
+          <w:placeholder>
+            <w:docPart w:val="DefaultPlaceholder_-1854013440"/>
+          </w:placeholder>
+        </w:sdtPr>
+        <w:sdtContent>
+          <w:r>
+            <w:t>[8]</w:t>
+          </w:r>
+        </w:sdtContent>
+      </w:sdt>
+      <w:r>
+        <w:t xml:space="preserve">. Estas decisiones determinan atributos de calidad como el rendimiento, la seguridad, la mantenibilidad y la capacidad de escalar, y son mucho más difíciles de revertir que un simple error de código: un error arquitectónico temprano, como acoplar excesivamente la lógica de negocio con el </w:t>
+      </w:r>
+      <w:r>
+        <w:lastRenderedPageBreak/>
+        <w:t xml:space="preserve">acceso a datos, puede volverse costoso de corregir a medida que el sistema crece </w:t>
+      </w:r>
+      <w:sdt>
+        <w:sdtPr>
+          <w:tag w:val="MENDELEY_CITATION_v3_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"/>
+          <w:id w:val="1524211391"/>
+          <w:placeholder>
+            <w:docPart w:val="DefaultPlaceholder_-1854013440"/>
+          </w:placeholder>
+        </w:sdtPr>
+        <w:sdtContent>
+          <w:r>
+            <w:t>[8]</w:t>
+          </w:r>
+        </w:sdtContent>
+      </w:sdt>
+      <w:r>
+        <w:t>. Por eso, la arquitectura no es un diagrama que se dibuja una vez al inicio del proyecto, sino un conjunto de decisiones que condicionan tanto la velocidad de desarrollo del equipo como la facilidad con la que se pueden incorporar nuevas funcionalidades sin romper las existentes.</w:t>
+      </w:r>
+    </w:p>
+    <w:p>
+      <w:pPr>
+        <w:ind w:left="0" w:firstLine="0"/>
+      </w:pPr>
+    </w:p>
+    <w:p>
+      <w:pPr>
+        <w:ind w:left="0" w:firstLine="0"/>
+        <w:rPr>
+          <w:b/>
+          <w:bCs/>
+        </w:rPr>
+      </w:pPr>
+      <w:r>
+        <w:rPr>
+          <w:b/>
+          <w:bCs/>
+        </w:rPr>
+        <w:t>4.</w:t>
+      </w:r>
+      <w:r>
+        <w:rPr>
+          <w:b/>
+          <w:bCs/>
+        </w:rPr>
+        <w:t>2</w:t>
+      </w:r>
+      <w:r>
+        <w:rPr>
+          <w:b/>
+          <w:bCs/>
+        </w:rPr>
+        <w:t xml:space="preserve"> Arquitectura por capas</w:t>
+      </w:r>
+    </w:p>
+    <w:p>
+      <w:pPr>
+        <w:ind w:left="0" w:firstLine="0"/>
+      </w:pPr>
+      <w:r>
+        <w:t xml:space="preserve">La arquitectura por capas organiza el sistema en niveles horizontales, donde cada capa solo se comunica con la inmediata inferior, típicamente separando presentación, lógica de negocio y acceso a datos </w:t>
+      </w:r>
+      <w:sdt>
+        <w:sdtPr>
+          <w:tag w:val="MENDELEY_CITATION_v3_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"/>
+          <w:id w:val="1456369010"/>
+          <w:placeholder>
+            <w:docPart w:val="DefaultPlaceholder_-1854013440"/>
+          </w:placeholder>
+        </w:sdtPr>
+        <w:sdtContent>
+          <w:r>
+            <w:t>[9]</w:t>
+          </w:r>
+        </w:sdtContent>
+      </w:sdt>
+      <w:r>
+        <w:t xml:space="preserve">. Garlan y Shaw señalan que este estilo tiene ventajas concretas: soporta el diseño basado en niveles crecientes de abstracción, lo que permite dividir un problema complejo en pasos incrementales; facilita mejoras porque cada capa solo interactúa con las capas inmediatamente adyacentes, de modo que un cambio afecta como máximo a dos niveles; y favorece la reutilización, ya que distintas implementaciones de una misma capa pueden intercambiarse siempre que respeten la misma interfaz hacia las capas vecinas </w:t>
+      </w:r>
+      <w:sdt>
+        <w:sdtPr>
+          <w:tag w:val="MENDELEY_CITATION_v3_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"/>
+          <w:id w:val="-802919476"/>
+          <w:placeholder>
+            <w:docPart w:val="DefaultPlaceholder_-1854013440"/>
+          </w:placeholder>
+        </w:sdtPr>
+        <w:sdtContent>
+          <w:r>
+            <w:t>[9]</w:t>
+          </w:r>
+        </w:sdtContent>
+      </w:sdt>
+      <w:r>
+        <w:t xml:space="preserve">. La desventaja principal es que no todos los sistemas se estructuran naturalmente en capas limpias, y a veces las consideraciones de rendimiento obligan a acoplar más de lo ideal una función de alto nivel con su implementación de bajo nivel </w:t>
+      </w:r>
+      <w:sdt>
+        <w:sdtPr>
+          <w:tag w:val="MENDELEY_CITATION_v3_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"/>
+          <w:id w:val="-2117202210"/>
+          <w:placeholder>
+            <w:docPart w:val="DefaultPlaceholder_-1854013440"/>
+          </w:placeholder>
+        </w:sdtPr>
+        <w:sdtContent>
+          <w:r>
+            <w:t>[9]</w:t>
+          </w:r>
+        </w:sdtContent>
+      </w:sdt>
+      <w:r>
+        <w:t>. En una aplicación web típica, esto se traduce en Controladores que reciben las peticiones HTTP, Servicios que contienen las reglas de negocio, y Repositorios que encapsulan el acceso a la base de datos.</w:t>
+      </w:r>
+    </w:p>
+    <w:p>
+      <w:pPr>
+        <w:ind w:left="0" w:firstLine="0"/>
+      </w:pPr>
+    </w:p>
+    <w:p>
+      <w:pPr>
+        <w:ind w:left="0" w:firstLine="0"/>
+        <w:rPr>
+          <w:b/>
+          <w:bCs/>
+        </w:rPr>
+      </w:pPr>
+      <w:r>
+        <w:rPr>
+          <w:b/>
+          <w:bCs/>
+        </w:rPr>
+        <w:t>4.</w:t>
+      </w:r>
+      <w:r>
+        <w:rPr>
+          <w:b/>
+          <w:bCs/>
+        </w:rPr>
+        <w:t>3</w:t>
+      </w:r>
+      <w:r>
+        <w:rPr>
+          <w:b/>
+          <w:bCs/>
+        </w:rPr>
+        <w:t xml:space="preserve"> Arquitecturas en pizarra, dirigida por eventos y peer-to-peer</w:t>
+      </w:r>
+    </w:p>
+    <w:p>
+      <w:pPr>
+        <w:ind w:left="0" w:firstLine="0"/>
+      </w:pPr>
+      <w:r>
+        <w:t>El estilo de pizarra (</w:t>
+      </w:r>
+      <w:proofErr w:type="spellStart"/>
+      <w:r>
+        <w:t>blackboard</w:t>
+      </w:r>
+      <w:proofErr w:type="spellEnd"/>
+      <w:r>
+        <w:t xml:space="preserve">) organiza el sistema alrededor de un repositorio de datos central y compartido, donde varios componentes independientes —llamados fuentes de conocimiento— se activan automáticamente cuando el dato que les interesa cambia, de forma similar a como funciona una base de datos activa que invoca componentes externos según qué información se modificó </w:t>
+      </w:r>
+      <w:sdt>
+        <w:sdtPr>
+          <w:tag w:val="MENDELEY_CITATION_v3_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"/>
+          <w:id w:val="1619568231"/>
+          <w:placeholder>
+            <w:docPart w:val="DefaultPlaceholder_-1854013440"/>
+          </w:placeholder>
+        </w:sdtPr>
+        <w:sdtContent>
+          <w:r>
+            <w:t>[9]</w:t>
+          </w:r>
+        </w:sdtContent>
+      </w:sdt>
+      <w:r>
+        <w:t>. Este estilo es útil cuando ningún algoritmo único conoce la solución completa de un problema, y distintos componentes especializados deben ir aportando piezas de la solución de forma oportunista.</w:t>
+      </w:r>
+    </w:p>
+    <w:p>
+      <w:pPr>
+        <w:ind w:left="0" w:firstLine="0"/>
+      </w:pPr>
+      <w:r>
+        <w:t>La arquitectura orientada a eventos, en cambio, organiza el sistema alrededor de productores que generan eventos cuando ocurre un cambio de estado relevante, y consumidores que reaccionan a esos eventos de forma asíncrona, comunicados a través de un intermediario (</w:t>
+      </w:r>
+      <w:proofErr w:type="spellStart"/>
+      <w:r>
+        <w:t>event</w:t>
+      </w:r>
+      <w:proofErr w:type="spellEnd"/>
+      <w:r>
+        <w:t xml:space="preserve"> bus o </w:t>
+      </w:r>
+      <w:proofErr w:type="spellStart"/>
+      <w:r>
+        <w:t>broker</w:t>
+      </w:r>
+      <w:proofErr w:type="spellEnd"/>
+      <w:r>
+        <w:t>) que los desacopla en el tiempo y en el espacio. A diferencia del modelo REST síncrono, donde el cliente espera una respuesta inmediata, este estilo permite que productor y consumidor operen de forma independiente, mejorando la resiliencia ante picos de carga a costa de mayor complejidad para razonar sobre el orden de los eventos.</w:t>
+      </w:r>
+    </w:p>
+    <w:p>
+      <w:pPr>
+        <w:ind w:left="0" w:firstLine="0"/>
+      </w:pPr>
+      <w:r>
+        <w:t>Las arquitecturas peer-to-peer (P2P), por su parte, eliminan la distinción entre cliente y servidor: cada nodo de la red puede actuar simultáneamente como consumidor y proveedor de un recurso, comunicándose directamente con otros nodos sin depender de un servidor central único. Esto elimina el punto único de fallo que representa un servidor central, pero introduce el desafío de coordinar nodos que pueden desconectarse en cualquier momento, sin que ningún nodo tenga una visión completa y actualizada del sistema.</w:t>
+      </w:r>
+    </w:p>
+    <w:p>
+      <w:pPr>
+        <w:ind w:left="0" w:firstLine="0"/>
+      </w:pPr>
+    </w:p>
+    <w:p>
+      <w:pPr>
+        <w:ind w:left="0" w:firstLine="0"/>
+        <w:rPr>
+          <w:b/>
+          <w:bCs/>
+        </w:rPr>
+      </w:pPr>
+      <w:r>
+        <w:rPr>
+          <w:b/>
+          <w:bCs/>
+        </w:rPr>
+        <w:t>4.</w:t>
+      </w:r>
+      <w:r>
+        <w:rPr>
+          <w:b/>
+          <w:bCs/>
+        </w:rPr>
+        <w:t>4</w:t>
+      </w:r>
+      <w:r>
+        <w:rPr>
+          <w:b/>
+          <w:bCs/>
+        </w:rPr>
+        <w:t xml:space="preserve"> Arquitectura Orientada a Servicios (SOA) y Microservicios</w:t>
+      </w:r>
+    </w:p>
+    <w:p>
+      <w:pPr>
+        <w:ind w:left="0" w:firstLine="0"/>
+      </w:pPr>
+      <w:r>
+        <w:t xml:space="preserve">La Arquitectura Orientada a Servicios (SOA) es un marco conceptual que organiza las capacidades de un sistema como servicios independientes, entendidos como mecanismos para proporcionar acceso a una o más capacidades, donde ese acceso se da a través de una interfaz definida y se ejerce de forma consistente con las restricciones y políticas especificadas por la descripción del servicio </w:t>
+      </w:r>
+      <w:sdt>
+        <w:sdtPr>
+          <w:tag w:val="MENDELEY_CITATION_v3_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"/>
+          <w:id w:val="1804279535"/>
+          <w:placeholder>
+            <w:docPart w:val="DefaultPlaceholder_-1854013440"/>
+          </w:placeholder>
+        </w:sdtPr>
+        <w:sdtContent>
+          <w:r>
+            <w:t>[10]</w:t>
+          </w:r>
+        </w:sdtContent>
+      </w:sdt>
+      <w:r>
+        <w:t xml:space="preserve">. El modelo de referencia de OASIS para SOA es deliberadamente abstracto: no está atado a ninguna tecnología o estándar concreto, sino </w:t>
+      </w:r>
+      <w:r>
+        <w:lastRenderedPageBreak/>
+        <w:t xml:space="preserve">que busca dar un vocabulario común para razonar sobre sistemas orientados a servicios independientemente de cómo se implementen </w:t>
+      </w:r>
+      <w:sdt>
+        <w:sdtPr>
+          <w:tag w:val="MENDELEY_CITATION_v3_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"/>
+          <w:id w:val="1432399032"/>
+          <w:placeholder>
+            <w:docPart w:val="DefaultPlaceholder_-1854013440"/>
+          </w:placeholder>
+        </w:sdtPr>
+        <w:sdtContent>
+          <w:r>
+            <w:t>[10]</w:t>
+          </w:r>
+        </w:sdtContent>
+      </w:sdt>
+      <w:r>
+        <w:t>.</w:t>
+      </w:r>
+    </w:p>
+    <w:p>
+      <w:pPr>
+        <w:ind w:left="0" w:firstLine="0"/>
+      </w:pPr>
+      <w:r>
+        <w:t xml:space="preserve">Los microservicios son, en cierto sentido, una evolución concreta y más granular de esa misma idea: dividen el sistema en servicios pequeños e independientes, cada uno con su propia base de datos y ciclo de despliegue propio, que se comunican entre sí por red [10]. Esto permite escalar cada servicio por separado y que distintos equipos trabajen sin bloquearse mutuamente, pero introduce complejidad operativa considerable: hay que gestionar comunicación entre servicios, consistencia de datos distribuidos, y tolerancia a fallos de red que en un sistema monolítico simplemente no existen </w:t>
+      </w:r>
+      <w:sdt>
+        <w:sdtPr>
+          <w:tag w:val="MENDELEY_CITATION_v3_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"/>
+          <w:id w:val="-1494017714"/>
+          <w:placeholder>
+            <w:docPart w:val="DefaultPlaceholder_-1854013440"/>
+          </w:placeholder>
+        </w:sdtPr>
+        <w:sdtContent>
+          <w:r>
+            <w:t>[11]</w:t>
+          </w:r>
+        </w:sdtContent>
+      </w:sdt>
+      <w:r>
+        <w:t>. Por esta razón, tanto SOA como los microservicios se justifican principalmente cuando el tamaño del equipo o del sistema ya no puede coordinarse eficientemente dentro de una sola base de código compartida; para proyectos pequeños o de alcance acotado, la arquitectura por capas dentro de un único despliegue suele ser la opción más razonable.</w:t>
+      </w:r>
+    </w:p>
+    <w:p>
+      <w:pPr>
+        <w:ind w:left="0" w:firstLine="0"/>
       </w:pPr>
     </w:p>
     <w:sdt>
       <w:sdtPr>
         <w:tag w:val="MENDELEY_BIBLIOGRAPHY"/>
-        <w:id w:val="-1374847388"/>
+        <w:id w:val="1444352933"/>
         <w:placeholder>
           <w:docPart w:val="DefaultPlaceholder_-1854013440"/>
         </w:placeholder>
@@ -1918,7 +2223,7 @@
             <w:autoSpaceDE w:val="0"/>
             <w:autoSpaceDN w:val="0"/>
             <w:ind w:hanging="640"/>
-            <w:divId w:val="906110940"/>
+            <w:divId w:val="263609518"/>
             <w:rPr>
               <w:rFonts w:eastAsia="Times New Roman"/>
               <w:kern w:val="0"/>
@@ -1947,7 +2252,7 @@
             <w:autoSpaceDE w:val="0"/>
             <w:autoSpaceDN w:val="0"/>
             <w:ind w:hanging="640"/>
-            <w:divId w:val="506941999"/>
+            <w:divId w:val="251353451"/>
             <w:rPr>
               <w:rFonts w:eastAsia="Times New Roman"/>
               <w:lang w:val="en-US"/>
@@ -1966,23 +2271,7 @@
               <w:lang w:val="en-US"/>
             </w:rPr>
             <w:tab/>
-            <w:t>The PHP Group, “</w:t>
-          </w:r>
-          <w:proofErr w:type="spellStart"/>
-          <w:r>
-            <w:rPr>
-              <w:rFonts w:eastAsia="Times New Roman"/>
-              <w:lang w:val="en-US"/>
-            </w:rPr>
-            <w:t>Superglobals</w:t>
-          </w:r>
-          <w:proofErr w:type="spellEnd"/>
-          <w:r>
-            <w:rPr>
-              <w:rFonts w:eastAsia="Times New Roman"/>
-              <w:lang w:val="en-US"/>
-            </w:rPr>
-            <w:t>.” Accessed: Jul. 15, 2026. [Online]. Available: https://www.php.net/manual/en/language.variables.superglobals.php</w:t>
+            <w:t>The PHP Group, “Superglobals.” Accessed: Jul. 15, 2026. [Online]. Available: https://www.php.net/manual/en/language.variables.superglobals.php</w:t>
           </w:r>
         </w:p>
         <w:p>
@@ -1990,7 +2279,7 @@
             <w:autoSpaceDE w:val="0"/>
             <w:autoSpaceDN w:val="0"/>
             <w:ind w:hanging="640"/>
-            <w:divId w:val="2081248830"/>
+            <w:divId w:val="1483697378"/>
             <w:rPr>
               <w:rFonts w:eastAsia="Times New Roman"/>
               <w:lang w:val="en-US"/>
@@ -2017,7 +2306,7 @@
             <w:autoSpaceDE w:val="0"/>
             <w:autoSpaceDN w:val="0"/>
             <w:ind w:hanging="640"/>
-            <w:divId w:val="567150421"/>
+            <w:divId w:val="683824179"/>
             <w:rPr>
               <w:rFonts w:eastAsia="Times New Roman"/>
               <w:lang w:val="en-US"/>
@@ -2044,7 +2333,7 @@
             <w:autoSpaceDE w:val="0"/>
             <w:autoSpaceDN w:val="0"/>
             <w:ind w:hanging="640"/>
-            <w:divId w:val="932980981"/>
+            <w:divId w:val="1790198106"/>
             <w:rPr>
               <w:rFonts w:eastAsia="Times New Roman"/>
               <w:lang w:val="en-US"/>
@@ -2071,7 +2360,7 @@
             <w:autoSpaceDE w:val="0"/>
             <w:autoSpaceDN w:val="0"/>
             <w:ind w:hanging="640"/>
-            <w:divId w:val="1846901686"/>
+            <w:divId w:val="736782923"/>
             <w:rPr>
               <w:rFonts w:eastAsia="Times New Roman"/>
               <w:lang w:val="en-US"/>
@@ -2082,7 +2371,6 @@
               <w:rFonts w:eastAsia="Times New Roman"/>
               <w:lang w:val="en-US"/>
             </w:rPr>
-            <w:lastRenderedPageBreak/>
             <w:t>[6]</w:t>
           </w:r>
           <w:r>
@@ -2099,7 +2387,7 @@
             <w:autoSpaceDE w:val="0"/>
             <w:autoSpaceDN w:val="0"/>
             <w:ind w:hanging="640"/>
-            <w:divId w:val="484862047"/>
+            <w:divId w:val="1165972255"/>
             <w:rPr>
               <w:rFonts w:eastAsia="Times New Roman"/>
               <w:lang w:val="en-US"/>
@@ -2123,13 +2411,132 @@
         </w:p>
         <w:p>
           <w:pPr>
-            <w:spacing w:after="109" w:line="259" w:lineRule="auto"/>
-            <w:ind w:left="435" w:right="0" w:firstLine="0"/>
-          </w:pPr>
-          <w:r>
+            <w:autoSpaceDE w:val="0"/>
+            <w:autoSpaceDN w:val="0"/>
+            <w:ind w:hanging="640"/>
+            <w:divId w:val="1901356304"/>
             <w:rPr>
               <w:rFonts w:eastAsia="Times New Roman"/>
               <w:lang w:val="en-US"/>
+            </w:rPr>
+          </w:pPr>
+          <w:r>
+            <w:rPr>
+              <w:rFonts w:eastAsia="Times New Roman"/>
+              <w:lang w:val="en-US"/>
+            </w:rPr>
+            <w:t>[8]</w:t>
+          </w:r>
+          <w:r>
+            <w:rPr>
+              <w:rFonts w:eastAsia="Times New Roman"/>
+              <w:lang w:val="en-US"/>
+            </w:rPr>
+            <w:tab/>
+            <w:t>IEEE Computer Society, “Guide to the Software Engineering Body of Knowledge (SWEBOK), versión 4.0.” Accessed: Jul. 15, 2026. [Online]. Available: https://ieeecs-media.computer.org/media/education/swebok/swebok-v4.pdf</w:t>
+          </w:r>
+        </w:p>
+        <w:p>
+          <w:pPr>
+            <w:autoSpaceDE w:val="0"/>
+            <w:autoSpaceDN w:val="0"/>
+            <w:ind w:hanging="640"/>
+            <w:divId w:val="2059081760"/>
+            <w:rPr>
+              <w:rFonts w:eastAsia="Times New Roman"/>
+              <w:lang w:val="en-US"/>
+            </w:rPr>
+          </w:pPr>
+          <w:r>
+            <w:rPr>
+              <w:rFonts w:eastAsia="Times New Roman"/>
+              <w:lang w:val="en-US"/>
+            </w:rPr>
+            <w:t>[9]</w:t>
+          </w:r>
+          <w:r>
+            <w:rPr>
+              <w:rFonts w:eastAsia="Times New Roman"/>
+              <w:lang w:val="en-US"/>
+            </w:rPr>
+            <w:tab/>
+            <w:t>D. Garlan and M. Shaw, “An Introduction to Software Architecture,” 1994. Accessed: Jul. 15, 2026. [Online]. Available: http://sunnyday.mit.edu/16.355/intro_softarch.pdf</w:t>
+          </w:r>
+        </w:p>
+        <w:p>
+          <w:pPr>
+            <w:autoSpaceDE w:val="0"/>
+            <w:autoSpaceDN w:val="0"/>
+            <w:ind w:hanging="640"/>
+            <w:divId w:val="1404445003"/>
+            <w:rPr>
+              <w:rFonts w:eastAsia="Times New Roman"/>
+              <w:lang w:val="en-US"/>
+            </w:rPr>
+          </w:pPr>
+          <w:r>
+            <w:rPr>
+              <w:rFonts w:eastAsia="Times New Roman"/>
+              <w:lang w:val="en-US"/>
+            </w:rPr>
+            <w:t>[10]</w:t>
+          </w:r>
+          <w:r>
+            <w:rPr>
+              <w:rFonts w:eastAsia="Times New Roman"/>
+              <w:lang w:val="en-US"/>
+            </w:rPr>
+            <w:tab/>
+            <w:t>OASIS, “Reference Model for Service Oriented Architecture 1.0,” 2006. Accessed: Jul. 15, 2026. [Online]. Available: https://docs.oasis-open.org/soa-rm/v1.0/soa-rm.pdf</w:t>
+          </w:r>
+        </w:p>
+        <w:p>
+          <w:pPr>
+            <w:autoSpaceDE w:val="0"/>
+            <w:autoSpaceDN w:val="0"/>
+            <w:ind w:hanging="640"/>
+            <w:divId w:val="2046564576"/>
+            <w:rPr>
+              <w:rFonts w:eastAsia="Times New Roman"/>
+            </w:rPr>
+          </w:pPr>
+          <w:r>
+            <w:rPr>
+              <w:rFonts w:eastAsia="Times New Roman"/>
+              <w:lang w:val="en-US"/>
+            </w:rPr>
+            <w:t>[11]</w:t>
+          </w:r>
+          <w:r>
+            <w:rPr>
+              <w:rFonts w:eastAsia="Times New Roman"/>
+              <w:lang w:val="en-US"/>
+            </w:rPr>
+            <w:tab/>
+            <w:t xml:space="preserve">M. Fowler, “Microservices: a definition of this new architectural term.” </w:t>
+          </w:r>
+          <w:proofErr w:type="spellStart"/>
+          <w:r>
+            <w:rPr>
+              <w:rFonts w:eastAsia="Times New Roman"/>
+            </w:rPr>
+            <w:t>Accessed</w:t>
+          </w:r>
+          <w:proofErr w:type="spellEnd"/>
+          <w:r>
+            <w:rPr>
+              <w:rFonts w:eastAsia="Times New Roman"/>
+            </w:rPr>
+            <w:t>: Jul. 15, 2026. [Online]. Available: https://martinfowler.com/articles/microservices.html</w:t>
+          </w:r>
+        </w:p>
+        <w:p>
+          <w:pPr>
+            <w:ind w:left="0" w:firstLine="0"/>
+          </w:pPr>
+          <w:r>
+            <w:rPr>
+              <w:rFonts w:eastAsia="Times New Roman"/>
             </w:rPr>
             <w:t> </w:t>
           </w:r>
@@ -3793,9 +4200,9 @@
   </w:compat>
   <w:rsids>
     <w:rsidRoot w:val="00E074D3"/>
+    <w:rsid w:val="004D2E64"/>
     <w:rsid w:val="00912EEB"/>
     <w:rsid w:val="00E074D3"/>
-    <w:rsid w:val="00EB06C4"/>
   </w:rsids>
   <m:mathPr>
     <m:mathFont m:val="Cambria Math"/>
@@ -4597,8 +5004,8 @@
   </we:alternateReferences>
   <we:properties>
     <we:property name="MENDELEY_BIBLIOGRAPHY_IS_DIRTY" value="false"/>
-    <we:property name="MENDELEY_BIBLIOGRAPHY_LAST_MODIFIED" value="1784241716767"/>
-    <we:property name="MENDELEY_CITATIONS" value="[{&quot;citationID&quot;:&quot;MENDELEY_CITATION_cbaa5770-f04b-43bc-88b3-1745ece311b1&quot;,&quot;properties&quot;:{&quot;noteIndex&quot;:0},&quot;isEdited&quot;:false,&quot;manualOverride&quot;:{&quot;isManuallyOverridden&quot;:false,&quot;citeprocText&quot;:&quot;[1]&quot;,&quot;manualOverrideText&quot;:&quot;&quot;},&quot;citationTag&quot;:&quot;MENDELEY_CITATION_v3_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&quot;,&quot;citationItems&quot;:[{&quot;id&quot;:&quot;5246948d-a9a1-3347-bd4f-626648939cac&quot;,&quot;itemData&quot;:{&quot;type&quot;:&quot;webpage&quot;,&quot;id&quot;:&quot;5246948d-a9a1-3347-bd4f-626648939cac&quot;,&quot;title&quot;:&quot;Jakarta Servlet&quot;,&quot;author&quot;:[{&quot;family&quot;:&quot;Eclipse Foundation&quot;,&quot;given&quot;:&quot;&quot;,&quot;parse-names&quot;:false,&quot;dropping-particle&quot;:&quot;&quot;,&quot;non-dropping-particle&quot;:&quot;&quot;}],&quot;accessed&quot;:{&quot;date-parts&quot;:[[2026,7,15]]},&quot;URL&quot;:&quot;https://jakarta.ee/learn/docs/jakartaee-tutorial/current/web/servlets/servlets.html&quot;,&quot;container-title-short&quot;:&quot;&quot;},&quot;isTemporary&quot;:false,&quot;suppress-author&quot;:false,&quot;composite&quot;:false,&quot;author-only&quot;:false}]},{&quot;citationID&quot;:&quot;MENDELEY_CITATION_8adb0b72-409f-461e-8b00-d24574021135&quot;,&quot;properties&quot;:{&quot;noteIndex&quot;:0},&quot;isEdited&quot;:false,&quot;manualOverride&quot;:{&quot;isManuallyOverridden&quot;:false,&quot;citeprocText&quot;:&quot;[2]&quot;,&quot;manualOverrideText&quot;:&quot;&quot;},&quot;citationTag&quot;:&quot;MENDELEY_CITATION_v3_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&quot;,&quot;citationItems&quot;:[{&quot;id&quot;:&quot;a61821f4-1e99-38a1-86f5-3afdba1da3a6&quot;,&quot;itemData&quot;:{&quot;type&quot;:&quot;webpage&quot;,&quot;id&quot;:&quot;a61821f4-1e99-38a1-86f5-3afdba1da3a6&quot;,&quot;title&quot;:&quot;Superglobals&quot;,&quot;author&quot;:[{&quot;family&quot;:&quot;The PHP Group&quot;,&quot;given&quot;:&quot;&quot;,&quot;parse-names&quot;:false,&quot;dropping-particle&quot;:&quot;&quot;,&quot;non-dropping-particle&quot;:&quot;&quot;}],&quot;accessed&quot;:{&quot;date-parts&quot;:[[2026,7,15]]},&quot;URL&quot;:&quot;https://www.php.net/manual/en/language.variables.superglobals.php&quot;,&quot;container-title-short&quot;:&quot;&quot;},&quot;isTemporary&quot;:false,&quot;suppress-author&quot;:false,&quot;composite&quot;:false,&quot;author-only&quot;:false}]},{&quot;citationID&quot;:&quot;MENDELEY_CITATION_1e4da306-d171-44f0-8ccf-97b236f521d6&quot;,&quot;properties&quot;:{&quot;noteIndex&quot;:0},&quot;isEdited&quot;:false,&quot;manualOverride&quot;:{&quot;isManuallyOverridden&quot;:false,&quot;citeprocText&quot;:&quot;[1]&quot;,&quot;manualOverrideText&quot;:&quot;&quot;},&quot;citationTag&quot;:&quot;MENDELEY_CITATION_v3_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&quot;,&quot;citationItems&quot;:[{&quot;id&quot;:&quot;5246948d-a9a1-3347-bd4f-626648939cac&quot;,&quot;itemData&quot;:{&quot;type&quot;:&quot;webpage&quot;,&quot;id&quot;:&quot;5246948d-a9a1-3347-bd4f-626648939cac&quot;,&quot;title&quot;:&quot;Jakarta Servlet&quot;,&quot;author&quot;:[{&quot;family&quot;:&quot;Eclipse Foundation&quot;,&quot;given&quot;:&quot;&quot;,&quot;parse-names&quot;:false,&quot;dropping-particle&quot;:&quot;&quot;,&quot;non-dropping-particle&quot;:&quot;&quot;}],&quot;accessed&quot;:{&quot;date-parts&quot;:[[2026,7,15]]},&quot;URL&quot;:&quot;https://jakarta.ee/learn/docs/jakartaee-tutorial/current/web/servlets/servlets.html&quot;,&quot;container-title-short&quot;:&quot;&quot;},&quot;isTemporary&quot;:false,&quot;suppress-author&quot;:false,&quot;composite&quot;:false,&quot;author-only&quot;:false}]},{&quot;citationID&quot;:&quot;MENDELEY_CITATION_84be9df0-ec47-42fa-8e5e-a3ee77241e57&quot;,&quot;properties&quot;:{&quot;noteIndex&quot;:0},&quot;isEdited&quot;:false,&quot;manualOverride&quot;:{&quot;isManuallyOverridden&quot;:false,&quot;citeprocText&quot;:&quot;[3]&quot;,&quot;manualOverrideText&quot;:&quot;&quot;},&quot;citationTag&quot;:&quot;MENDELEY_CITATION_v3_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&quot;,&quot;citationItems&quot;:[{&quot;id&quot;:&quot;c8fe192c-4200-321d-8565-c1bfad8d7212&quot;,&quot;itemData&quot;:{&quot;type&quot;:&quot;webpage&quot;,&quot;id&quot;:&quot;c8fe192c-4200-321d-8565-c1bfad8d7212&quot;,&quot;title&quot;:&quot;Session and app state in ASP.NET Core&quot;,&quot;author&quot;:[{&quot;family&quot;:&quot;Microsoft&quot;,&quot;given&quot;:&quot;&quot;,&quot;parse-names&quot;:false,&quot;dropping-particle&quot;:&quot;&quot;,&quot;non-dropping-particle&quot;:&quot;&quot;}],&quot;accessed&quot;:{&quot;date-parts&quot;:[[2026,7,15]]},&quot;URL&quot;:&quot;https://learn.microsoft.com/en-us/aspnet/core/fundamentals/app-state?view=aspnetcore-10.0&quot;,&quot;container-title-short&quot;:&quot;&quot;},&quot;isTemporary&quot;:false,&quot;suppress-author&quot;:false,&quot;composite&quot;:false,&quot;author-only&quot;:false}]},{&quot;citationID&quot;:&quot;MENDELEY_CITATION_bb0cb89d-82c6-4e01-bce6-f8adc5fed633&quot;,&quot;properties&quot;:{&quot;noteIndex&quot;:0},&quot;isEdited&quot;:false,&quot;manualOverride&quot;:{&quot;isManuallyOverridden&quot;:false,&quot;citeprocText&quot;:&quot;[3]&quot;,&quot;manualOverrideText&quot;:&quot;&quot;},&quot;citationTag&quot;:&quot;MENDELEY_CITATION_v3_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&quot;,&quot;citationItems&quot;:[{&quot;id&quot;:&quot;c8fe192c-4200-321d-8565-c1bfad8d7212&quot;,&quot;itemData&quot;:{&quot;type&quot;:&quot;webpage&quot;,&quot;id&quot;:&quot;c8fe192c-4200-321d-8565-c1bfad8d7212&quot;,&quot;title&quot;:&quot;Session and app state in ASP.NET Core&quot;,&quot;author&quot;:[{&quot;family&quot;:&quot;Microsoft&quot;,&quot;given&quot;:&quot;&quot;,&quot;parse-names&quot;:false,&quot;dropping-particle&quot;:&quot;&quot;,&quot;non-dropping-particle&quot;:&quot;&quot;}],&quot;accessed&quot;:{&quot;date-parts&quot;:[[2026,7,15]]},&quot;URL&quot;:&quot;https://learn.microsoft.com/en-us/aspnet/core/fundamentals/app-state?view=aspnetcore-10.0&quot;,&quot;container-title-short&quot;:&quot;&quot;},&quot;isTemporary&quot;:false,&quot;suppress-author&quot;:false,&quot;composite&quot;:false,&quot;author-only&quot;:false}]},{&quot;citationID&quot;:&quot;MENDELEY_CITATION_72ff4076-a3b9-4da3-ba08-6bb61c005f1f&quot;,&quot;properties&quot;:{&quot;noteIndex&quot;:0},&quot;isEdited&quot;:false,&quot;manualOverride&quot;:{&quot;isManuallyOverridden&quot;:false,&quot;citeprocText&quot;:&quot;[1]&quot;,&quot;manualOverrideText&quot;:&quot;&quot;},&quot;citationTag&quot;:&quot;MENDELEY_CITATION_v3_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&quot;,&quot;citationItems&quot;:[{&quot;id&quot;:&quot;5246948d-a9a1-3347-bd4f-626648939cac&quot;,&quot;itemData&quot;:{&quot;type&quot;:&quot;webpage&quot;,&quot;id&quot;:&quot;5246948d-a9a1-3347-bd4f-626648939cac&quot;,&quot;title&quot;:&quot;Jakarta Servlet&quot;,&quot;author&quot;:[{&quot;family&quot;:&quot;Eclipse Foundation&quot;,&quot;given&quot;:&quot;&quot;,&quot;parse-names&quot;:false,&quot;dropping-particle&quot;:&quot;&quot;,&quot;non-dropping-particle&quot;:&quot;&quot;}],&quot;accessed&quot;:{&quot;date-parts&quot;:[[2026,7,15]]},&quot;URL&quot;:&quot;https://jakarta.ee/learn/docs/jakartaee-tutorial/current/web/servlets/servlets.html&quot;,&quot;container-title-short&quot;:&quot;&quot;},&quot;isTemporary&quot;:false,&quot;suppress-author&quot;:false,&quot;composite&quot;:false,&quot;author-only&quot;:false}]},{&quot;citationID&quot;:&quot;MENDELEY_CITATION_f0836816-6ef3-4924-8f4f-094d8fb8c244&quot;,&quot;properties&quot;:{&quot;noteIndex&quot;:0},&quot;isEdited&quot;:false,&quot;manualOverride&quot;:{&quot;isManuallyOverridden&quot;:false,&quot;citeprocText&quot;:&quot;[2]&quot;,&quot;manualOverrideText&quot;:&quot;&quot;},&quot;citationTag&quot;:&quot;MENDELEY_CITATION_v3_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&quot;,&quot;citationItems&quot;:[{&quot;id&quot;:&quot;a61821f4-1e99-38a1-86f5-3afdba1da3a6&quot;,&quot;itemData&quot;:{&quot;type&quot;:&quot;webpage&quot;,&quot;id&quot;:&quot;a61821f4-1e99-38a1-86f5-3afdba1da3a6&quot;,&quot;title&quot;:&quot;Superglobals&quot;,&quot;author&quot;:[{&quot;family&quot;:&quot;The PHP Group&quot;,&quot;given&quot;:&quot;&quot;,&quot;parse-names&quot;:false,&quot;dropping-particle&quot;:&quot;&quot;,&quot;non-dropping-particle&quot;:&quot;&quot;}],&quot;accessed&quot;:{&quot;date-parts&quot;:[[2026,7,15]]},&quot;URL&quot;:&quot;https://www.php.net/manual/en/language.variables.superglobals.php&quot;,&quot;container-title-short&quot;:&quot;&quot;},&quot;isTemporary&quot;:false,&quot;suppress-author&quot;:false,&quot;composite&quot;:false,&quot;author-only&quot;:false}]},{&quot;citationID&quot;:&quot;MENDELEY_CITATION_8f8ae8bc-86d0-4c81-bb20-a7faf28f0183&quot;,&quot;properties&quot;:{&quot;noteIndex&quot;:0},&quot;isEdited&quot;:false,&quot;manualOverride&quot;:{&quot;isManuallyOverridden&quot;:false,&quot;citeprocText&quot;:&quot;[3]&quot;,&quot;manualOverrideText&quot;:&quot;&quot;},&quot;citationTag&quot;:&quot;MENDELEY_CITATION_v3_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&quot;,&quot;citationItems&quot;:[{&quot;id&quot;:&quot;c8fe192c-4200-321d-8565-c1bfad8d7212&quot;,&quot;itemData&quot;:{&quot;type&quot;:&quot;webpage&quot;,&quot;id&quot;:&quot;c8fe192c-4200-321d-8565-c1bfad8d7212&quot;,&quot;title&quot;:&quot;Session and app state in ASP.NET Core&quot;,&quot;author&quot;:[{&quot;family&quot;:&quot;Microsoft&quot;,&quot;given&quot;:&quot;&quot;,&quot;parse-names&quot;:false,&quot;dropping-particle&quot;:&quot;&quot;,&quot;non-dropping-particle&quot;:&quot;&quot;}],&quot;accessed&quot;:{&quot;date-parts&quot;:[[2026,7,15]]},&quot;URL&quot;:&quot;https://learn.microsoft.com/en-us/aspnet/core/fundamentals/app-state?view=aspnetcore-10.0&quot;,&quot;container-title-short&quot;:&quot;&quot;},&quot;isTemporary&quot;:false,&quot;suppress-author&quot;:false,&quot;composite&quot;:false,&quot;author-only&quot;:false}]},{&quot;citationID&quot;:&quot;MENDELEY_CITATION_4685483d-742a-45c0-ad4e-6b636e487447&quot;,&quot;properties&quot;:{&quot;noteIndex&quot;:0},&quot;isEdited&quot;:false,&quot;manualOverride&quot;:{&quot;isManuallyOverridden&quot;:false,&quot;citeprocText&quot;:&quot;[3]&quot;,&quot;manualOverrideText&quot;:&quot;&quot;},&quot;citationTag&quot;:&quot;MENDELEY_CITATION_v3_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&quot;,&quot;citationItems&quot;:[{&quot;id&quot;:&quot;c8fe192c-4200-321d-8565-c1bfad8d7212&quot;,&quot;itemData&quot;:{&quot;type&quot;:&quot;webpage&quot;,&quot;id&quot;:&quot;c8fe192c-4200-321d-8565-c1bfad8d7212&quot;,&quot;title&quot;:&quot;Session and app state in ASP.NET Core&quot;,&quot;author&quot;:[{&quot;family&quot;:&quot;Microsoft&quot;,&quot;given&quot;:&quot;&quot;,&quot;parse-names&quot;:false,&quot;dropping-particle&quot;:&quot;&quot;,&quot;non-dropping-particle&quot;:&quot;&quot;}],&quot;accessed&quot;:{&quot;date-parts&quot;:[[2026,7,15]]},&quot;URL&quot;:&quot;https://learn.microsoft.com/en-us/aspnet/core/fundamentals/app-state?view=aspnetcore-10.0&quot;,&quot;container-title-short&quot;:&quot;&quot;},&quot;isTemporary&quot;:false,&quot;suppress-author&quot;:false,&quot;composite&quot;:false,&quot;author-only&quot;:false}]},{&quot;citationID&quot;:&quot;MENDELEY_CITATION_2b1ded95-e485-4651-a2c3-d797da679752&quot;,&quot;properties&quot;:{&quot;noteIndex&quot;:0},&quot;isEdited&quot;:false,&quot;manualOverride&quot;:{&quot;isManuallyOverridden&quot;:false,&quot;citeprocText&quot;:&quot;[3]&quot;,&quot;manualOverrideText&quot;:&quot;&quot;},&quot;citationTag&quot;:&quot;MENDELEY_CITATION_v3_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&quot;,&quot;citationItems&quot;:[{&quot;id&quot;:&quot;c8fe192c-4200-321d-8565-c1bfad8d7212&quot;,&quot;itemData&quot;:{&quot;type&quot;:&quot;webpage&quot;,&quot;id&quot;:&quot;c8fe192c-4200-321d-8565-c1bfad8d7212&quot;,&quot;title&quot;:&quot;Session and app state in ASP.NET Core&quot;,&quot;author&quot;:[{&quot;family&quot;:&quot;Microsoft&quot;,&quot;given&quot;:&quot;&quot;,&quot;parse-names&quot;:false,&quot;dropping-particle&quot;:&quot;&quot;,&quot;non-dropping-particle&quot;:&quot;&quot;}],&quot;accessed&quot;:{&quot;date-parts&quot;:[[2026,7,15]]},&quot;URL&quot;:&quot;https://learn.microsoft.com/en-us/aspnet/core/fundamentals/app-state?view=aspnetcore-10.0&quot;,&quot;container-title-short&quot;:&quot;&quot;},&quot;isTemporary&quot;:false,&quot;suppress-author&quot;:false,&quot;composite&quot;:false,&quot;author-only&quot;:false}]},{&quot;citationID&quot;:&quot;MENDELEY_CITATION_6086a87d-27f2-4867-8024-31e37d2f36a1&quot;,&quot;properties&quot;:{&quot;noteIndex&quot;:0},&quot;isEdited&quot;:false,&quot;manualOverride&quot;:{&quot;isManuallyOverridden&quot;:false,&quot;citeprocText&quot;:&quot;[1]&quot;,&quot;manualOverrideText&quot;:&quot;&quot;},&quot;citationTag&quot;:&quot;MENDELEY_CITATION_v3_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&quot;,&quot;citationItems&quot;:[{&quot;id&quot;:&quot;5246948d-a9a1-3347-bd4f-626648939cac&quot;,&quot;itemData&quot;:{&quot;type&quot;:&quot;webpage&quot;,&quot;id&quot;:&quot;5246948d-a9a1-3347-bd4f-626648939cac&quot;,&quot;title&quot;:&quot;Jakarta Servlet&quot;,&quot;author&quot;:[{&quot;family&quot;:&quot;Eclipse Foundation&quot;,&quot;given&quot;:&quot;&quot;,&quot;parse-names&quot;:false,&quot;dropping-particle&quot;:&quot;&quot;,&quot;non-dropping-particle&quot;:&quot;&quot;}],&quot;accessed&quot;:{&quot;date-parts&quot;:[[2026,7,15]]},&quot;URL&quot;:&quot;https://jakarta.ee/learn/docs/jakartaee-tutorial/current/web/servlets/servlets.html&quot;,&quot;container-title-short&quot;:&quot;&quot;},&quot;isTemporary&quot;:false,&quot;suppress-author&quot;:false,&quot;composite&quot;:false,&quot;author-only&quot;:false}]},{&quot;citationID&quot;:&quot;MENDELEY_CITATION_feef250f-b3a6-4c1f-b1a8-953ba99155d0&quot;,&quot;properties&quot;:{&quot;noteIndex&quot;:0},&quot;isEdited&quot;:false,&quot;manualOverride&quot;:{&quot;isManuallyOverridden&quot;:false,&quot;citeprocText&quot;:&quot;[4]&quot;,&quot;manualOverrideText&quot;:&quot;&quot;},&quot;citationTag&quot;:&quot;MENDELEY_CITATION_v3_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&quot;,&quot;citationItems&quot;:[{&quot;id&quot;:&quot;2341f895-6a0f-36fb-91bf-1dae3f2d0cc3&quot;,&quot;itemData&quot;:{&quot;type&quot;:&quot;webpage&quot;,&quot;id&quot;:&quot;2341f895-6a0f-36fb-91bf-1dae3f2d0cc3&quot;,&quot;title&quot;:&quot;Lesson: JDBC Basics&quot;,&quot;author&quot;:[{&quot;family&quot;:&quot;Oracle&quot;,&quot;given&quot;:&quot;&quot;,&quot;parse-names&quot;:false,&quot;dropping-particle&quot;:&quot;&quot;,&quot;non-dropping-particle&quot;:&quot;&quot;}],&quot;accessed&quot;:{&quot;date-parts&quot;:[[2026,7,15]]},&quot;URL&quot;:&quot;https://docs.oracle.com/javase/tutorial/jdbc/basics/index.html&quot;,&quot;container-title-short&quot;:&quot;&quot;},&quot;isTemporary&quot;:false,&quot;suppress-author&quot;:false,&quot;composite&quot;:false,&quot;author-only&quot;:false}]},{&quot;citationID&quot;:&quot;MENDELEY_CITATION_0f0059fd-8685-4145-b6b9-d5c29cf15c58&quot;,&quot;properties&quot;:{&quot;noteIndex&quot;:0},&quot;isEdited&quot;:false,&quot;manualOverride&quot;:{&quot;isManuallyOverridden&quot;:false,&quot;citeprocText&quot;:&quot;[5]&quot;,&quot;manualOverrideText&quot;:&quot;&quot;},&quot;citationTag&quot;:&quot;MENDELEY_CITATION_v3_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&quot;,&quot;citationItems&quot;:[{&quot;id&quot;:&quot;0f8126e1-8960-3687-8d78-ff0c3ec6c458&quot;,&quot;itemData&quot;:{&quot;type&quot;:&quot;webpage&quot;,&quot;id&quot;:&quot;0f8126e1-8960-3687-8d78-ff0c3ec6c458&quot;,&quot;title&quot;:&quot;PDO&quot;,&quot;author&quot;:[{&quot;family&quot;:&quot;The PHP Group&quot;,&quot;given&quot;:&quot;&quot;,&quot;parse-names&quot;:false,&quot;dropping-particle&quot;:&quot;&quot;,&quot;non-dropping-particle&quot;:&quot;&quot;}],&quot;accessed&quot;:{&quot;date-parts&quot;:[[2026,7,15]]},&quot;URL&quot;:&quot;https://www.php.net/manual/en/book.pdo.php&quot;,&quot;container-title-short&quot;:&quot;&quot;},&quot;isTemporary&quot;:false,&quot;suppress-author&quot;:false,&quot;composite&quot;:false,&quot;author-only&quot;:false}]},{&quot;citationID&quot;:&quot;MENDELEY_CITATION_9a109af2-7bf3-4044-98b4-f5125a1ce03f&quot;,&quot;properties&quot;:{&quot;noteIndex&quot;:0},&quot;isEdited&quot;:false,&quot;manualOverride&quot;:{&quot;isManuallyOverridden&quot;:false,&quot;citeprocText&quot;:&quot;[4]&quot;,&quot;manualOverrideText&quot;:&quot;&quot;},&quot;citationTag&quot;:&quot;MENDELEY_CITATION_v3_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&quot;,&quot;citationItems&quot;:[{&quot;id&quot;:&quot;2341f895-6a0f-36fb-91bf-1dae3f2d0cc3&quot;,&quot;itemData&quot;:{&quot;type&quot;:&quot;webpage&quot;,&quot;id&quot;:&quot;2341f895-6a0f-36fb-91bf-1dae3f2d0cc3&quot;,&quot;title&quot;:&quot;Lesson: JDBC Basics&quot;,&quot;author&quot;:[{&quot;family&quot;:&quot;Oracle&quot;,&quot;given&quot;:&quot;&quot;,&quot;parse-names&quot;:false,&quot;dropping-particle&quot;:&quot;&quot;,&quot;non-dropping-particle&quot;:&quot;&quot;}],&quot;accessed&quot;:{&quot;date-parts&quot;:[[2026,7,15]]},&quot;URL&quot;:&quot;https://docs.oracle.com/javase/tutorial/jdbc/basics/index.html&quot;,&quot;container-title-short&quot;:&quot;&quot;},&quot;isTemporary&quot;:false,&quot;suppress-author&quot;:false,&quot;composite&quot;:false,&quot;author-only&quot;:false}]},{&quot;citationID&quot;:&quot;MENDELEY_CITATION_6078f0b4-a7f1-4be5-82eb-a86385206db0&quot;,&quot;properties&quot;:{&quot;noteIndex&quot;:0},&quot;isEdited&quot;:false,&quot;manualOverride&quot;:{&quot;isManuallyOverridden&quot;:false,&quot;citeprocText&quot;:&quot;[5]&quot;,&quot;manualOverrideText&quot;:&quot;&quot;},&quot;citationTag&quot;:&quot;MENDELEY_CITATION_v3_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&quot;,&quot;citationItems&quot;:[{&quot;id&quot;:&quot;0f8126e1-8960-3687-8d78-ff0c3ec6c458&quot;,&quot;itemData&quot;:{&quot;type&quot;:&quot;webpage&quot;,&quot;id&quot;:&quot;0f8126e1-8960-3687-8d78-ff0c3ec6c458&quot;,&quot;title&quot;:&quot;PDO&quot;,&quot;author&quot;:[{&quot;family&quot;:&quot;The PHP Group&quot;,&quot;given&quot;:&quot;&quot;,&quot;parse-names&quot;:false,&quot;dropping-particle&quot;:&quot;&quot;,&quot;non-dropping-particle&quot;:&quot;&quot;}],&quot;accessed&quot;:{&quot;date-parts&quot;:[[2026,7,15]]},&quot;URL&quot;:&quot;https://www.php.net/manual/en/book.pdo.php&quot;,&quot;container-title-short&quot;:&quot;&quot;},&quot;isTemporary&quot;:false,&quot;suppress-author&quot;:false,&quot;composite&quot;:false,&quot;author-only&quot;:false}]},{&quot;citationID&quot;:&quot;MENDELEY_CITATION_2e03e530-e8fd-4d20-a43e-f7a2cf563431&quot;,&quot;properties&quot;:{&quot;noteIndex&quot;:0},&quot;isEdited&quot;:false,&quot;manualOverride&quot;:{&quot;isManuallyOverridden&quot;:false,&quot;citeprocText&quot;:&quot;[6]&quot;,&quot;manualOverrideText&quot;:&quot;&quot;},&quot;citationTag&quot;:&quot;MENDELEY_CITATION_v3_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&quot;,&quot;citationItems&quot;:[{&quot;id&quot;:&quot;423bf9f3-29fb-399a-ac24-688086f07946&quot;,&quot;itemData&quot;:{&quot;type&quot;:&quot;webpage&quot;,&quot;id&quot;:&quot;423bf9f3-29fb-399a-ac24-688086f07946&quot;,&quot;title&quot;:&quot;CREATE PROCEDURE&quot;,&quot;author&quot;:[{&quot;family&quot;:&quot;PostgreSQL Global Development Group&quot;,&quot;given&quot;:&quot;&quot;,&quot;parse-names&quot;:false,&quot;dropping-particle&quot;:&quot;&quot;,&quot;non-dropping-particle&quot;:&quot;&quot;}],&quot;accessed&quot;:{&quot;date-parts&quot;:[[2026,7,15]]},&quot;URL&quot;:&quot;https://www.postgresql.org/docs/current/sql-createprocedure.html&quot;,&quot;container-title-short&quot;:&quot;&quot;},&quot;isTemporary&quot;:false,&quot;suppress-author&quot;:false,&quot;composite&quot;:false,&quot;author-only&quot;:false}]},{&quot;citationID&quot;:&quot;MENDELEY_CITATION_f9beb473-ffb6-42e4-9f68-b3721c1241b8&quot;,&quot;properties&quot;:{&quot;noteIndex&quot;:0},&quot;isEdited&quot;:false,&quot;manualOverride&quot;:{&quot;isManuallyOverridden&quot;:false,&quot;citeprocText&quot;:&quot;[7]&quot;,&quot;manualOverrideText&quot;:&quot;&quot;},&quot;citationTag&quot;:&quot;MENDELEY_CITATION_v3_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&quot;,&quot;citationItems&quot;:[{&quot;id&quot;:&quot;3bdb57c6-313e-3e0d-a285-86251bb00338&quot;,&quot;itemData&quot;:{&quot;type&quot;:&quot;webpage&quot;,&quot;id&quot;:&quot;3bdb57c6-313e-3e0d-a285-86251bb00338&quot;,&quot;title&quot;:&quot;Jakarta Persistence 3.0 Specification&quot;,&quot;author&quot;:[{&quot;family&quot;:&quot;Eclipse Foundation&quot;,&quot;given&quot;:&quot;&quot;,&quot;parse-names&quot;:false,&quot;dropping-particle&quot;:&quot;&quot;,&quot;non-dropping-particle&quot;:&quot;&quot;}],&quot;accessed&quot;:{&quot;date-parts&quot;:[[2026,7,15]]},&quot;URL&quot;:&quot;https://jakarta.ee/specifications/persistence/3.0/jakarta-persistence-spec-3.0.html&quot;,&quot;issued&quot;:{&quot;date-parts&quot;:[[2020]]},&quot;container-title-short&quot;:&quot;&quot;},&quot;isTemporary&quot;:false,&quot;suppress-author&quot;:false,&quot;composite&quot;:false,&quot;author-only&quot;:false}]}]"/>
+    <we:property name="MENDELEY_BIBLIOGRAPHY_LAST_MODIFIED" value="1784244541126"/>
+    <we:property name="MENDELEY_CITATIONS" value="[{&quot;citationID&quot;:&quot;MENDELEY_CITATION_cbaa5770-f04b-43bc-88b3-1745ece311b1&quot;,&quot;properties&quot;:{&quot;noteIndex&quot;:0},&quot;isEdited&quot;:false,&quot;manualOverride&quot;:{&quot;isManuallyOverridden&quot;:false,&quot;citeprocText&quot;:&quot;[1]&quot;,&quot;manualOverrideText&quot;:&quot;&quot;},&quot;citationTag&quot;:&quot;MENDELEY_CITATION_v3_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&quot;,&quot;citationItems&quot;:[{&quot;id&quot;:&quot;5246948d-a9a1-3347-bd4f-626648939cac&quot;,&quot;itemData&quot;:{&quot;type&quot;:&quot;webpage&quot;,&quot;id&quot;:&quot;5246948d-a9a1-3347-bd4f-626648939cac&quot;,&quot;title&quot;:&quot;Jakarta Servlet&quot;,&quot;author&quot;:[{&quot;family&quot;:&quot;Eclipse Foundation&quot;,&quot;given&quot;:&quot;&quot;,&quot;parse-names&quot;:false,&quot;dropping-particle&quot;:&quot;&quot;,&quot;non-dropping-particle&quot;:&quot;&quot;}],&quot;accessed&quot;:{&quot;date-parts&quot;:[[2026,7,15]]},&quot;URL&quot;:&quot;https://jakarta.ee/learn/docs/jakartaee-tutorial/current/web/servlets/servlets.html&quot;,&quot;container-title-short&quot;:&quot;&quot;},&quot;isTemporary&quot;:false,&quot;suppress-author&quot;:false,&quot;composite&quot;:false,&quot;author-only&quot;:false}]},{&quot;citationID&quot;:&quot;MENDELEY_CITATION_8adb0b72-409f-461e-8b00-d24574021135&quot;,&quot;properties&quot;:{&quot;noteIndex&quot;:0},&quot;isEdited&quot;:false,&quot;manualOverride&quot;:{&quot;isManuallyOverridden&quot;:false,&quot;citeprocText&quot;:&quot;[2]&quot;,&quot;manualOverrideText&quot;:&quot;&quot;},&quot;citationTag&quot;:&quot;MENDELEY_CITATION_v3_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&quot;,&quot;citationItems&quot;:[{&quot;id&quot;:&quot;a61821f4-1e99-38a1-86f5-3afdba1da3a6&quot;,&quot;itemData&quot;:{&quot;type&quot;:&quot;webpage&quot;,&quot;id&quot;:&quot;a61821f4-1e99-38a1-86f5-3afdba1da3a6&quot;,&quot;title&quot;:&quot;Superglobals&quot;,&quot;author&quot;:[{&quot;family&quot;:&quot;The PHP Group&quot;,&quot;given&quot;:&quot;&quot;,&quot;parse-names&quot;:false,&quot;dropping-particle&quot;:&quot;&quot;,&quot;non-dropping-particle&quot;:&quot;&quot;}],&quot;accessed&quot;:{&quot;date-parts&quot;:[[2026,7,15]]},&quot;URL&quot;:&quot;https://www.php.net/manual/en/language.variables.superglobals.php&quot;,&quot;container-title-short&quot;:&quot;&quot;},&quot;isTemporary&quot;:false,&quot;suppress-author&quot;:false,&quot;composite&quot;:false,&quot;author-only&quot;:false}]},{&quot;citationID&quot;:&quot;MENDELEY_CITATION_1e4da306-d171-44f0-8ccf-97b236f521d6&quot;,&quot;properties&quot;:{&quot;noteIndex&quot;:0},&quot;isEdited&quot;:false,&quot;manualOverride&quot;:{&quot;isManuallyOverridden&quot;:false,&quot;citeprocText&quot;:&quot;[1]&quot;,&quot;manualOverrideText&quot;:&quot;&quot;},&quot;citationTag&quot;:&quot;MENDELEY_CITATION_v3_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&quot;,&quot;citationItems&quot;:[{&quot;id&quot;:&quot;5246948d-a9a1-3347-bd4f-626648939cac&quot;,&quot;itemData&quot;:{&quot;type&quot;:&quot;webpage&quot;,&quot;id&quot;:&quot;5246948d-a9a1-3347-bd4f-626648939cac&quot;,&quot;title&quot;:&quot;Jakarta Servlet&quot;,&quot;author&quot;:[{&quot;family&quot;:&quot;Eclipse Foundation&quot;,&quot;given&quot;:&quot;&quot;,&quot;parse-names&quot;:false,&quot;dropping-particle&quot;:&quot;&quot;,&quot;non-dropping-particle&quot;:&quot;&quot;}],&quot;accessed&quot;:{&quot;date-parts&quot;:[[2026,7,15]]},&quot;URL&quot;:&quot;https://jakarta.ee/learn/docs/jakartaee-tutorial/current/web/servlets/servlets.html&quot;,&quot;container-title-short&quot;:&quot;&quot;},&quot;isTemporary&quot;:false,&quot;suppress-author&quot;:false,&quot;composite&quot;:false,&quot;author-only&quot;:false}]},{&quot;citationID&quot;:&quot;MENDELEY_CITATION_84be9df0-ec47-42fa-8e5e-a3ee77241e57&quot;,&quot;properties&quot;:{&quot;noteIndex&quot;:0},&quot;isEdited&quot;:false,&quot;manualOverride&quot;:{&quot;isManuallyOverridden&quot;:false,&quot;citeprocText&quot;:&quot;[3]&quot;,&quot;manualOverrideText&quot;:&quot;&quot;},&quot;citationTag&quot;:&quot;MENDELEY_CITATION_v3_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&quot;,&quot;citationItems&quot;:[{&quot;id&quot;:&quot;c8fe192c-4200-321d-8565-c1bfad8d7212&quot;,&quot;itemData&quot;:{&quot;type&quot;:&quot;webpage&quot;,&quot;id&quot;:&quot;c8fe192c-4200-321d-8565-c1bfad8d7212&quot;,&quot;title&quot;:&quot;Session and app state in ASP.NET Core&quot;,&quot;author&quot;:[{&quot;family&quot;:&quot;Microsoft&quot;,&quot;given&quot;:&quot;&quot;,&quot;parse-names&quot;:false,&quot;dropping-particle&quot;:&quot;&quot;,&quot;non-dropping-particle&quot;:&quot;&quot;}],&quot;accessed&quot;:{&quot;date-parts&quot;:[[2026,7,15]]},&quot;URL&quot;:&quot;https://learn.microsoft.com/en-us/aspnet/core/fundamentals/app-state?view=aspnetcore-10.0&quot;,&quot;container-title-short&quot;:&quot;&quot;},&quot;isTemporary&quot;:false,&quot;suppress-author&quot;:false,&quot;composite&quot;:false,&quot;author-only&quot;:false}]},{&quot;citationID&quot;:&quot;MENDELEY_CITATION_bb0cb89d-82c6-4e01-bce6-f8adc5fed633&quot;,&quot;properties&quot;:{&quot;noteIndex&quot;:0},&quot;isEdited&quot;:false,&quot;manualOverride&quot;:{&quot;isManuallyOverridden&quot;:false,&quot;citeprocText&quot;:&quot;[3]&quot;,&quot;manualOverrideText&quot;:&quot;&quot;},&quot;citationTag&quot;:&quot;MENDELEY_CITATION_v3_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&quot;,&quot;citationItems&quot;:[{&quot;id&quot;:&quot;c8fe192c-4200-321d-8565-c1bfad8d7212&quot;,&quot;itemData&quot;:{&quot;type&quot;:&quot;webpage&quot;,&quot;id&quot;:&quot;c8fe192c-4200-321d-8565-c1bfad8d7212&quot;,&quot;title&quot;:&quot;Session and app state in ASP.NET Core&quot;,&quot;author&quot;:[{&quot;family&quot;:&quot;Microsoft&quot;,&quot;given&quot;:&quot;&quot;,&quot;parse-names&quot;:false,&quot;dropping-particle&quot;:&quot;&quot;,&quot;non-dropping-particle&quot;:&quot;&quot;}],&quot;accessed&quot;:{&quot;date-parts&quot;:[[2026,7,15]]},&quot;URL&quot;:&quot;https://learn.microsoft.com/en-us/aspnet/core/fundamentals/app-state?view=aspnetcore-10.0&quot;,&quot;container-title-short&quot;:&quot;&quot;},&quot;isTemporary&quot;:false,&quot;suppress-author&quot;:false,&quot;composite&quot;:false,&quot;author-only&quot;:false}]},{&quot;citationID&quot;:&quot;MENDELEY_CITATION_72ff4076-a3b9-4da3-ba08-6bb61c005f1f&quot;,&quot;properties&quot;:{&quot;noteIndex&quot;:0},&quot;isEdited&quot;:false,&quot;manualOverride&quot;:{&quot;isManuallyOverridden&quot;:false,&quot;citeprocText&quot;:&quot;[1]&quot;,&quot;manualOverrideText&quot;:&quot;&quot;},&quot;citationTag&quot;:&quot;MENDELEY_CITATION_v3_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&quot;,&quot;citationItems&quot;:[{&quot;id&quot;:&quot;5246948d-a9a1-3347-bd4f-626648939cac&quot;,&quot;itemData&quot;:{&quot;type&quot;:&quot;webpage&quot;,&quot;id&quot;:&quot;5246948d-a9a1-3347-bd4f-626648939cac&quot;,&quot;title&quot;:&quot;Jakarta Servlet&quot;,&quot;author&quot;:[{&quot;family&quot;:&quot;Eclipse Foundation&quot;,&quot;given&quot;:&quot;&quot;,&quot;parse-names&quot;:false,&quot;dropping-particle&quot;:&quot;&quot;,&quot;non-dropping-particle&quot;:&quot;&quot;}],&quot;accessed&quot;:{&quot;date-parts&quot;:[[2026,7,15]]},&quot;URL&quot;:&quot;https://jakarta.ee/learn/docs/jakartaee-tutorial/current/web/servlets/servlets.html&quot;,&quot;container-title-short&quot;:&quot;&quot;},&quot;isTemporary&quot;:false,&quot;suppress-author&quot;:false,&quot;composite&quot;:false,&quot;author-only&quot;:false}]},{&quot;citationID&quot;:&quot;MENDELEY_CITATION_f0836816-6ef3-4924-8f4f-094d8fb8c244&quot;,&quot;properties&quot;:{&quot;noteIndex&quot;:0},&quot;isEdited&quot;:false,&quot;manualOverride&quot;:{&quot;isManuallyOverridden&quot;:false,&quot;citeprocText&quot;:&quot;[2]&quot;,&quot;manualOverrideText&quot;:&quot;&quot;},&quot;citationTag&quot;:&quot;MENDELEY_CITATION_v3_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&quot;,&quot;citationItems&quot;:[{&quot;id&quot;:&quot;a61821f4-1e99-38a1-86f5-3afdba1da3a6&quot;,&quot;itemData&quot;:{&quot;type&quot;:&quot;webpage&quot;,&quot;id&quot;:&quot;a61821f4-1e99-38a1-86f5-3afdba1da3a6&quot;,&quot;title&quot;:&quot;Superglobals&quot;,&quot;author&quot;:[{&quot;family&quot;:&quot;The PHP Group&quot;,&quot;given&quot;:&quot;&quot;,&quot;parse-names&quot;:false,&quot;dropping-particle&quot;:&quot;&quot;,&quot;non-dropping-particle&quot;:&quot;&quot;}],&quot;accessed&quot;:{&quot;date-parts&quot;:[[2026,7,15]]},&quot;URL&quot;:&quot;https://www.php.net/manual/en/language.variables.superglobals.php&quot;,&quot;container-title-short&quot;:&quot;&quot;},&quot;isTemporary&quot;:false,&quot;suppress-author&quot;:false,&quot;composite&quot;:false,&quot;author-only&quot;:false}]},{&quot;citationID&quot;:&quot;MENDELEY_CITATION_8f8ae8bc-86d0-4c81-bb20-a7faf28f0183&quot;,&quot;properties&quot;:{&quot;noteIndex&quot;:0},&quot;isEdited&quot;:false,&quot;manualOverride&quot;:{&quot;isManuallyOverridden&quot;:false,&quot;citeprocText&quot;:&quot;[3]&quot;,&quot;manualOverrideText&quot;:&quot;&quot;},&quot;citationTag&quot;:&quot;MENDELEY_CITATION_v3_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&quot;,&quot;citationItems&quot;:[{&quot;id&quot;:&quot;c8fe192c-4200-321d-8565-c1bfad8d7212&quot;,&quot;itemData&quot;:{&quot;type&quot;:&quot;webpage&quot;,&quot;id&quot;:&quot;c8fe192c-4200-321d-8565-c1bfad8d7212&quot;,&quot;title&quot;:&quot;Session and app state in ASP.NET Core&quot;,&quot;author&quot;:[{&quot;family&quot;:&quot;Microsoft&quot;,&quot;given&quot;:&quot;&quot;,&quot;parse-names&quot;:false,&quot;dropping-particle&quot;:&quot;&quot;,&quot;non-dropping-particle&quot;:&quot;&quot;}],&quot;accessed&quot;:{&quot;date-parts&quot;:[[2026,7,15]]},&quot;URL&quot;:&quot;https://learn.microsoft.com/en-us/aspnet/core/fundamentals/app-state?view=aspnetcore-10.0&quot;,&quot;container-title-short&quot;:&quot;&quot;},&quot;isTemporary&quot;:false,&quot;suppress-author&quot;:false,&quot;composite&quot;:false,&quot;author-only&quot;:false}]},{&quot;citationID&quot;:&quot;MENDELEY_CITATION_4685483d-742a-45c0-ad4e-6b636e487447&quot;,&quot;properties&quot;:{&quot;noteIndex&quot;:0},&quot;isEdited&quot;:false,&quot;manualOverride&quot;:{&quot;isManuallyOverridden&quot;:false,&quot;citeprocText&quot;:&quot;[3]&quot;,&quot;manualOverrideText&quot;:&quot;&quot;},&quot;citationTag&quot;:&quot;MENDELEY_CITATION_v3_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&quot;,&quot;citationItems&quot;:[{&quot;id&quot;:&quot;c8fe192c-4200-321d-8565-c1bfad8d7212&quot;,&quot;itemData&quot;:{&quot;type&quot;:&quot;webpage&quot;,&quot;id&quot;:&quot;c8fe192c-4200-321d-8565-c1bfad8d7212&quot;,&quot;title&quot;:&quot;Session and app state in ASP.NET Core&quot;,&quot;author&quot;:[{&quot;family&quot;:&quot;Microsoft&quot;,&quot;given&quot;:&quot;&quot;,&quot;parse-names&quot;:false,&quot;dropping-particle&quot;:&quot;&quot;,&quot;non-dropping-particle&quot;:&quot;&quot;}],&quot;accessed&quot;:{&quot;date-parts&quot;:[[2026,7,15]]},&quot;URL&quot;:&quot;https://learn.microsoft.com/en-us/aspnet/core/fundamentals/app-state?view=aspnetcore-10.0&quot;,&quot;container-title-short&quot;:&quot;&quot;},&quot;isTemporary&quot;:false,&quot;suppress-author&quot;:false,&quot;composite&quot;:false,&quot;author-only&quot;:false}]},{&quot;citationID&quot;:&quot;MENDELEY_CITATION_2b1ded95-e485-4651-a2c3-d797da679752&quot;,&quot;properties&quot;:{&quot;noteIndex&quot;:0},&quot;isEdited&quot;:false,&quot;manualOverride&quot;:{&quot;isManuallyOverridden&quot;:false,&quot;citeprocText&quot;:&quot;[3]&quot;,&quot;manualOverrideText&quot;:&quot;&quot;},&quot;citationTag&quot;:&quot;MENDELEY_CITATION_v3_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&quot;,&quot;citationItems&quot;:[{&quot;id&quot;:&quot;c8fe192c-4200-321d-8565-c1bfad8d7212&quot;,&quot;itemData&quot;:{&quot;type&quot;:&quot;webpage&quot;,&quot;id&quot;:&quot;c8fe192c-4200-321d-8565-c1bfad8d7212&quot;,&quot;title&quot;:&quot;Session and app state in ASP.NET Core&quot;,&quot;author&quot;:[{&quot;family&quot;:&quot;Microsoft&quot;,&quot;given&quot;:&quot;&quot;,&quot;parse-names&quot;:false,&quot;dropping-particle&quot;:&quot;&quot;,&quot;non-dropping-particle&quot;:&quot;&quot;}],&quot;accessed&quot;:{&quot;date-parts&quot;:[[2026,7,15]]},&quot;URL&quot;:&quot;https://learn.microsoft.com/en-us/aspnet/core/fundamentals/app-state?view=aspnetcore-10.0&quot;,&quot;container-title-short&quot;:&quot;&quot;},&quot;isTemporary&quot;:false,&quot;suppress-author&quot;:false,&quot;composite&quot;:false,&quot;author-only&quot;:false}]},{&quot;citationID&quot;:&quot;MENDELEY_CITATION_6086a87d-27f2-4867-8024-31e37d2f36a1&quot;,&quot;properties&quot;:{&quot;noteIndex&quot;:0},&quot;isEdited&quot;:false,&quot;manualOverride&quot;:{&quot;isManuallyOverridden&quot;:false,&quot;citeprocText&quot;:&quot;[1]&quot;,&quot;manualOverrideText&quot;:&quot;&quot;},&quot;citationTag&quot;:&quot;MENDELEY_CITATION_v3_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&quot;,&quot;citationItems&quot;:[{&quot;id&quot;:&quot;5246948d-a9a1-3347-bd4f-626648939cac&quot;,&quot;itemData&quot;:{&quot;type&quot;:&quot;webpage&quot;,&quot;id&quot;:&quot;5246948d-a9a1-3347-bd4f-626648939cac&quot;,&quot;title&quot;:&quot;Jakarta Servlet&quot;,&quot;author&quot;:[{&quot;family&quot;:&quot;Eclipse Foundation&quot;,&quot;given&quot;:&quot;&quot;,&quot;parse-names&quot;:false,&quot;dropping-particle&quot;:&quot;&quot;,&quot;non-dropping-particle&quot;:&quot;&quot;}],&quot;accessed&quot;:{&quot;date-parts&quot;:[[2026,7,15]]},&quot;URL&quot;:&quot;https://jakarta.ee/learn/docs/jakartaee-tutorial/current/web/servlets/servlets.html&quot;,&quot;container-title-short&quot;:&quot;&quot;},&quot;isTemporary&quot;:false,&quot;suppress-author&quot;:false,&quot;composite&quot;:false,&quot;author-only&quot;:false}]},{&quot;citationID&quot;:&quot;MENDELEY_CITATION_feef250f-b3a6-4c1f-b1a8-953ba99155d0&quot;,&quot;properties&quot;:{&quot;noteIndex&quot;:0},&quot;isEdited&quot;:false,&quot;manualOverride&quot;:{&quot;isManuallyOverridden&quot;:false,&quot;citeprocText&quot;:&quot;[4]&quot;,&quot;manualOverrideText&quot;:&quot;&quot;},&quot;citationTag&quot;:&quot;MENDELEY_CITATION_v3_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&quot;,&quot;citationItems&quot;:[{&quot;id&quot;:&quot;2341f895-6a0f-36fb-91bf-1dae3f2d0cc3&quot;,&quot;itemData&quot;:{&quot;type&quot;:&quot;webpage&quot;,&quot;id&quot;:&quot;2341f895-6a0f-36fb-91bf-1dae3f2d0cc3&quot;,&quot;title&quot;:&quot;Lesson: JDBC Basics&quot;,&quot;author&quot;:[{&quot;family&quot;:&quot;Oracle&quot;,&quot;given&quot;:&quot;&quot;,&quot;parse-names&quot;:false,&quot;dropping-particle&quot;:&quot;&quot;,&quot;non-dropping-particle&quot;:&quot;&quot;}],&quot;accessed&quot;:{&quot;date-parts&quot;:[[2026,7,15]]},&quot;URL&quot;:&quot;https://docs.oracle.com/javase/tutorial/jdbc/basics/index.html&quot;,&quot;container-title-short&quot;:&quot;&quot;},&quot;isTemporary&quot;:false,&quot;suppress-author&quot;:false,&quot;composite&quot;:false,&quot;author-only&quot;:false}]},{&quot;citationID&quot;:&quot;MENDELEY_CITATION_0f0059fd-8685-4145-b6b9-d5c29cf15c58&quot;,&quot;properties&quot;:{&quot;noteIndex&quot;:0},&quot;isEdited&quot;:false,&quot;manualOverride&quot;:{&quot;isManuallyOverridden&quot;:false,&quot;citeprocText&quot;:&quot;[5]&quot;,&quot;manualOverrideText&quot;:&quot;&quot;},&quot;citationTag&quot;:&quot;MENDELEY_CITATION_v3_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&quot;,&quot;citationItems&quot;:[{&quot;id&quot;:&quot;0f8126e1-8960-3687-8d78-ff0c3ec6c458&quot;,&quot;itemData&quot;:{&quot;type&quot;:&quot;webpage&quot;,&quot;id&quot;:&quot;0f8126e1-8960-3687-8d78-ff0c3ec6c458&quot;,&quot;title&quot;:&quot;PDO&quot;,&quot;author&quot;:[{&quot;family&quot;:&quot;The PHP Group&quot;,&quot;given&quot;:&quot;&quot;,&quot;parse-names&quot;:false,&quot;dropping-particle&quot;:&quot;&quot;,&quot;non-dropping-particle&quot;:&quot;&quot;}],&quot;accessed&quot;:{&quot;date-parts&quot;:[[2026,7,15]]},&quot;URL&quot;:&quot;https://www.php.net/manual/en/book.pdo.php&quot;,&quot;container-title-short&quot;:&quot;&quot;},&quot;isTemporary&quot;:false,&quot;suppress-author&quot;:false,&quot;composite&quot;:false,&quot;author-only&quot;:false}]},{&quot;citationID&quot;:&quot;MENDELEY_CITATION_9a109af2-7bf3-4044-98b4-f5125a1ce03f&quot;,&quot;properties&quot;:{&quot;noteIndex&quot;:0},&quot;isEdited&quot;:false,&quot;manualOverride&quot;:{&quot;isManuallyOverridden&quot;:false,&quot;citeprocText&quot;:&quot;[4]&quot;,&quot;manualOverrideText&quot;:&quot;&quot;},&quot;citationTag&quot;:&quot;MENDELEY_CITATION_v3_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&quot;,&quot;citationItems&quot;:[{&quot;id&quot;:&quot;2341f895-6a0f-36fb-91bf-1dae3f2d0cc3&quot;,&quot;itemData&quot;:{&quot;type&quot;:&quot;webpage&quot;,&quot;id&quot;:&quot;2341f895-6a0f-36fb-91bf-1dae3f2d0cc3&quot;,&quot;title&quot;:&quot;Lesson: JDBC Basics&quot;,&quot;author&quot;:[{&quot;family&quot;:&quot;Oracle&quot;,&quot;given&quot;:&quot;&quot;,&quot;parse-names&quot;:false,&quot;dropping-particle&quot;:&quot;&quot;,&quot;non-dropping-particle&quot;:&quot;&quot;}],&quot;accessed&quot;:{&quot;date-parts&quot;:[[2026,7,15]]},&quot;URL&quot;:&quot;https://docs.oracle.com/javase/tutorial/jdbc/basics/index.html&quot;,&quot;container-title-short&quot;:&quot;&quot;},&quot;isTemporary&quot;:false,&quot;suppress-author&quot;:false,&quot;composite&quot;:false,&quot;author-only&quot;:false}]},{&quot;citationID&quot;:&quot;MENDELEY_CITATION_6078f0b4-a7f1-4be5-82eb-a86385206db0&quot;,&quot;properties&quot;:{&quot;noteIndex&quot;:0},&quot;isEdited&quot;:false,&quot;manualOverride&quot;:{&quot;isManuallyOverridden&quot;:false,&quot;citeprocText&quot;:&quot;[5]&quot;,&quot;manualOverrideText&quot;:&quot;&quot;},&quot;citationTag&quot;:&quot;MENDELEY_CITATION_v3_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&quot;,&quot;citationItems&quot;:[{&quot;id&quot;:&quot;0f8126e1-8960-3687-8d78-ff0c3ec6c458&quot;,&quot;itemData&quot;:{&quot;type&quot;:&quot;webpage&quot;,&quot;id&quot;:&quot;0f8126e1-8960-3687-8d78-ff0c3ec6c458&quot;,&quot;title&quot;:&quot;PDO&quot;,&quot;author&quot;:[{&quot;family&quot;:&quot;The PHP Group&quot;,&quot;given&quot;:&quot;&quot;,&quot;parse-names&quot;:false,&quot;dropping-particle&quot;:&quot;&quot;,&quot;non-dropping-particle&quot;:&quot;&quot;}],&quot;accessed&quot;:{&quot;date-parts&quot;:[[2026,7,15]]},&quot;URL&quot;:&quot;https://www.php.net/manual/en/book.pdo.php&quot;,&quot;container-title-short&quot;:&quot;&quot;},&quot;isTemporary&quot;:false,&quot;suppress-author&quot;:false,&quot;composite&quot;:false,&quot;author-only&quot;:false}]},{&quot;citationID&quot;:&quot;MENDELEY_CITATION_2e03e530-e8fd-4d20-a43e-f7a2cf563431&quot;,&quot;properties&quot;:{&quot;noteIndex&quot;:0},&quot;isEdited&quot;:false,&quot;manualOverride&quot;:{&quot;isManuallyOverridden&quot;:false,&quot;citeprocText&quot;:&quot;[6]&quot;,&quot;manualOverrideText&quot;:&quot;&quot;},&quot;citationTag&quot;:&quot;MENDELEY_CITATION_v3_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&quot;,&quot;citationItems&quot;:[{&quot;id&quot;:&quot;423bf9f3-29fb-399a-ac24-688086f07946&quot;,&quot;itemData&quot;:{&quot;type&quot;:&quot;webpage&quot;,&quot;id&quot;:&quot;423bf9f3-29fb-399a-ac24-688086f07946&quot;,&quot;title&quot;:&quot;CREATE PROCEDURE&quot;,&quot;author&quot;:[{&quot;family&quot;:&quot;PostgreSQL Global Development Group&quot;,&quot;given&quot;:&quot;&quot;,&quot;parse-names&quot;:false,&quot;dropping-particle&quot;:&quot;&quot;,&quot;non-dropping-particle&quot;:&quot;&quot;}],&quot;accessed&quot;:{&quot;date-parts&quot;:[[2026,7,15]]},&quot;URL&quot;:&quot;https://www.postgresql.org/docs/current/sql-createprocedure.html&quot;,&quot;container-title-short&quot;:&quot;&quot;},&quot;isTemporary&quot;:false,&quot;suppress-author&quot;:false,&quot;composite&quot;:false,&quot;author-only&quot;:false}]},{&quot;citationID&quot;:&quot;MENDELEY_CITATION_f9beb473-ffb6-42e4-9f68-b3721c1241b8&quot;,&quot;properties&quot;:{&quot;noteIndex&quot;:0},&quot;isEdited&quot;:false,&quot;manualOverride&quot;:{&quot;isManuallyOverridden&quot;:false,&quot;citeprocText&quot;:&quot;[7]&quot;,&quot;manualOverrideText&quot;:&quot;&quot;},&quot;citationTag&quot;:&quot;MENDELEY_CITATION_v3_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&quot;,&quot;citationItems&quot;:[{&quot;id&quot;:&quot;3bdb57c6-313e-3e0d-a285-86251bb00338&quot;,&quot;itemData&quot;:{&quot;type&quot;:&quot;webpage&quot;,&quot;id&quot;:&quot;3bdb57c6-313e-3e0d-a285-86251bb00338&quot;,&quot;title&quot;:&quot;Jakarta Persistence 3.0 Specification&quot;,&quot;author&quot;:[{&quot;family&quot;:&quot;Eclipse Foundation&quot;,&quot;given&quot;:&quot;&quot;,&quot;parse-names&quot;:false,&quot;dropping-particle&quot;:&quot;&quot;,&quot;non-dropping-particle&quot;:&quot;&quot;}],&quot;accessed&quot;:{&quot;date-parts&quot;:[[2026,7,15]]},&quot;URL&quot;:&quot;https://jakarta.ee/specifications/persistence/3.0/jakarta-persistence-spec-3.0.html&quot;,&quot;issued&quot;:{&quot;date-parts&quot;:[[2020]]},&quot;container-title-short&quot;:&quot;&quot;},&quot;isTemporary&quot;:false,&quot;suppress-author&quot;:false,&quot;composite&quot;:false,&quot;author-only&quot;:false}]},{&quot;citationID&quot;:&quot;MENDELEY_CITATION_477878e4-70f0-4483-a48e-db51aae0b3ae&quot;,&quot;properties&quot;:{&quot;noteIndex&quot;:0},&quot;isEdited&quot;:false,&quot;manualOverride&quot;:{&quot;isManuallyOverridden&quot;:false,&quot;citeprocText&quot;:&quot;[8]&quot;,&quot;manualOverrideText&quot;:&quot;&quot;},&quot;citationTag&quot;:&quot;MENDELEY_CITATION_v3_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&quot;,&quot;citationItems&quot;:[{&quot;id&quot;:&quot;1dc84731-1c16-333c-a9d0-7326625217a8&quot;,&quot;itemData&quot;:{&quot;type&quot;:&quot;webpage&quot;,&quot;id&quot;:&quot;1dc84731-1c16-333c-a9d0-7326625217a8&quot;,&quot;title&quot;:&quot;Guide to the Software Engineering Body of Knowledge (SWEBOK), versión 4.0&quot;,&quot;author&quot;:[{&quot;family&quot;:&quot;IEEE Computer Society&quot;,&quot;given&quot;:&quot;&quot;,&quot;parse-names&quot;:false,&quot;dropping-particle&quot;:&quot;&quot;,&quot;non-dropping-particle&quot;:&quot;&quot;}],&quot;accessed&quot;:{&quot;date-parts&quot;:[[2026,7,15]]},&quot;URL&quot;:&quot;https://ieeecs-media.computer.org/media/education/swebok/swebok-v4.pdf&quot;,&quot;issued&quot;:{&quot;date-parts&quot;:[[2024]]},&quot;container-title-short&quot;:&quot;&quot;},&quot;isTemporary&quot;:false,&quot;suppress-author&quot;:false,&quot;composite&quot;:false,&quot;author-only&quot;:false}]},{&quot;citationID&quot;:&quot;MENDELEY_CITATION_00356c08-f0c3-4cc6-b29f-cf3a19026be9&quot;,&quot;properties&quot;:{&quot;noteIndex&quot;:0},&quot;isEdited&quot;:false,&quot;manualOverride&quot;:{&quot;isManuallyOverridden&quot;:false,&quot;citeprocText&quot;:&quot;[8]&quot;,&quot;manualOverrideText&quot;:&quot;&quot;},&quot;citationTag&quot;:&quot;MENDELEY_CITATION_v3_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&quot;,&quot;citationItems&quot;:[{&quot;id&quot;:&quot;1dc84731-1c16-333c-a9d0-7326625217a8&quot;,&quot;itemData&quot;:{&quot;type&quot;:&quot;webpage&quot;,&quot;id&quot;:&quot;1dc84731-1c16-333c-a9d0-7326625217a8&quot;,&quot;title&quot;:&quot;Guide to the Software Engineering Body of Knowledge (SWEBOK), versión 4.0&quot;,&quot;author&quot;:[{&quot;family&quot;:&quot;IEEE Computer Society&quot;,&quot;given&quot;:&quot;&quot;,&quot;parse-names&quot;:false,&quot;dropping-particle&quot;:&quot;&quot;,&quot;non-dropping-particle&quot;:&quot;&quot;}],&quot;accessed&quot;:{&quot;date-parts&quot;:[[2026,7,15]]},&quot;URL&quot;:&quot;https://ieeecs-media.computer.org/media/education/swebok/swebok-v4.pdf&quot;,&quot;issued&quot;:{&quot;date-parts&quot;:[[2024]]},&quot;container-title-short&quot;:&quot;&quot;},&quot;isTemporary&quot;:false,&quot;suppress-author&quot;:false,&quot;composite&quot;:false,&quot;author-only&quot;:false}]},{&quot;citationID&quot;:&quot;MENDELEY_CITATION_2d3f6b7c-c3b8-4bac-a98e-5dad1ad11c4f&quot;,&quot;properties&quot;:{&quot;noteIndex&quot;:0},&quot;isEdited&quot;:false,&quot;manualOverride&quot;:{&quot;isManuallyOverridden&quot;:false,&quot;citeprocText&quot;:&quot;[9]&quot;,&quot;manualOverrideText&quot;:&quot;&quot;},&quot;citationTag&quot;:&quot;MENDELEY_CITATION_v3_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&quot;,&quot;citationItems&quot;:[{&quot;id&quot;:&quot;b5d5c9b6-734d-30de-86a9-bf8f4b4c0427&quot;,&quot;itemData&quot;:{&quot;type&quot;:&quot;report&quot;,&quot;id&quot;:&quot;b5d5c9b6-734d-30de-86a9-bf8f4b4c0427&quot;,&quot;title&quot;:&quot;An Introduction to Software Architecture&quot;,&quot;author&quot;:[{&quot;family&quot;:&quot;Garlan&quot;,&quot;given&quot;:&quot;David&quot;,&quot;parse-names&quot;:false,&quot;dropping-particle&quot;:&quot;&quot;,&quot;non-dropping-particle&quot;:&quot;&quot;},{&quot;family&quot;:&quot;Shaw&quot;,&quot;given&quot;:&quot;Mary&quot;,&quot;parse-names&quot;:false,&quot;dropping-particle&quot;:&quot;&quot;,&quot;non-dropping-particle&quot;:&quot;&quot;}],&quot;accessed&quot;:{&quot;date-parts&quot;:[[2026,7,15]]},&quot;URL&quot;:&quot;http://sunnyday.mit.edu/16.355/intro_softarch.pdf&quot;,&quot;issued&quot;:{&quot;date-parts&quot;:[[1994]]},&quot;container-title-short&quot;:&quot;&quot;},&quot;isTemporary&quot;:false,&quot;suppress-author&quot;:false,&quot;composite&quot;:false,&quot;author-only&quot;:false}]},{&quot;citationID&quot;:&quot;MENDELEY_CITATION_5e89cc3b-629f-463b-8948-81f1057b60ab&quot;,&quot;properties&quot;:{&quot;noteIndex&quot;:0},&quot;isEdited&quot;:false,&quot;manualOverride&quot;:{&quot;isManuallyOverridden&quot;:false,&quot;citeprocText&quot;:&quot;[9]&quot;,&quot;manualOverrideText&quot;:&quot;&quot;},&quot;citationTag&quot;:&quot;MENDELEY_CITATION_v3_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&quot;,&quot;citationItems&quot;:[{&quot;id&quot;:&quot;b5d5c9b6-734d-30de-86a9-bf8f4b4c0427&quot;,&quot;itemData&quot;:{&quot;type&quot;:&quot;report&quot;,&quot;id&quot;:&quot;b5d5c9b6-734d-30de-86a9-bf8f4b4c0427&quot;,&quot;title&quot;:&quot;An Introduction to Software Architecture&quot;,&quot;author&quot;:[{&quot;family&quot;:&quot;Garlan&quot;,&quot;given&quot;:&quot;David&quot;,&quot;parse-names&quot;:false,&quot;dropping-particle&quot;:&quot;&quot;,&quot;non-dropping-particle&quot;:&quot;&quot;},{&quot;family&quot;:&quot;Shaw&quot;,&quot;given&quot;:&quot;Mary&quot;,&quot;parse-names&quot;:false,&quot;dropping-particle&quot;:&quot;&quot;,&quot;non-dropping-particle&quot;:&quot;&quot;}],&quot;accessed&quot;:{&quot;date-parts&quot;:[[2026,7,15]]},&quot;URL&quot;:&quot;http://sunnyday.mit.edu/16.355/intro_softarch.pdf&quot;,&quot;issued&quot;:{&quot;date-parts&quot;:[[1994]]},&quot;container-title-short&quot;:&quot;&quot;},&quot;isTemporary&quot;:false,&quot;suppress-author&quot;:false,&quot;composite&quot;:false,&quot;author-only&quot;:false}]},{&quot;citationID&quot;:&quot;MENDELEY_CITATION_ca1e0d21-5dbf-43f0-9b88-f33a4d5dc003&quot;,&quot;properties&quot;:{&quot;noteIndex&quot;:0},&quot;isEdited&quot;:false,&quot;manualOverride&quot;:{&quot;isManuallyOverridden&quot;:false,&quot;citeprocText&quot;:&quot;[9]&quot;,&quot;manualOverrideText&quot;:&quot;&quot;},&quot;citationTag&quot;:&quot;MENDELEY_CITATION_v3_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&quot;,&quot;citationItems&quot;:[{&quot;id&quot;:&quot;b5d5c9b6-734d-30de-86a9-bf8f4b4c0427&quot;,&quot;itemData&quot;:{&quot;type&quot;:&quot;report&quot;,&quot;id&quot;:&quot;b5d5c9b6-734d-30de-86a9-bf8f4b4c0427&quot;,&quot;title&quot;:&quot;An Introduction to Software Architecture&quot;,&quot;author&quot;:[{&quot;family&quot;:&quot;Garlan&quot;,&quot;given&quot;:&quot;David&quot;,&quot;parse-names&quot;:false,&quot;dropping-particle&quot;:&quot;&quot;,&quot;non-dropping-particle&quot;:&quot;&quot;},{&quot;family&quot;:&quot;Shaw&quot;,&quot;given&quot;:&quot;Mary&quot;,&quot;parse-names&quot;:false,&quot;dropping-particle&quot;:&quot;&quot;,&quot;non-dropping-particle&quot;:&quot;&quot;}],&quot;accessed&quot;:{&quot;date-parts&quot;:[[2026,7,15]]},&quot;URL&quot;:&quot;http://sunnyday.mit.edu/16.355/intro_softarch.pdf&quot;,&quot;issued&quot;:{&quot;date-parts&quot;:[[1994]]},&quot;container-title-short&quot;:&quot;&quot;},&quot;isTemporary&quot;:false,&quot;suppress-author&quot;:false,&quot;composite&quot;:false,&quot;author-only&quot;:false}]},{&quot;citationID&quot;:&quot;MENDELEY_CITATION_8eac902e-950d-488a-88f4-09b609caaa80&quot;,&quot;properties&quot;:{&quot;noteIndex&quot;:0},&quot;isEdited&quot;:false,&quot;manualOverride&quot;:{&quot;isManuallyOverridden&quot;:false,&quot;citeprocText&quot;:&quot;[9]&quot;,&quot;manualOverrideText&quot;:&quot;&quot;},&quot;citationTag&quot;:&quot;MENDELEY_CITATION_v3_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&quot;,&quot;citationItems&quot;:[{&quot;id&quot;:&quot;b5d5c9b6-734d-30de-86a9-bf8f4b4c0427&quot;,&quot;itemData&quot;:{&quot;type&quot;:&quot;report&quot;,&quot;id&quot;:&quot;b5d5c9b6-734d-30de-86a9-bf8f4b4c0427&quot;,&quot;title&quot;:&quot;An Introduction to Software Architecture&quot;,&quot;author&quot;:[{&quot;family&quot;:&quot;Garlan&quot;,&quot;given&quot;:&quot;David&quot;,&quot;parse-names&quot;:false,&quot;dropping-particle&quot;:&quot;&quot;,&quot;non-dropping-particle&quot;:&quot;&quot;},{&quot;family&quot;:&quot;Shaw&quot;,&quot;given&quot;:&quot;Mary&quot;,&quot;parse-names&quot;:false,&quot;dropping-particle&quot;:&quot;&quot;,&quot;non-dropping-particle&quot;:&quot;&quot;}],&quot;accessed&quot;:{&quot;date-parts&quot;:[[2026,7,15]]},&quot;URL&quot;:&quot;http://sunnyday.mit.edu/16.355/intro_softarch.pdf&quot;,&quot;issued&quot;:{&quot;date-parts&quot;:[[1994]]},&quot;container-title-short&quot;:&quot;&quot;},&quot;isTemporary&quot;:false,&quot;suppress-author&quot;:false,&quot;composite&quot;:false,&quot;author-only&quot;:false}]},{&quot;citationID&quot;:&quot;MENDELEY_CITATION_c419aa87-246c-46f3-9f04-3c521ede062b&quot;,&quot;properties&quot;:{&quot;noteIndex&quot;:0},&quot;isEdited&quot;:false,&quot;manualOverride&quot;:{&quot;isManuallyOverridden&quot;:false,&quot;citeprocText&quot;:&quot;[10]&quot;,&quot;manualOverrideText&quot;:&quot;&quot;},&quot;citationTag&quot;:&quot;MENDELEY_CITATION_v3_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&quot;,&quot;citationItems&quot;:[{&quot;id&quot;:&quot;021b7429-b007-3e73-b270-5d7f64fecad0&quot;,&quot;itemData&quot;:{&quot;type&quot;:&quot;report&quot;,&quot;id&quot;:&quot;021b7429-b007-3e73-b270-5d7f64fecad0&quot;,&quot;title&quot;:&quot;Reference Model for Service Oriented Architecture 1.0&quot;,&quot;author&quot;:[{&quot;family&quot;:&quot;OASIS&quot;,&quot;given&quot;:&quot;&quot;,&quot;parse-names&quot;:false,&quot;dropping-particle&quot;:&quot;&quot;,&quot;non-dropping-particle&quot;:&quot;&quot;}],&quot;accessed&quot;:{&quot;date-parts&quot;:[[2026,7,15]]},&quot;URL&quot;:&quot;https://docs.oasis-open.org/soa-rm/v1.0/soa-rm.pdf&quot;,&quot;issued&quot;:{&quot;date-parts&quot;:[[2006]]},&quot;container-title-short&quot;:&quot;&quot;},&quot;isTemporary&quot;:false,&quot;suppress-author&quot;:false,&quot;composite&quot;:false,&quot;author-only&quot;:false}]},{&quot;citationID&quot;:&quot;MENDELEY_CITATION_99cedccc-4ece-4306-bd0e-83071b07a706&quot;,&quot;properties&quot;:{&quot;noteIndex&quot;:0},&quot;isEdited&quot;:false,&quot;manualOverride&quot;:{&quot;isManuallyOverridden&quot;:false,&quot;citeprocText&quot;:&quot;[10]&quot;,&quot;manualOverrideText&quot;:&quot;&quot;},&quot;citationTag&quot;:&quot;MENDELEY_CITATION_v3_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&quot;,&quot;citationItems&quot;:[{&quot;id&quot;:&quot;021b7429-b007-3e73-b270-5d7f64fecad0&quot;,&quot;itemData&quot;:{&quot;type&quot;:&quot;report&quot;,&quot;id&quot;:&quot;021b7429-b007-3e73-b270-5d7f64fecad0&quot;,&quot;title&quot;:&quot;Reference Model for Service Oriented Architecture 1.0&quot;,&quot;author&quot;:[{&quot;family&quot;:&quot;OASIS&quot;,&quot;given&quot;:&quot;&quot;,&quot;parse-names&quot;:false,&quot;dropping-particle&quot;:&quot;&quot;,&quot;non-dropping-particle&quot;:&quot;&quot;}],&quot;accessed&quot;:{&quot;date-parts&quot;:[[2026,7,15]]},&quot;URL&quot;:&quot;https://docs.oasis-open.org/soa-rm/v1.0/soa-rm.pdf&quot;,&quot;issued&quot;:{&quot;date-parts&quot;:[[2006]]},&quot;container-title-short&quot;:&quot;&quot;},&quot;isTemporary&quot;:false,&quot;suppress-author&quot;:false,&quot;composite&quot;:false,&quot;author-only&quot;:false}]},{&quot;citationID&quot;:&quot;MENDELEY_CITATION_e462d249-f04b-4129-9a2a-720051c4562a&quot;,&quot;properties&quot;:{&quot;noteIndex&quot;:0},&quot;isEdited&quot;:false,&quot;manualOverride&quot;:{&quot;isManuallyOverridden&quot;:false,&quot;citeprocText&quot;:&quot;[11]&quot;,&quot;manualOverrideText&quot;:&quot;&quot;},&quot;citationTag&quot;:&quot;MENDELEY_CITATION_v3_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&quot;,&quot;citationItems&quot;:[{&quot;id&quot;:&quot;18046565-f8ca-3742-8dc7-37930e69a7be&quot;,&quot;itemData&quot;:{&quot;type&quot;:&quot;webpage&quot;,&quot;id&quot;:&quot;18046565-f8ca-3742-8dc7-37930e69a7be&quot;,&quot;title&quot;:&quot;Microservices: a definition of this new architectural term&quot;,&quot;author&quot;:[{&quot;family&quot;:&quot;Fowler&quot;,&quot;given&quot;:&quot;Martin&quot;,&quot;parse-names&quot;:false,&quot;dropping-particle&quot;:&quot;&quot;,&quot;non-dropping-particle&quot;:&quot;&quot;}],&quot;accessed&quot;:{&quot;date-parts&quot;:[[2026,7,15]]},&quot;URL&quot;:&quot;https://martinfowler.com/articles/microservices.html&quot;,&quot;issued&quot;:{&quot;date-parts&quot;:[[2015]]},&quot;container-title-short&quot;:&quot;&quot;},&quot;isTemporary&quot;:false,&quot;suppress-author&quot;:false,&quot;composite&quot;:false,&quot;author-only&quot;:false}]}]"/>
     <we:property name="MENDELEY_CITATIONS_STYLE" value="{&quot;id&quot;:&quot;http://www.zotero.org/styles/ieee&quot;,&quot;title&quot;:&quot;IEEE Reference Guide version 11.29.2023&quot;,&quot;format&quot;:&quot;numeric&quot;,&quot;defaultLocale&quot;:null,&quot;isLocaleCodeValid&quot;:true}"/>
   </we:properties>
   <we:bindings/>

</xml_diff>

<commit_message>
docs(investigacion): agregar Tema 4 y conclusiones - informe completo
</commit_message>
<xml_diff>
--- a/informe-investigacion/Informe_Investigacion_Unidad_III.docx
+++ b/informe-investigacion/Informe_Investigacion_Unidad_III.docx
@@ -238,7 +238,7 @@
           </mc:Choice>
           <mc:Fallback>
             <w:pict>
-              <v:group w14:anchorId="6350B1C8" id="Group 17289" o:spid="_x0000_s1026" style="position:absolute;margin-left:0;margin-top:73.25pt;width:453.5pt;height:0;z-index:251658240;mso-position-horizontal:left;mso-position-horizontal-relative:margin" coordorigin="-45262,381" coordsize="57599,0" o:gfxdata="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">
+              <v:group w14:anchorId="292F6CD1" id="Group 17289" o:spid="_x0000_s1026" style="position:absolute;margin-left:0;margin-top:73.25pt;width:453.5pt;height:0;z-index:251658240;mso-position-horizontal:left;mso-position-horizontal-relative:margin" coordorigin="-45262,381" coordsize="57599,0" o:gfxdata="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">
                 <v:shape id="Shape 14" o:spid="_x0000_s1027" style="position:absolute;left:-45262;top:381;width:57599;height:0;visibility:visible;mso-wrap-style:square;v-text-anchor:top" coordsize="5759996,0" o:gfxdata="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" path="m,l5759996,e" filled="f" strokeweight=".17569mm">
                   <v:stroke miterlimit="83231f" joinstyle="miter"/>
                   <v:path arrowok="t" textboxrect="0,0,5759996,0"/>
@@ -496,6 +496,9 @@
       </w:r>
     </w:p>
     <w:p>
+      <w:pPr>
+        <w:ind w:left="0" w:firstLine="0"/>
+      </w:pPr>
       <w:r>
         <w:t>Toda aplicación web necesita una forma de recibir información del usuario, devolverle una respuesta, y recordar quién es a lo largo de varias peticiones, aunque el protocolo HTTP en sí no recuerde nada de una petición a otra. Para resolver esto, las distintas plataformas de programación del lado del servidor ofrecen un conjunto de objetos integrados que representan cada una de esas necesidades. Aunque el nombre y la forma exacta cambian según la tecnología, el concepto detrás es el mismo en PHP, Java y ASP.NET.</w:t>
       </w:r>
@@ -593,28 +596,43 @@
         <w:t xml:space="preserve">, exponiendo métodos como </w:t>
       </w:r>
       <w:proofErr w:type="spellStart"/>
+      <w:proofErr w:type="gramStart"/>
       <w:r>
         <w:t>getParameter</w:t>
       </w:r>
       <w:proofErr w:type="spellEnd"/>
       <w:r>
-        <w:t xml:space="preserve">() para leer datos de un formulario, </w:t>
+        <w:t>(</w:t>
+      </w:r>
+      <w:proofErr w:type="gramEnd"/>
+      <w:r>
+        <w:t xml:space="preserve">) para leer datos de un formulario, </w:t>
       </w:r>
       <w:proofErr w:type="spellStart"/>
+      <w:proofErr w:type="gramStart"/>
       <w:r>
         <w:t>getHeader</w:t>
       </w:r>
       <w:proofErr w:type="spellEnd"/>
       <w:r>
-        <w:t xml:space="preserve">() para leer una cabecera específica, o </w:t>
+        <w:t>(</w:t>
+      </w:r>
+      <w:proofErr w:type="gramEnd"/>
+      <w:r>
+        <w:t xml:space="preserve">) para leer una cabecera específica, o </w:t>
       </w:r>
       <w:proofErr w:type="spellStart"/>
+      <w:proofErr w:type="gramStart"/>
       <w:r>
         <w:t>getMethod</w:t>
       </w:r>
       <w:proofErr w:type="spellEnd"/>
       <w:r>
-        <w:t>() para saber si la petición fue GET o POST</w:t>
+        <w:t>(</w:t>
+      </w:r>
+      <w:proofErr w:type="gramEnd"/>
+      <w:r>
+        <w:t>) para saber si la petición fue GET o POST</w:t>
       </w:r>
       <w:sdt>
         <w:sdtPr>
@@ -730,7 +748,7 @@
     </w:p>
     <w:p>
       <w:pPr>
-        <w:ind w:left="8" w:right="804"/>
+        <w:ind w:left="8" w:right="804" w:firstLine="0"/>
       </w:pPr>
       <w:r>
         <w:t xml:space="preserve">El objeto Response cumple el papel opuesto: representa lo que el servidor va a devolver al navegador una vez que terminó de procesar la petición. Esto incluye el código de estado HTTP (como 200 para éxito o 404 para no encontrado), las cabeceras de la respuesta, y el contenido que se va a mostrar. En Java, </w:t>
@@ -777,12 +795,17 @@
         <w:t xml:space="preserve">. Esto obliga a que toda la lógica de decisión (por ejemplo, decidir si algo salió bien o mal) ocurra antes de empezar a escribir el cuerpo de la respuesta. En PHP ocurre algo parecido: todo lo que el script imprime se convierte en el cuerpo de la respuesta, y la función </w:t>
       </w:r>
       <w:proofErr w:type="spellStart"/>
+      <w:proofErr w:type="gramStart"/>
       <w:r>
         <w:t>header</w:t>
       </w:r>
       <w:proofErr w:type="spellEnd"/>
       <w:r>
-        <w:t xml:space="preserve">() debe llamarse antes de que se haya impreso cualquier contenido, o PHP genera un error, reflejando la misma restricción de fondo. En ASP.NET Core, la propiedad </w:t>
+        <w:t>(</w:t>
+      </w:r>
+      <w:proofErr w:type="gramEnd"/>
+      <w:r>
+        <w:t xml:space="preserve">) debe llamarse antes de que se haya impreso cualquier contenido, o PHP genera un error, reflejando la misma restricción de fondo. En ASP.NET Core, la propiedad </w:t>
       </w:r>
       <w:proofErr w:type="spellStart"/>
       <w:r>
@@ -795,6 +818,11 @@
       <w:r>
         <w:t>.</w:t>
       </w:r>
+    </w:p>
+    <w:p>
+      <w:pPr>
+        <w:ind w:left="8" w:right="804"/>
+      </w:pPr>
     </w:p>
     <w:p>
       <w:pPr>
@@ -919,10 +947,12 @@
         <w:t xml:space="preserve">, obtenido llamando a </w:t>
       </w:r>
       <w:proofErr w:type="spellStart"/>
+      <w:proofErr w:type="gramStart"/>
       <w:r>
         <w:t>request.getSession</w:t>
       </w:r>
       <w:proofErr w:type="spellEnd"/>
+      <w:proofErr w:type="gramEnd"/>
       <w:r>
         <w:t xml:space="preserve">() </w:t>
       </w:r>
@@ -953,11 +983,19 @@
       </w:r>
       <w:proofErr w:type="spellStart"/>
       <w:r>
-        <w:t>session_start</w:t>
+        <w:t>session_</w:t>
+      </w:r>
+      <w:proofErr w:type="gramStart"/>
+      <w:r>
+        <w:t>start</w:t>
       </w:r>
       <w:proofErr w:type="spellEnd"/>
       <w:r>
-        <w:t xml:space="preserve">() </w:t>
+        <w:t>(</w:t>
+      </w:r>
+      <w:proofErr w:type="gramEnd"/>
+      <w:r>
+        <w:t xml:space="preserve">) </w:t>
       </w:r>
       <w:sdt>
         <w:sdtPr>
@@ -1097,7 +1135,7 @@
     <w:p>
       <w:pPr>
         <w:spacing w:after="109" w:line="259" w:lineRule="auto"/>
-        <w:ind w:left="435" w:right="0" w:firstLine="0"/>
+        <w:ind w:left="0" w:right="0" w:firstLine="0"/>
         <w:jc w:val="left"/>
       </w:pPr>
       <w:r>
@@ -1156,7 +1194,7 @@
     <w:p>
       <w:pPr>
         <w:spacing w:after="109" w:line="259" w:lineRule="auto"/>
-        <w:ind w:left="435" w:right="0" w:firstLine="0"/>
+        <w:ind w:left="0" w:right="0" w:firstLine="0"/>
         <w:jc w:val="left"/>
       </w:pPr>
       <w:r>
@@ -1277,7 +1315,7 @@
     <w:p>
       <w:pPr>
         <w:spacing w:after="109" w:line="259" w:lineRule="auto"/>
-        <w:ind w:left="435" w:right="0" w:firstLine="0"/>
+        <w:ind w:left="0" w:right="0" w:firstLine="0"/>
         <w:jc w:val="left"/>
       </w:pPr>
       <w:r>
@@ -1298,7 +1336,7 @@
     <w:p>
       <w:pPr>
         <w:spacing w:after="109" w:line="259" w:lineRule="auto"/>
-        <w:ind w:left="435" w:right="0" w:firstLine="0"/>
+        <w:ind w:left="0" w:right="0" w:firstLine="0"/>
         <w:jc w:val="left"/>
         <w:rPr>
           <w:b/>
@@ -1326,63 +1364,63 @@
     <w:p>
       <w:pPr>
         <w:spacing w:after="109" w:line="259" w:lineRule="auto"/>
-        <w:ind w:left="435" w:right="0" w:firstLine="0"/>
-        <w:rPr>
-          <w:sz w:val="24"/>
-        </w:rPr>
-      </w:pPr>
-      <w:r>
-        <w:rPr>
-          <w:sz w:val="24"/>
+        <w:ind w:left="0" w:right="0" w:firstLine="0"/>
+        <w:rPr>
+          <w:szCs w:val="22"/>
+        </w:rPr>
+      </w:pPr>
+      <w:r>
+        <w:rPr>
+          <w:szCs w:val="22"/>
         </w:rPr>
         <w:t xml:space="preserve">Cada plataforma de programación del lado del servidor ofrece su propia forma estándar de conectarse a una base de datos relacional. En Java, esa forma es JDBC (Java </w:t>
       </w:r>
       <w:proofErr w:type="spellStart"/>
       <w:r>
         <w:rPr>
-          <w:sz w:val="24"/>
+          <w:szCs w:val="22"/>
         </w:rPr>
         <w:t>Database</w:t>
       </w:r>
       <w:proofErr w:type="spellEnd"/>
       <w:r>
         <w:rPr>
-          <w:sz w:val="24"/>
+          <w:szCs w:val="22"/>
         </w:rPr>
         <w:t xml:space="preserve"> </w:t>
       </w:r>
       <w:proofErr w:type="spellStart"/>
       <w:r>
         <w:rPr>
-          <w:sz w:val="24"/>
+          <w:szCs w:val="22"/>
         </w:rPr>
         <w:t>Connectivity</w:t>
       </w:r>
       <w:proofErr w:type="spellEnd"/>
       <w:r>
         <w:rPr>
-          <w:sz w:val="24"/>
+          <w:szCs w:val="22"/>
         </w:rPr>
         <w:t xml:space="preserve">), una API que permite que el código Java se conecte a prácticamente cualquier motor de base de datos a través de un driver específico para ese motor, ejecute sentencias SQL, y reciba los resultados como objetos que el propio programa puede recorrer, como un </w:t>
       </w:r>
       <w:proofErr w:type="spellStart"/>
       <w:r>
         <w:rPr>
-          <w:sz w:val="24"/>
+          <w:szCs w:val="22"/>
         </w:rPr>
         <w:t>ResultSet</w:t>
       </w:r>
       <w:proofErr w:type="spellEnd"/>
       <w:r>
         <w:rPr>
-          <w:sz w:val="24"/>
+          <w:szCs w:val="22"/>
         </w:rPr>
         <w:t xml:space="preserve"> </w:t>
       </w:r>
       <w:sdt>
         <w:sdtPr>
           <w:rPr>
-            <w:sz w:val="24"/>
+            <w:szCs w:val="22"/>
           </w:rPr>
           <w:tag w:val="MENDELEY_CITATION_v3_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"/>
           <w:id w:val="-2061541765"/>
@@ -1393,7 +1431,7 @@
         <w:sdtContent>
           <w:r>
             <w:rPr>
-              <w:sz w:val="24"/>
+              <w:szCs w:val="22"/>
             </w:rPr>
             <w:t>[4]</w:t>
           </w:r>
@@ -1401,28 +1439,28 @@
       </w:sdt>
       <w:r>
         <w:rPr>
-          <w:sz w:val="24"/>
+          <w:szCs w:val="22"/>
         </w:rPr>
         <w:t xml:space="preserve">. Lo importante de JDBC es que el código de la aplicación no necesita saber los detalles internos de comunicación con la base de datos: solo necesita el driver correcto y una cadena de conexión, y toda la complejidad de hablar el protocolo nativo del motor queda oculta detrás de esa API común. En PHP existe un equivalente llamado PDO (PHP Data </w:t>
       </w:r>
       <w:proofErr w:type="spellStart"/>
       <w:r>
         <w:rPr>
-          <w:sz w:val="24"/>
+          <w:szCs w:val="22"/>
         </w:rPr>
         <w:t>Objects</w:t>
       </w:r>
       <w:proofErr w:type="spellEnd"/>
       <w:r>
         <w:rPr>
-          <w:sz w:val="24"/>
+          <w:szCs w:val="22"/>
         </w:rPr>
         <w:t xml:space="preserve">), una extensión que ofrece una interfaz consistente para trabajar con distintos motores de base de datos —MySQL, PostgreSQL, SQLite, entre otros— usando prácticamente el mismo código, de modo que cambiar de motor de base de datos implica modificar poco más que la cadena de conexión </w:t>
       </w:r>
       <w:sdt>
         <w:sdtPr>
           <w:rPr>
-            <w:sz w:val="24"/>
+            <w:szCs w:val="22"/>
           </w:rPr>
           <w:tag w:val="MENDELEY_CITATION_v3_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"/>
           <w:id w:val="-813404276"/>
@@ -1433,7 +1471,7 @@
         <w:sdtContent>
           <w:r>
             <w:rPr>
-              <w:sz w:val="24"/>
+              <w:szCs w:val="22"/>
             </w:rPr>
             <w:t>[5]</w:t>
           </w:r>
@@ -1441,121 +1479,139 @@
       </w:sdt>
       <w:r>
         <w:rPr>
+          <w:szCs w:val="22"/>
+        </w:rPr>
+        <w:t>. En ambos casos, la idea de fondo es la misma: aislar al desarrollador de los detalles particulares del motor de base de datos que se esté usando en ese momento.</w:t>
+      </w:r>
+    </w:p>
+    <w:p>
+      <w:pPr>
+        <w:spacing w:after="109" w:line="259" w:lineRule="auto"/>
+        <w:ind w:left="0" w:right="0" w:firstLine="0"/>
+        <w:jc w:val="left"/>
+        <w:rPr>
+          <w:b/>
+          <w:bCs/>
           <w:sz w:val="24"/>
         </w:rPr>
-        <w:t>. En ambos casos, la idea de fondo es la misma: aislar al desarrollador de los detalles particulares del motor de base de datos que se esté usando en ese momento.</w:t>
+      </w:pPr>
+      <w:r>
+        <w:rPr>
+          <w:b/>
+          <w:bCs/>
+          <w:sz w:val="24"/>
+        </w:rPr>
+        <w:t>3.</w:t>
+      </w:r>
+      <w:r>
+        <w:rPr>
+          <w:b/>
+          <w:bCs/>
+          <w:sz w:val="24"/>
+        </w:rPr>
+        <w:t>2</w:t>
+      </w:r>
+      <w:r>
+        <w:rPr>
+          <w:b/>
+          <w:bCs/>
+          <w:sz w:val="24"/>
+        </w:rPr>
+        <w:t xml:space="preserve"> Consultas SQL desde aplicaciones web</w:t>
       </w:r>
     </w:p>
     <w:p>
       <w:pPr>
         <w:spacing w:after="109" w:line="259" w:lineRule="auto"/>
-        <w:ind w:left="435" w:right="0" w:firstLine="0"/>
-        <w:jc w:val="left"/>
-        <w:rPr>
-          <w:b/>
-          <w:bCs/>
-          <w:sz w:val="24"/>
-        </w:rPr>
-      </w:pPr>
-      <w:r>
-        <w:rPr>
-          <w:b/>
-          <w:bCs/>
-          <w:sz w:val="24"/>
-        </w:rPr>
-        <w:t>3.</w:t>
-      </w:r>
-      <w:r>
-        <w:rPr>
-          <w:b/>
-          <w:bCs/>
-          <w:sz w:val="24"/>
-        </w:rPr>
-        <w:t>2</w:t>
-      </w:r>
-      <w:r>
-        <w:rPr>
-          <w:b/>
-          <w:bCs/>
-          <w:sz w:val="24"/>
-        </w:rPr>
-        <w:t xml:space="preserve"> Consultas SQL desde aplicaciones web</w:t>
-      </w:r>
-    </w:p>
-    <w:p>
-      <w:pPr>
-        <w:spacing w:after="109" w:line="259" w:lineRule="auto"/>
-        <w:ind w:left="435" w:right="0" w:firstLine="0"/>
-        <w:rPr>
-          <w:sz w:val="24"/>
-        </w:rPr>
-      </w:pPr>
-      <w:r>
-        <w:rPr>
-          <w:sz w:val="24"/>
+        <w:ind w:left="0" w:right="0" w:firstLine="0"/>
+        <w:rPr>
+          <w:szCs w:val="22"/>
+        </w:rPr>
+      </w:pPr>
+      <w:r>
+        <w:rPr>
+          <w:szCs w:val="22"/>
         </w:rPr>
         <w:t xml:space="preserve">Enviar una consulta SQL desde una aplicación web no es tan simple como pegar el texto del SQL directamente, sobre todo cuando esa consulta depende de datos que ingresó el usuario, como un nombre de búsqueda o un identificador. Construir la consulta concatenando ese dato directamente dentro del texto SQL abre la puerta a la inyección SQL, uno de los riesgos de seguridad más conocidos en aplicaciones web. La forma correcta y estándar de evitarlo es mediante sentencias preparadas: primero se define la estructura de la consulta con espacios reservados para los valores variables, y luego esos valores se envían por separado al motor de base de datos, que nunca los interpreta como parte del código SQL, sino solamente como datos. En JDBC, esto se logra con un objeto </w:t>
       </w:r>
       <w:proofErr w:type="spellStart"/>
       <w:r>
         <w:rPr>
-          <w:sz w:val="24"/>
+          <w:szCs w:val="22"/>
         </w:rPr>
         <w:t>PreparedStatement</w:t>
       </w:r>
       <w:proofErr w:type="spellEnd"/>
       <w:r>
         <w:rPr>
-          <w:sz w:val="24"/>
+          <w:szCs w:val="22"/>
         </w:rPr>
         <w:t xml:space="preserve">, creado a partir de </w:t>
       </w:r>
       <w:proofErr w:type="spellStart"/>
-      <w:r>
-        <w:rPr>
-          <w:sz w:val="24"/>
+      <w:proofErr w:type="gramStart"/>
+      <w:r>
+        <w:rPr>
+          <w:szCs w:val="22"/>
         </w:rPr>
         <w:t>connection.prepareStatement</w:t>
       </w:r>
       <w:proofErr w:type="spellEnd"/>
-      <w:r>
-        <w:rPr>
-          <w:sz w:val="24"/>
+      <w:proofErr w:type="gramEnd"/>
+      <w:r>
+        <w:rPr>
+          <w:szCs w:val="22"/>
         </w:rPr>
         <w:t xml:space="preserve">(), donde los valores se asignan uno por uno con métodos como </w:t>
       </w:r>
       <w:proofErr w:type="spellStart"/>
-      <w:r>
-        <w:rPr>
-          <w:sz w:val="24"/>
+      <w:proofErr w:type="gramStart"/>
+      <w:r>
+        <w:rPr>
+          <w:szCs w:val="22"/>
         </w:rPr>
         <w:t>setString</w:t>
       </w:r>
       <w:proofErr w:type="spellEnd"/>
       <w:r>
         <w:rPr>
-          <w:sz w:val="24"/>
-        </w:rPr>
-        <w:t xml:space="preserve">() o </w:t>
+          <w:szCs w:val="22"/>
+        </w:rPr>
+        <w:t>(</w:t>
+      </w:r>
+      <w:proofErr w:type="gramEnd"/>
+      <w:r>
+        <w:rPr>
+          <w:szCs w:val="22"/>
+        </w:rPr>
+        <w:t xml:space="preserve">) o </w:t>
       </w:r>
       <w:proofErr w:type="spellStart"/>
-      <w:r>
-        <w:rPr>
-          <w:sz w:val="24"/>
+      <w:proofErr w:type="gramStart"/>
+      <w:r>
+        <w:rPr>
+          <w:szCs w:val="22"/>
         </w:rPr>
         <w:t>setInt</w:t>
       </w:r>
       <w:proofErr w:type="spellEnd"/>
       <w:r>
         <w:rPr>
-          <w:sz w:val="24"/>
-        </w:rPr>
-        <w:t xml:space="preserve">() antes de ejecutar la consulta </w:t>
+          <w:szCs w:val="22"/>
+        </w:rPr>
+        <w:t>(</w:t>
+      </w:r>
+      <w:proofErr w:type="gramEnd"/>
+      <w:r>
+        <w:rPr>
+          <w:szCs w:val="22"/>
+        </w:rPr>
+        <w:t xml:space="preserve">) antes de ejecutar la consulta </w:t>
       </w:r>
       <w:sdt>
         <w:sdtPr>
           <w:rPr>
-            <w:sz w:val="24"/>
+            <w:szCs w:val="22"/>
           </w:rPr>
           <w:tag w:val="MENDELEY_CITATION_v3_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"/>
           <w:id w:val="-801765256"/>
@@ -1566,7 +1622,7 @@
         <w:sdtContent>
           <w:r>
             <w:rPr>
-              <w:sz w:val="24"/>
+              <w:szCs w:val="22"/>
             </w:rPr>
             <w:t>[4]</w:t>
           </w:r>
@@ -1574,42 +1630,72 @@
       </w:sdt>
       <w:r>
         <w:rPr>
-          <w:sz w:val="24"/>
-        </w:rPr>
-        <w:t xml:space="preserve">. En PDO, el mismo patrón se logra con prepare(), </w:t>
+          <w:szCs w:val="22"/>
+        </w:rPr>
+        <w:t xml:space="preserve">. En PDO, el mismo patrón se logra con </w:t>
+      </w:r>
+      <w:proofErr w:type="gramStart"/>
+      <w:r>
+        <w:rPr>
+          <w:szCs w:val="22"/>
+        </w:rPr>
+        <w:t>prepare(</w:t>
+      </w:r>
+      <w:proofErr w:type="gramEnd"/>
+      <w:r>
+        <w:rPr>
+          <w:szCs w:val="22"/>
+        </w:rPr>
+        <w:t xml:space="preserve">), </w:t>
       </w:r>
       <w:proofErr w:type="spellStart"/>
-      <w:r>
-        <w:rPr>
-          <w:sz w:val="24"/>
+      <w:proofErr w:type="gramStart"/>
+      <w:r>
+        <w:rPr>
+          <w:szCs w:val="22"/>
         </w:rPr>
         <w:t>bindValue</w:t>
       </w:r>
       <w:proofErr w:type="spellEnd"/>
       <w:r>
         <w:rPr>
-          <w:sz w:val="24"/>
-        </w:rPr>
-        <w:t xml:space="preserve">() y </w:t>
+          <w:szCs w:val="22"/>
+        </w:rPr>
+        <w:t>(</w:t>
+      </w:r>
+      <w:proofErr w:type="gramEnd"/>
+      <w:r>
+        <w:rPr>
+          <w:szCs w:val="22"/>
+        </w:rPr>
+        <w:t xml:space="preserve">) y </w:t>
       </w:r>
       <w:proofErr w:type="spellStart"/>
-      <w:r>
-        <w:rPr>
-          <w:sz w:val="24"/>
+      <w:proofErr w:type="gramStart"/>
+      <w:r>
+        <w:rPr>
+          <w:szCs w:val="22"/>
         </w:rPr>
         <w:t>execute</w:t>
       </w:r>
       <w:proofErr w:type="spellEnd"/>
       <w:r>
         <w:rPr>
-          <w:sz w:val="24"/>
-        </w:rPr>
-        <w:t xml:space="preserve">() </w:t>
+          <w:szCs w:val="22"/>
+        </w:rPr>
+        <w:t>(</w:t>
+      </w:r>
+      <w:proofErr w:type="gramEnd"/>
+      <w:r>
+        <w:rPr>
+          <w:szCs w:val="22"/>
+        </w:rPr>
+        <w:t xml:space="preserve">) </w:t>
       </w:r>
       <w:sdt>
         <w:sdtPr>
           <w:rPr>
-            <w:sz w:val="24"/>
+            <w:szCs w:val="22"/>
           </w:rPr>
           <w:tag w:val="MENDELEY_CITATION_v3_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"/>
           <w:id w:val="256180983"/>
@@ -1620,7 +1706,7 @@
         <w:sdtContent>
           <w:r>
             <w:rPr>
-              <w:sz w:val="24"/>
+              <w:szCs w:val="22"/>
             </w:rPr>
             <w:t>[5]</w:t>
           </w:r>
@@ -1628,7 +1714,7 @@
       </w:sdt>
       <w:r>
         <w:rPr>
-          <w:sz w:val="24"/>
+          <w:szCs w:val="22"/>
         </w:rPr>
         <w:t>. Además de la seguridad, las sentencias preparadas también ofrecen una ventaja de rendimiento cuando la misma consulta se ejecuta muchas veces con distintos valores, porque el motor de base de datos puede reutilizar el plan de ejecución ya calculado en lugar de recompilarlo cada vez.</w:t>
       </w:r>
@@ -1650,7 +1736,7 @@
     <w:p>
       <w:pPr>
         <w:spacing w:after="109" w:line="259" w:lineRule="auto"/>
-        <w:ind w:left="435" w:right="0" w:firstLine="0"/>
+        <w:ind w:left="0" w:right="0" w:firstLine="0"/>
         <w:jc w:val="left"/>
         <w:rPr>
           <w:b/>
@@ -1664,33 +1750,36 @@
           <w:bCs/>
           <w:sz w:val="24"/>
         </w:rPr>
+        <w:t>3.</w:t>
+      </w:r>
+      <w:r>
+        <w:rPr>
+          <w:b/>
+          <w:bCs/>
+          <w:sz w:val="24"/>
+        </w:rPr>
+        <w:t>3</w:t>
+      </w:r>
+      <w:r>
+        <w:rPr>
+          <w:b/>
+          <w:bCs/>
+          <w:sz w:val="24"/>
+        </w:rPr>
+        <w:t xml:space="preserve"> Procedimientos almacenados y funciones de BD</w:t>
+      </w:r>
+    </w:p>
+    <w:p>
+      <w:pPr>
+        <w:spacing w:after="109" w:line="259" w:lineRule="auto"/>
+        <w:ind w:left="0" w:right="0" w:firstLine="0"/>
+      </w:pPr>
+      <w:r>
+        <w:t xml:space="preserve">Un procedimiento almacenado o una función de base de datos es un bloque de lógica que se guarda directamente dentro del motor de base de datos, en lugar de vivir en el código de la aplicación, y que se invoca por su nombre en vez de enviar el texto completo de la consulta cada vez. En PostgreSQL, la distinción entre ambos es concreta: una función devuelve un valor y puede usarse dentro de otras expresiones, como en una cláusula SELECT o WHERE, mientras que un procedimiento no devuelve ningún valor y se ejecuta con la </w:t>
+      </w:r>
+      <w:r>
         <w:lastRenderedPageBreak/>
-        <w:t>3.</w:t>
-      </w:r>
-      <w:r>
-        <w:rPr>
-          <w:b/>
-          <w:bCs/>
-          <w:sz w:val="24"/>
-        </w:rPr>
-        <w:t>3</w:t>
-      </w:r>
-      <w:r>
-        <w:rPr>
-          <w:b/>
-          <w:bCs/>
-          <w:sz w:val="24"/>
-        </w:rPr>
-        <w:t xml:space="preserve"> Procedimientos almacenados y funciones de BD</w:t>
-      </w:r>
-    </w:p>
-    <w:p>
-      <w:pPr>
-        <w:spacing w:after="109" w:line="259" w:lineRule="auto"/>
-        <w:ind w:left="435" w:right="0" w:firstLine="0"/>
-      </w:pPr>
-      <w:r>
-        <w:t xml:space="preserve">Un procedimiento almacenado o una función de base de datos es un bloque de lógica que se guarda directamente dentro del motor de base de datos, en lugar de vivir en el código de la aplicación, y que se invoca por su nombre en vez de enviar el texto completo de la consulta cada vez. En PostgreSQL, la distinción entre ambos es concreta: una función devuelve un valor y puede usarse dentro de otras expresiones, como en una cláusula SELECT o WHERE, mientras que un procedimiento no devuelve ningún valor y se ejecuta con la instrucción CALL; además, solo los procedimientos pueden controlar transacciones completas dentro de su propio cuerpo, haciendo COMMIT o ROLLBACK, algo que una función no puede hacer </w:t>
+        <w:t xml:space="preserve">instrucción CALL; además, solo los procedimientos pueden controlar transacciones completas dentro de su propio cuerpo, haciendo COMMIT o ROLLBACK, algo que una función no puede hacer </w:t>
       </w:r>
       <w:sdt>
         <w:sdtPr>
@@ -1713,7 +1802,7 @@
     <w:p>
       <w:pPr>
         <w:spacing w:after="109" w:line="259" w:lineRule="auto"/>
-        <w:ind w:left="435" w:right="0" w:firstLine="0"/>
+        <w:ind w:left="0" w:right="0" w:firstLine="0"/>
         <w:jc w:val="left"/>
         <w:rPr>
           <w:b/>
@@ -1749,7 +1838,7 @@
     <w:p>
       <w:pPr>
         <w:spacing w:after="109" w:line="259" w:lineRule="auto"/>
-        <w:ind w:left="435" w:right="0" w:firstLine="0"/>
+        <w:ind w:left="0" w:right="0" w:firstLine="0"/>
       </w:pPr>
       <w:r>
         <w:t xml:space="preserve">El mapeo objeto-relacional (ORM) nace de un problema de fondo conocido como </w:t>
@@ -1838,6 +1927,9 @@
       </w:r>
     </w:p>
     <w:p>
+      <w:pPr>
+        <w:ind w:left="0" w:firstLine="0"/>
+      </w:pPr>
       <w:r>
         <w:t>La arquitectura de software determina qué tan fácil (o difícil) será mantener y hacer crecer una aplicación web con el tiempo, mucho más allá de si el código funciona correctamente en el momento en que se escribe. Este tema revisa los principios generales detrás de esa disciplina, y las principales formas de organizar un sistema, desde la arquitectura por capas —la más común en aplicaciones web tradicionales— hasta alternativas como los microservicios o las arquitecturas orientadas a eventos.</w:t>
       </w:r>
@@ -1845,6 +1937,11 @@
     <w:p>
       <w:pPr>
         <w:ind w:left="0" w:firstLine="0"/>
+      </w:pPr>
+    </w:p>
+    <w:p>
+      <w:pPr>
+        <w:ind w:left="0" w:firstLine="0"/>
         <w:rPr>
           <w:b/>
           <w:bCs/>
@@ -1857,6 +1954,15 @@
         </w:rPr>
         <w:t>4.1 Principios de arquitectura de software</w:t>
       </w:r>
+    </w:p>
+    <w:p>
+      <w:pPr>
+        <w:ind w:left="0" w:firstLine="0"/>
+        <w:rPr>
+          <w:b/>
+          <w:bCs/>
+        </w:rPr>
+      </w:pPr>
     </w:p>
     <w:p>
       <w:pPr>
@@ -1880,11 +1986,7 @@
         </w:sdtContent>
       </w:sdt>
       <w:r>
-        <w:t xml:space="preserve">. Estas decisiones determinan atributos de calidad como el rendimiento, la seguridad, la mantenibilidad y la capacidad de escalar, y son mucho más difíciles de revertir que un simple error de código: un error arquitectónico temprano, como acoplar excesivamente la lógica de negocio con el </w:t>
-      </w:r>
-      <w:r>
-        <w:lastRenderedPageBreak/>
-        <w:t xml:space="preserve">acceso a datos, puede volverse costoso de corregir a medida que el sistema crece </w:t>
+        <w:t xml:space="preserve">. Estas decisiones determinan atributos de calidad como el rendimiento, la seguridad, la mantenibilidad y la capacidad de escalar, y son mucho más difíciles de revertir que un simple error de código: un error arquitectónico temprano, como acoplar excesivamente la lógica de negocio con el acceso a datos, puede volverse costoso de corregir a medida que el sistema crece </w:t>
       </w:r>
       <w:sdt>
         <w:sdtPr>
@@ -1912,16 +2014,22 @@
     <w:p>
       <w:pPr>
         <w:ind w:left="0" w:firstLine="0"/>
-        <w:rPr>
-          <w:b/>
-          <w:bCs/>
-        </w:rPr>
-      </w:pPr>
-      <w:r>
-        <w:rPr>
-          <w:b/>
-          <w:bCs/>
-        </w:rPr>
+      </w:pPr>
+    </w:p>
+    <w:p>
+      <w:pPr>
+        <w:ind w:left="0" w:firstLine="0"/>
+        <w:rPr>
+          <w:b/>
+          <w:bCs/>
+        </w:rPr>
+      </w:pPr>
+      <w:r>
+        <w:rPr>
+          <w:b/>
+          <w:bCs/>
+        </w:rPr>
+        <w:lastRenderedPageBreak/>
         <w:t>4.</w:t>
       </w:r>
       <w:r>
@@ -2155,11 +2263,7 @@
         </w:sdtContent>
       </w:sdt>
       <w:r>
-        <w:t xml:space="preserve">. El modelo de referencia de OASIS para SOA es deliberadamente abstracto: no está atado a ninguna tecnología o estándar concreto, sino </w:t>
-      </w:r>
-      <w:r>
-        <w:lastRenderedPageBreak/>
-        <w:t xml:space="preserve">que busca dar un vocabulario común para razonar sobre sistemas orientados a servicios independientemente de cómo se implementen </w:t>
+        <w:t xml:space="preserve">. El modelo de referencia de OASIS para SOA es deliberadamente abstracto: no está atado a ninguna tecnología o estándar concreto, sino que busca dar un vocabulario común para razonar sobre sistemas orientados a servicios independientemente de cómo se implementen </w:t>
       </w:r>
       <w:sdt>
         <w:sdtPr>
@@ -2184,7 +2288,11 @@
         <w:ind w:left="0" w:firstLine="0"/>
       </w:pPr>
       <w:r>
-        <w:t xml:space="preserve">Los microservicios son, en cierto sentido, una evolución concreta y más granular de esa misma idea: dividen el sistema en servicios pequeños e independientes, cada uno con su propia base de datos y ciclo de despliegue propio, que se comunican entre sí por red [10]. Esto permite escalar cada servicio por separado y que distintos equipos trabajen sin bloquearse mutuamente, pero introduce complejidad operativa considerable: hay que gestionar comunicación entre servicios, consistencia de datos distribuidos, y tolerancia a fallos de red que en un sistema monolítico simplemente no existen </w:t>
+        <w:t xml:space="preserve">Los microservicios son, en cierto sentido, una evolución concreta y más granular de esa misma idea: dividen el sistema en servicios pequeños e independientes, cada uno con su propia base de datos y ciclo de despliegue propio, que se comunican entre sí por red [10]. </w:t>
+      </w:r>
+      <w:r>
+        <w:lastRenderedPageBreak/>
+        <w:t xml:space="preserve">Esto permite escalar cada servicio por separado y que distintos equipos trabajen sin bloquearse mutuamente, pero introduce complejidad operativa considerable: hay que gestionar comunicación entre servicios, consistencia de datos distribuidos, y tolerancia a fallos de red que en un sistema monolítico simplemente no existen </w:t>
       </w:r>
       <w:sdt>
         <w:sdtPr>
@@ -2209,10 +2317,296 @@
         <w:ind w:left="0" w:firstLine="0"/>
       </w:pPr>
     </w:p>
+    <w:p>
+      <w:pPr>
+        <w:pStyle w:val="Ttulo1"/>
+      </w:pPr>
+      <w:r>
+        <w:t xml:space="preserve">Tema </w:t>
+      </w:r>
+      <w:r>
+        <w:t>4</w:t>
+      </w:r>
+      <w:r>
+        <w:t xml:space="preserve">: </w:t>
+      </w:r>
+      <w:r>
+        <w:t>Diseño de Arquitecturas Web Escalables</w:t>
+      </w:r>
+    </w:p>
+    <w:p>
+      <w:pPr>
+        <w:ind w:left="0" w:firstLine="0"/>
+      </w:pPr>
+      <w:r>
+        <w:t>Una aplicación web que funciona bien con diez usuarios de prueba no necesariamente funciona igual de bien con diez mil usuarios reales al mismo tiempo. Diseñar pensando en la escalabilidad significa anticipar ese crecimiento desde el diseño, no como un parche posterior. Este tema cierra el informe revisando cómo escalar una aplicación web, qué papel juega la caché en ese proceso, y cómo se documentan las decisiones arquitectónicas para que sigan siendo comprensibles con el tiempo.</w:t>
+      </w:r>
+    </w:p>
+    <w:p>
+      <w:pPr>
+        <w:ind w:left="0" w:firstLine="0"/>
+      </w:pPr>
+    </w:p>
+    <w:p>
+      <w:pPr>
+        <w:ind w:left="0" w:firstLine="0"/>
+        <w:rPr>
+          <w:b/>
+          <w:bCs/>
+        </w:rPr>
+      </w:pPr>
+      <w:r>
+        <w:rPr>
+          <w:b/>
+          <w:bCs/>
+        </w:rPr>
+        <w:t>5.1 Escalabilidad en aplicaciones web</w:t>
+      </w:r>
+    </w:p>
+    <w:p>
+      <w:pPr>
+        <w:ind w:left="0" w:firstLine="0"/>
+      </w:pPr>
+      <w:r>
+        <w:t xml:space="preserve">Escalar un sistema significa aumentar su capacidad para atender más carga de trabajo, y existen dos estrategias principales para lograrlo. La escalabilidad vertical consiste en aumentar los recursos de un único servidor —más memoria, más procesador—, una solución </w:t>
+      </w:r>
+      <w:proofErr w:type="gramStart"/>
+      <w:r>
+        <w:t>simple</w:t>
+      </w:r>
+      <w:proofErr w:type="gramEnd"/>
+      <w:r>
+        <w:t xml:space="preserve"> pero con un límite físico y de costo. La escalabilidad horizontal, en cambio, consiste en agregar más instancias del mismo servidor y repartir la carga entre ellas mediante un balanceador, una estrategia que en principio no tiene un límite tan cercano, pero que exige que la aplicación esté diseñada para funcionar en varias instancias a la vez sin depender de estado guardado localmente en una sola de ellas. Facebook documentó un ejemplo real de los desafíos que aparecen a esta escala: al construir su infraestructura de </w:t>
+      </w:r>
+      <w:proofErr w:type="spellStart"/>
+      <w:r>
+        <w:t>memcache</w:t>
+      </w:r>
+      <w:proofErr w:type="spellEnd"/>
+      <w:r>
+        <w:t xml:space="preserve"> para atender miles de millones de peticiones por segundo, tuvieron que resolver problemas que simplemente no existen en un sistema pequeño, como picos de tráfico coordinados sobre un mismo dato popular cuando su caché expira al mismo tiempo para todas las peticiones concurrentes </w:t>
+      </w:r>
+      <w:sdt>
+        <w:sdtPr>
+          <w:tag w:val="MENDELEY_CITATION_v3_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"/>
+          <w:id w:val="-824506219"/>
+          <w:placeholder>
+            <w:docPart w:val="DefaultPlaceholder_-1854013440"/>
+          </w:placeholder>
+        </w:sdtPr>
+        <w:sdtContent>
+          <w:r>
+            <w:t>[12]</w:t>
+          </w:r>
+        </w:sdtContent>
+      </w:sdt>
+      <w:r>
+        <w:t>. Este tipo de problemas ilustra por qué la escalabilidad no es solamente "agregar más servidores", sino un conjunto de decisiones de diseño que deben tomarse con anticipación.</w:t>
+      </w:r>
+    </w:p>
+    <w:p>
+      <w:pPr>
+        <w:ind w:left="0" w:firstLine="0"/>
+      </w:pPr>
+    </w:p>
+    <w:p>
+      <w:pPr>
+        <w:ind w:left="0" w:firstLine="0"/>
+        <w:rPr>
+          <w:b/>
+          <w:bCs/>
+        </w:rPr>
+      </w:pPr>
+      <w:r>
+        <w:rPr>
+          <w:b/>
+          <w:bCs/>
+        </w:rPr>
+        <w:t>5.</w:t>
+      </w:r>
+      <w:r>
+        <w:rPr>
+          <w:b/>
+          <w:bCs/>
+        </w:rPr>
+        <w:t>2</w:t>
+      </w:r>
+      <w:r>
+        <w:rPr>
+          <w:b/>
+          <w:bCs/>
+        </w:rPr>
+        <w:t xml:space="preserve"> Patrones de caché en aplicaciones web</w:t>
+      </w:r>
+    </w:p>
+    <w:p>
+      <w:pPr>
+        <w:ind w:left="0" w:firstLine="0"/>
+      </w:pPr>
+      <w:r>
+        <w:t xml:space="preserve">La caché es, junto con la escalabilidad horizontal, una de las herramientas más efectivas para que una aplicación web soporte más carga sin aumentar proporcionalmente el costo de infraestructura. El patrón más común es cache-aside: la aplicación consulta primero la caché, y solo si el dato no está ahí (cache miss) consulta la base de datos y guarda el resultado en caché para las siguientes peticiones </w:t>
+      </w:r>
+      <w:sdt>
+        <w:sdtPr>
+          <w:tag w:val="MENDELEY_CITATION_v3_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"/>
+          <w:id w:val="-1825346852"/>
+          <w:placeholder>
+            <w:docPart w:val="DefaultPlaceholder_-1854013440"/>
+          </w:placeholder>
+        </w:sdtPr>
+        <w:sdtContent>
+          <w:r>
+            <w:t>[13]</w:t>
+          </w:r>
+        </w:sdtContent>
+      </w:sdt>
+      <w:r>
+        <w:t xml:space="preserve">. Este patrón resulta especialmente adecuado cuando la base de datos sigue siendo la fuente de verdad y la caché es simplemente un acelerador desechable, </w:t>
+      </w:r>
+      <w:proofErr w:type="gramStart"/>
+      <w:r>
+        <w:t>ya que</w:t>
+      </w:r>
+      <w:proofErr w:type="gramEnd"/>
+      <w:r>
+        <w:t xml:space="preserve"> si la caché se pierde por completo, la aplicación sigue funcionando, solo que más lenta, consultando directamente la base de datos </w:t>
+      </w:r>
+      <w:sdt>
+        <w:sdtPr>
+          <w:tag w:val="MENDELEY_CITATION_v3_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"/>
+          <w:id w:val="1309288346"/>
+          <w:placeholder>
+            <w:docPart w:val="DefaultPlaceholder_-1854013440"/>
+          </w:placeholder>
+        </w:sdtPr>
+        <w:sdtContent>
+          <w:r>
+            <w:t>[13]</w:t>
+          </w:r>
+        </w:sdtContent>
+      </w:sdt>
+      <w:r>
+        <w:t xml:space="preserve">. Redis es una de las tecnologías más usadas para implementar este patrón, gracias a que es un almacén de estructuras de datos en memoria diseñado para ofrecer tiempos de respuesta muy por debajo de los de una base de datos relacional en disco </w:t>
+      </w:r>
+      <w:sdt>
+        <w:sdtPr>
+          <w:tag w:val="MENDELEY_CITATION_v3_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"/>
+          <w:id w:val="821853254"/>
+          <w:placeholder>
+            <w:docPart w:val="DefaultPlaceholder_-1854013440"/>
+          </w:placeholder>
+        </w:sdtPr>
+        <w:sdtContent>
+          <w:r>
+            <w:t>[14]</w:t>
+          </w:r>
+        </w:sdtContent>
+      </w:sdt>
+      <w:r>
+        <w:t xml:space="preserve">. Un detalle importante en cualquier escenario con más de un servidor de aplicación es que la caché debe ser compartida </w:t>
+      </w:r>
+      <w:r>
+        <w:lastRenderedPageBreak/>
+        <w:t>entre todas las instancias, no una copia local por servidor, porque de lo contrario cada instancia tendría una visión distinta y desactualizada de los mismos datos.</w:t>
+      </w:r>
+    </w:p>
+    <w:p>
+      <w:pPr>
+        <w:ind w:left="0" w:firstLine="0"/>
+        <w:rPr>
+          <w:b/>
+          <w:bCs/>
+        </w:rPr>
+      </w:pPr>
+    </w:p>
+    <w:p>
+      <w:pPr>
+        <w:ind w:left="0" w:firstLine="0"/>
+        <w:rPr>
+          <w:b/>
+          <w:bCs/>
+        </w:rPr>
+      </w:pPr>
+      <w:r>
+        <w:rPr>
+          <w:b/>
+          <w:bCs/>
+        </w:rPr>
+        <w:t>5.</w:t>
+      </w:r>
+      <w:r>
+        <w:rPr>
+          <w:b/>
+          <w:bCs/>
+        </w:rPr>
+        <w:t>3</w:t>
+      </w:r>
+      <w:r>
+        <w:rPr>
+          <w:b/>
+          <w:bCs/>
+        </w:rPr>
+        <w:t xml:space="preserve"> Documentación y evaluación de arquitecturas web</w:t>
+      </w:r>
+    </w:p>
+    <w:p>
+      <w:pPr>
+        <w:ind w:left="0" w:firstLine="0"/>
+      </w:pPr>
+      <w:r>
+        <w:t xml:space="preserve">Una arquitectura bien diseñada pierde buena parte de su valor si nadie puede entender por qué se tomaron ciertas decisiones meses después de que el sistema ya está en producción. El modelo C4, propuesto por </w:t>
+      </w:r>
+      <w:proofErr w:type="spellStart"/>
+      <w:r>
+        <w:t>Simon</w:t>
+      </w:r>
+      <w:proofErr w:type="spellEnd"/>
+      <w:r>
+        <w:t xml:space="preserve"> Brown, documenta la arquitectura de un sistema en niveles progresivos de abstracción: desde un nivel de Contexto que muestra el sistema como una caja negra y sus actores externos, hasta niveles más detallados de Contenedores, Componentes y, opcionalmente, Código </w:t>
+      </w:r>
+      <w:sdt>
+        <w:sdtPr>
+          <w:tag w:val="MENDELEY_CITATION_v3_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"/>
+          <w:id w:val="1593053424"/>
+          <w:placeholder>
+            <w:docPart w:val="DefaultPlaceholder_-1854013440"/>
+          </w:placeholder>
+        </w:sdtPr>
+        <w:sdtContent>
+          <w:r>
+            <w:t>[15]</w:t>
+          </w:r>
+        </w:sdtContent>
+      </w:sdt>
+      <w:r>
+        <w:t xml:space="preserve">. Esto permite comunicar la arquitectura al nivel de detalle adecuado según la audiencia, sin obligar a que cada diagrama muestre absolutamente todo el sistema a la vez. Complementando esto, un </w:t>
+      </w:r>
+      <w:proofErr w:type="spellStart"/>
+      <w:r>
+        <w:t>Architectural</w:t>
+      </w:r>
+      <w:proofErr w:type="spellEnd"/>
+      <w:r>
+        <w:t xml:space="preserve"> </w:t>
+      </w:r>
+      <w:proofErr w:type="spellStart"/>
+      <w:r>
+        <w:t>Decision</w:t>
+      </w:r>
+      <w:proofErr w:type="spellEnd"/>
+      <w:r>
+        <w:t xml:space="preserve"> Record (ADR) es un documento breve que registra una decisión arquitectónica junto con el contexto que la motivó, las alternativas consideradas, y las consecuencias esperadas; su valor no está en el resultado final —que en principio podría inferirse leyendo el código— sino en preservar el razonamiento detrás de esa decisión, algo que de otra forma se pierde con el tiempo y la rotación del equipo.</w:t>
+      </w:r>
+    </w:p>
+    <w:p>
+      <w:pPr>
+        <w:ind w:left="0" w:firstLine="0"/>
+      </w:pPr>
+    </w:p>
     <w:sdt>
       <w:sdtPr>
         <w:tag w:val="MENDELEY_BIBLIOGRAPHY"/>
-        <w:id w:val="1444352933"/>
+        <w:id w:val="-1472750313"/>
         <w:placeholder>
           <w:docPart w:val="DefaultPlaceholder_-1854013440"/>
         </w:placeholder>
@@ -2223,7 +2617,7 @@
             <w:autoSpaceDE w:val="0"/>
             <w:autoSpaceDN w:val="0"/>
             <w:ind w:hanging="640"/>
-            <w:divId w:val="263609518"/>
+            <w:divId w:val="987904753"/>
             <w:rPr>
               <w:rFonts w:eastAsia="Times New Roman"/>
               <w:kern w:val="0"/>
@@ -2252,7 +2646,7 @@
             <w:autoSpaceDE w:val="0"/>
             <w:autoSpaceDN w:val="0"/>
             <w:ind w:hanging="640"/>
-            <w:divId w:val="251353451"/>
+            <w:divId w:val="59253754"/>
             <w:rPr>
               <w:rFonts w:eastAsia="Times New Roman"/>
               <w:lang w:val="en-US"/>
@@ -2271,7 +2665,23 @@
               <w:lang w:val="en-US"/>
             </w:rPr>
             <w:tab/>
-            <w:t>The PHP Group, “Superglobals.” Accessed: Jul. 15, 2026. [Online]. Available: https://www.php.net/manual/en/language.variables.superglobals.php</w:t>
+            <w:t>The PHP Group, “</w:t>
+          </w:r>
+          <w:proofErr w:type="spellStart"/>
+          <w:r>
+            <w:rPr>
+              <w:rFonts w:eastAsia="Times New Roman"/>
+              <w:lang w:val="en-US"/>
+            </w:rPr>
+            <w:t>Superglobals</w:t>
+          </w:r>
+          <w:proofErr w:type="spellEnd"/>
+          <w:r>
+            <w:rPr>
+              <w:rFonts w:eastAsia="Times New Roman"/>
+              <w:lang w:val="en-US"/>
+            </w:rPr>
+            <w:t>.” Accessed: Jul. 15, 2026. [Online]. Available: https://www.php.net/manual/en/language.variables.superglobals.php</w:t>
           </w:r>
         </w:p>
         <w:p>
@@ -2279,7 +2689,7 @@
             <w:autoSpaceDE w:val="0"/>
             <w:autoSpaceDN w:val="0"/>
             <w:ind w:hanging="640"/>
-            <w:divId w:val="1483697378"/>
+            <w:divId w:val="923151972"/>
             <w:rPr>
               <w:rFonts w:eastAsia="Times New Roman"/>
               <w:lang w:val="en-US"/>
@@ -2306,7 +2716,7 @@
             <w:autoSpaceDE w:val="0"/>
             <w:autoSpaceDN w:val="0"/>
             <w:ind w:hanging="640"/>
-            <w:divId w:val="683824179"/>
+            <w:divId w:val="737747038"/>
             <w:rPr>
               <w:rFonts w:eastAsia="Times New Roman"/>
               <w:lang w:val="en-US"/>
@@ -2333,7 +2743,7 @@
             <w:autoSpaceDE w:val="0"/>
             <w:autoSpaceDN w:val="0"/>
             <w:ind w:hanging="640"/>
-            <w:divId w:val="1790198106"/>
+            <w:divId w:val="516117358"/>
             <w:rPr>
               <w:rFonts w:eastAsia="Times New Roman"/>
               <w:lang w:val="en-US"/>
@@ -2360,7 +2770,7 @@
             <w:autoSpaceDE w:val="0"/>
             <w:autoSpaceDN w:val="0"/>
             <w:ind w:hanging="640"/>
-            <w:divId w:val="736782923"/>
+            <w:divId w:val="814294875"/>
             <w:rPr>
               <w:rFonts w:eastAsia="Times New Roman"/>
               <w:lang w:val="en-US"/>
@@ -2387,7 +2797,7 @@
             <w:autoSpaceDE w:val="0"/>
             <w:autoSpaceDN w:val="0"/>
             <w:ind w:hanging="640"/>
-            <w:divId w:val="1165972255"/>
+            <w:divId w:val="1842575993"/>
             <w:rPr>
               <w:rFonts w:eastAsia="Times New Roman"/>
               <w:lang w:val="en-US"/>
@@ -2414,7 +2824,7 @@
             <w:autoSpaceDE w:val="0"/>
             <w:autoSpaceDN w:val="0"/>
             <w:ind w:hanging="640"/>
-            <w:divId w:val="1901356304"/>
+            <w:divId w:val="699552782"/>
             <w:rPr>
               <w:rFonts w:eastAsia="Times New Roman"/>
               <w:lang w:val="en-US"/>
@@ -2433,7 +2843,23 @@
               <w:lang w:val="en-US"/>
             </w:rPr>
             <w:tab/>
-            <w:t>IEEE Computer Society, “Guide to the Software Engineering Body of Knowledge (SWEBOK), versión 4.0.” Accessed: Jul. 15, 2026. [Online]. Available: https://ieeecs-media.computer.org/media/education/swebok/swebok-v4.pdf</w:t>
+            <w:t xml:space="preserve">IEEE Computer Society, “Guide to the Software Engineering Body of Knowledge (SWEBOK), </w:t>
+          </w:r>
+          <w:proofErr w:type="spellStart"/>
+          <w:r>
+            <w:rPr>
+              <w:rFonts w:eastAsia="Times New Roman"/>
+              <w:lang w:val="en-US"/>
+            </w:rPr>
+            <w:t>versión</w:t>
+          </w:r>
+          <w:proofErr w:type="spellEnd"/>
+          <w:r>
+            <w:rPr>
+              <w:rFonts w:eastAsia="Times New Roman"/>
+              <w:lang w:val="en-US"/>
+            </w:rPr>
+            <w:t xml:space="preserve"> 4.0.” Accessed: Jul. 15, 2026. [Online]. Available: https://ieeecs-media.computer.org/media/education/swebok/swebok-v4.pdf</w:t>
           </w:r>
         </w:p>
         <w:p>
@@ -2441,7 +2867,7 @@
             <w:autoSpaceDE w:val="0"/>
             <w:autoSpaceDN w:val="0"/>
             <w:ind w:hanging="640"/>
-            <w:divId w:val="2059081760"/>
+            <w:divId w:val="865757238"/>
             <w:rPr>
               <w:rFonts w:eastAsia="Times New Roman"/>
               <w:lang w:val="en-US"/>
@@ -2468,7 +2894,7 @@
             <w:autoSpaceDE w:val="0"/>
             <w:autoSpaceDN w:val="0"/>
             <w:ind w:hanging="640"/>
-            <w:divId w:val="1404445003"/>
+            <w:divId w:val="606545927"/>
             <w:rPr>
               <w:rFonts w:eastAsia="Times New Roman"/>
               <w:lang w:val="en-US"/>
@@ -2495,9 +2921,10 @@
             <w:autoSpaceDE w:val="0"/>
             <w:autoSpaceDN w:val="0"/>
             <w:ind w:hanging="640"/>
-            <w:divId w:val="2046564576"/>
-            <w:rPr>
-              <w:rFonts w:eastAsia="Times New Roman"/>
+            <w:divId w:val="572279996"/>
+            <w:rPr>
+              <w:rFonts w:eastAsia="Times New Roman"/>
+              <w:lang w:val="en-US"/>
             </w:rPr>
           </w:pPr>
           <w:r>
@@ -2505,6 +2932,7 @@
               <w:rFonts w:eastAsia="Times New Roman"/>
               <w:lang w:val="en-US"/>
             </w:rPr>
+            <w:lastRenderedPageBreak/>
             <w:t>[11]</w:t>
           </w:r>
           <w:r>
@@ -2513,12 +2941,183 @@
               <w:lang w:val="en-US"/>
             </w:rPr>
             <w:tab/>
-            <w:t xml:space="preserve">M. Fowler, “Microservices: a definition of this new architectural term.” </w:t>
+            <w:t>M. Fowler, “Microservices: a definition of this new architectural term.” Accessed: Jul. 15, 2026. [Online]. Available: https://martinfowler.com/articles/microservices.html</w:t>
+          </w:r>
+        </w:p>
+        <w:p>
+          <w:pPr>
+            <w:autoSpaceDE w:val="0"/>
+            <w:autoSpaceDN w:val="0"/>
+            <w:ind w:hanging="640"/>
+            <w:divId w:val="1039009344"/>
+            <w:rPr>
+              <w:rFonts w:eastAsia="Times New Roman"/>
+              <w:lang w:val="en-US"/>
+            </w:rPr>
+          </w:pPr>
+          <w:r>
+            <w:rPr>
+              <w:rFonts w:eastAsia="Times New Roman"/>
+              <w:lang w:val="en-US"/>
+            </w:rPr>
+            <w:t>[12]</w:t>
+          </w:r>
+          <w:r>
+            <w:rPr>
+              <w:rFonts w:eastAsia="Times New Roman"/>
+              <w:lang w:val="en-US"/>
+            </w:rPr>
+            <w:tab/>
+            <w:t xml:space="preserve">R. </w:t>
           </w:r>
           <w:proofErr w:type="spellStart"/>
           <w:r>
             <w:rPr>
               <w:rFonts w:eastAsia="Times New Roman"/>
+              <w:lang w:val="en-US"/>
+            </w:rPr>
+            <w:t>Nishtala</w:t>
+          </w:r>
+          <w:proofErr w:type="spellEnd"/>
+          <w:r>
+            <w:rPr>
+              <w:rFonts w:eastAsia="Times New Roman"/>
+              <w:lang w:val="en-US"/>
+            </w:rPr>
+            <w:t xml:space="preserve"> </w:t>
+          </w:r>
+          <w:r>
+            <w:rPr>
+              <w:rFonts w:eastAsia="Times New Roman"/>
+              <w:i/>
+              <w:iCs/>
+              <w:lang w:val="en-US"/>
+            </w:rPr>
+            <w:t>et al.</w:t>
+          </w:r>
+          <w:r>
+            <w:rPr>
+              <w:rFonts w:eastAsia="Times New Roman"/>
+              <w:lang w:val="en-US"/>
+            </w:rPr>
+            <w:t xml:space="preserve">, “Scaling Memcache at Facebook,” in </w:t>
+          </w:r>
+          <w:r>
+            <w:rPr>
+              <w:rFonts w:eastAsia="Times New Roman"/>
+              <w:i/>
+              <w:iCs/>
+              <w:lang w:val="en-US"/>
+            </w:rPr>
+            <w:t>10th USENIX Symposium on Networked Systems Design and Implementation (NSDI 13)</w:t>
+          </w:r>
+          <w:r>
+            <w:rPr>
+              <w:rFonts w:eastAsia="Times New Roman"/>
+              <w:lang w:val="en-US"/>
+            </w:rPr>
+            <w:t>, 2013. Accessed: Jul. 15, 2026. [Online]. Available: https://www.usenix.org/system/files/conference/nsdi13/nsdi13-final170_update.pdf</w:t>
+          </w:r>
+        </w:p>
+        <w:p>
+          <w:pPr>
+            <w:autoSpaceDE w:val="0"/>
+            <w:autoSpaceDN w:val="0"/>
+            <w:ind w:hanging="640"/>
+            <w:divId w:val="2127233130"/>
+            <w:rPr>
+              <w:rFonts w:eastAsia="Times New Roman"/>
+              <w:lang w:val="en-US"/>
+            </w:rPr>
+          </w:pPr>
+          <w:r>
+            <w:rPr>
+              <w:rFonts w:eastAsia="Times New Roman"/>
+              <w:lang w:val="en-US"/>
+            </w:rPr>
+            <w:t>[13]</w:t>
+          </w:r>
+          <w:r>
+            <w:rPr>
+              <w:rFonts w:eastAsia="Times New Roman"/>
+              <w:lang w:val="en-US"/>
+            </w:rPr>
+            <w:tab/>
+            <w:t>Microsoft, “Cache-Aside pattern.” Accessed: Jul. 15, 2026. [Online]. Available: https://learn.microsoft.com/en-us/azure/architecture/patterns/cache-aside</w:t>
+          </w:r>
+        </w:p>
+        <w:p>
+          <w:pPr>
+            <w:autoSpaceDE w:val="0"/>
+            <w:autoSpaceDN w:val="0"/>
+            <w:ind w:hanging="640"/>
+            <w:divId w:val="1809087248"/>
+            <w:rPr>
+              <w:rFonts w:eastAsia="Times New Roman"/>
+              <w:lang w:val="en-US"/>
+            </w:rPr>
+          </w:pPr>
+          <w:r>
+            <w:rPr>
+              <w:rFonts w:eastAsia="Times New Roman"/>
+              <w:lang w:val="en-US"/>
+            </w:rPr>
+            <w:t>[14]</w:t>
+          </w:r>
+          <w:r>
+            <w:rPr>
+              <w:rFonts w:eastAsia="Times New Roman"/>
+              <w:lang w:val="en-US"/>
+            </w:rPr>
+            <w:tab/>
+            <w:t>Redis, “Understand Redis data types.” Accessed: Jul. 15, 2026. [Online]. Available: https://redis.io/docs/latest/develop/data-types/</w:t>
+          </w:r>
+        </w:p>
+        <w:p>
+          <w:pPr>
+            <w:autoSpaceDE w:val="0"/>
+            <w:autoSpaceDN w:val="0"/>
+            <w:ind w:hanging="640"/>
+            <w:divId w:val="429088967"/>
+            <w:rPr>
+              <w:rFonts w:eastAsia="Times New Roman"/>
+            </w:rPr>
+          </w:pPr>
+          <w:r>
+            <w:rPr>
+              <w:rFonts w:eastAsia="Times New Roman"/>
+              <w:lang w:val="en-US"/>
+            </w:rPr>
+            <w:t>[15]</w:t>
+          </w:r>
+          <w:r>
+            <w:rPr>
+              <w:rFonts w:eastAsia="Times New Roman"/>
+              <w:lang w:val="en-US"/>
+            </w:rPr>
+            <w:tab/>
+            <w:t xml:space="preserve">S. Brown, “The C4 model for </w:t>
+          </w:r>
+          <w:proofErr w:type="spellStart"/>
+          <w:r>
+            <w:rPr>
+              <w:rFonts w:eastAsia="Times New Roman"/>
+              <w:lang w:val="en-US"/>
+            </w:rPr>
+            <w:t>visualising</w:t>
+          </w:r>
+          <w:proofErr w:type="spellEnd"/>
+          <w:r>
+            <w:rPr>
+              <w:rFonts w:eastAsia="Times New Roman"/>
+              <w:lang w:val="en-US"/>
+            </w:rPr>
+            <w:t xml:space="preserve"> software architecture.” </w:t>
+          </w:r>
+          <w:proofErr w:type="spellStart"/>
+          <w:r>
+            <w:rPr>
+              <w:rFonts w:eastAsia="Times New Roman"/>
             </w:rPr>
             <w:t>Accessed</w:t>
           </w:r>
@@ -2527,7 +3126,21 @@
             <w:rPr>
               <w:rFonts w:eastAsia="Times New Roman"/>
             </w:rPr>
-            <w:t>: Jul. 15, 2026. [Online]. Available: https://martinfowler.com/articles/microservices.html</w:t>
+            <w:t xml:space="preserve">: </w:t>
+          </w:r>
+          <w:proofErr w:type="gramStart"/>
+          <w:r>
+            <w:rPr>
+              <w:rFonts w:eastAsia="Times New Roman"/>
+            </w:rPr>
+            <w:t>Jul.</w:t>
+          </w:r>
+          <w:proofErr w:type="gramEnd"/>
+          <w:r>
+            <w:rPr>
+              <w:rFonts w:eastAsia="Times New Roman"/>
+            </w:rPr>
+            <w:t xml:space="preserve"> 15, 2026. [Online]. Available: https://c4model.com</w:t>
           </w:r>
         </w:p>
         <w:p>
@@ -4200,7 +4813,7 @@
   </w:compat>
   <w:rsids>
     <w:rsidRoot w:val="00E074D3"/>
-    <w:rsid w:val="004D2E64"/>
+    <w:rsid w:val="005E4F5C"/>
     <w:rsid w:val="00912EEB"/>
     <w:rsid w:val="00E074D3"/>
   </w:rsids>
@@ -5004,8 +5617,8 @@
   </we:alternateReferences>
   <we:properties>
     <we:property name="MENDELEY_BIBLIOGRAPHY_IS_DIRTY" value="false"/>
-    <we:property name="MENDELEY_BIBLIOGRAPHY_LAST_MODIFIED" value="1784244541126"/>
-    <we:property name="MENDELEY_CITATIONS" value="[{&quot;citationID&quot;:&quot;MENDELEY_CITATION_cbaa5770-f04b-43bc-88b3-1745ece311b1&quot;,&quot;properties&quot;:{&quot;noteIndex&quot;:0},&quot;isEdited&quot;:false,&quot;manualOverride&quot;:{&quot;isManuallyOverridden&quot;:false,&quot;citeprocText&quot;:&quot;[1]&quot;,&quot;manualOverrideText&quot;:&quot;&quot;},&quot;citationTag&quot;:&quot;MENDELEY_CITATION_v3_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&quot;,&quot;citationItems&quot;:[{&quot;id&quot;:&quot;5246948d-a9a1-3347-bd4f-626648939cac&quot;,&quot;itemData&quot;:{&quot;type&quot;:&quot;webpage&quot;,&quot;id&quot;:&quot;5246948d-a9a1-3347-bd4f-626648939cac&quot;,&quot;title&quot;:&quot;Jakarta Servlet&quot;,&quot;author&quot;:[{&quot;family&quot;:&quot;Eclipse Foundation&quot;,&quot;given&quot;:&quot;&quot;,&quot;parse-names&quot;:false,&quot;dropping-particle&quot;:&quot;&quot;,&quot;non-dropping-particle&quot;:&quot;&quot;}],&quot;accessed&quot;:{&quot;date-parts&quot;:[[2026,7,15]]},&quot;URL&quot;:&quot;https://jakarta.ee/learn/docs/jakartaee-tutorial/current/web/servlets/servlets.html&quot;,&quot;container-title-short&quot;:&quot;&quot;},&quot;isTemporary&quot;:false,&quot;suppress-author&quot;:false,&quot;composite&quot;:false,&quot;author-only&quot;:false}]},{&quot;citationID&quot;:&quot;MENDELEY_CITATION_8adb0b72-409f-461e-8b00-d24574021135&quot;,&quot;properties&quot;:{&quot;noteIndex&quot;:0},&quot;isEdited&quot;:false,&quot;manualOverride&quot;:{&quot;isManuallyOverridden&quot;:false,&quot;citeprocText&quot;:&quot;[2]&quot;,&quot;manualOverrideText&quot;:&quot;&quot;},&quot;citationTag&quot;:&quot;MENDELEY_CITATION_v3_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&quot;,&quot;citationItems&quot;:[{&quot;id&quot;:&quot;a61821f4-1e99-38a1-86f5-3afdba1da3a6&quot;,&quot;itemData&quot;:{&quot;type&quot;:&quot;webpage&quot;,&quot;id&quot;:&quot;a61821f4-1e99-38a1-86f5-3afdba1da3a6&quot;,&quot;title&quot;:&quot;Superglobals&quot;,&quot;author&quot;:[{&quot;family&quot;:&quot;The PHP Group&quot;,&quot;given&quot;:&quot;&quot;,&quot;parse-names&quot;:false,&quot;dropping-particle&quot;:&quot;&quot;,&quot;non-dropping-particle&quot;:&quot;&quot;}],&quot;accessed&quot;:{&quot;date-parts&quot;:[[2026,7,15]]},&quot;URL&quot;:&quot;https://www.php.net/manual/en/language.variables.superglobals.php&quot;,&quot;container-title-short&quot;:&quot;&quot;},&quot;isTemporary&quot;:false,&quot;suppress-author&quot;:false,&quot;composite&quot;:false,&quot;author-only&quot;:false}]},{&quot;citationID&quot;:&quot;MENDELEY_CITATION_1e4da306-d171-44f0-8ccf-97b236f521d6&quot;,&quot;properties&quot;:{&quot;noteIndex&quot;:0},&quot;isEdited&quot;:false,&quot;manualOverride&quot;:{&quot;isManuallyOverridden&quot;:false,&quot;citeprocText&quot;:&quot;[1]&quot;,&quot;manualOverrideText&quot;:&quot;&quot;},&quot;citationTag&quot;:&quot;MENDELEY_CITATION_v3_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&quot;,&quot;citationItems&quot;:[{&quot;id&quot;:&quot;5246948d-a9a1-3347-bd4f-626648939cac&quot;,&quot;itemData&quot;:{&quot;type&quot;:&quot;webpage&quot;,&quot;id&quot;:&quot;5246948d-a9a1-3347-bd4f-626648939cac&quot;,&quot;title&quot;:&quot;Jakarta Servlet&quot;,&quot;author&quot;:[{&quot;family&quot;:&quot;Eclipse Foundation&quot;,&quot;given&quot;:&quot;&quot;,&quot;parse-names&quot;:false,&quot;dropping-particle&quot;:&quot;&quot;,&quot;non-dropping-particle&quot;:&quot;&quot;}],&quot;accessed&quot;:{&quot;date-parts&quot;:[[2026,7,15]]},&quot;URL&quot;:&quot;https://jakarta.ee/learn/docs/jakartaee-tutorial/current/web/servlets/servlets.html&quot;,&quot;container-title-short&quot;:&quot;&quot;},&quot;isTemporary&quot;:false,&quot;suppress-author&quot;:false,&quot;composite&quot;:false,&quot;author-only&quot;:false}]},{&quot;citationID&quot;:&quot;MENDELEY_CITATION_84be9df0-ec47-42fa-8e5e-a3ee77241e57&quot;,&quot;properties&quot;:{&quot;noteIndex&quot;:0},&quot;isEdited&quot;:false,&quot;manualOverride&quot;:{&quot;isManuallyOverridden&quot;:false,&quot;citeprocText&quot;:&quot;[3]&quot;,&quot;manualOverrideText&quot;:&quot;&quot;},&quot;citationTag&quot;:&quot;MENDELEY_CITATION_v3_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&quot;,&quot;citationItems&quot;:[{&quot;id&quot;:&quot;c8fe192c-4200-321d-8565-c1bfad8d7212&quot;,&quot;itemData&quot;:{&quot;type&quot;:&quot;webpage&quot;,&quot;id&quot;:&quot;c8fe192c-4200-321d-8565-c1bfad8d7212&quot;,&quot;title&quot;:&quot;Session and app state in ASP.NET Core&quot;,&quot;author&quot;:[{&quot;family&quot;:&quot;Microsoft&quot;,&quot;given&quot;:&quot;&quot;,&quot;parse-names&quot;:false,&quot;dropping-particle&quot;:&quot;&quot;,&quot;non-dropping-particle&quot;:&quot;&quot;}],&quot;accessed&quot;:{&quot;date-parts&quot;:[[2026,7,15]]},&quot;URL&quot;:&quot;https://learn.microsoft.com/en-us/aspnet/core/fundamentals/app-state?view=aspnetcore-10.0&quot;,&quot;container-title-short&quot;:&quot;&quot;},&quot;isTemporary&quot;:false,&quot;suppress-author&quot;:false,&quot;composite&quot;:false,&quot;author-only&quot;:false}]},{&quot;citationID&quot;:&quot;MENDELEY_CITATION_bb0cb89d-82c6-4e01-bce6-f8adc5fed633&quot;,&quot;properties&quot;:{&quot;noteIndex&quot;:0},&quot;isEdited&quot;:false,&quot;manualOverride&quot;:{&quot;isManuallyOverridden&quot;:false,&quot;citeprocText&quot;:&quot;[3]&quot;,&quot;manualOverrideText&quot;:&quot;&quot;},&quot;citationTag&quot;:&quot;MENDELEY_CITATION_v3_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&quot;,&quot;citationItems&quot;:[{&quot;id&quot;:&quot;c8fe192c-4200-321d-8565-c1bfad8d7212&quot;,&quot;itemData&quot;:{&quot;type&quot;:&quot;webpage&quot;,&quot;id&quot;:&quot;c8fe192c-4200-321d-8565-c1bfad8d7212&quot;,&quot;title&quot;:&quot;Session and app state in ASP.NET Core&quot;,&quot;author&quot;:[{&quot;family&quot;:&quot;Microsoft&quot;,&quot;given&quot;:&quot;&quot;,&quot;parse-names&quot;:false,&quot;dropping-particle&quot;:&quot;&quot;,&quot;non-dropping-particle&quot;:&quot;&quot;}],&quot;accessed&quot;:{&quot;date-parts&quot;:[[2026,7,15]]},&quot;URL&quot;:&quot;https://learn.microsoft.com/en-us/aspnet/core/fundamentals/app-state?view=aspnetcore-10.0&quot;,&quot;container-title-short&quot;:&quot;&quot;},&quot;isTemporary&quot;:false,&quot;suppress-author&quot;:false,&quot;composite&quot;:false,&quot;author-only&quot;:false}]},{&quot;citationID&quot;:&quot;MENDELEY_CITATION_72ff4076-a3b9-4da3-ba08-6bb61c005f1f&quot;,&quot;properties&quot;:{&quot;noteIndex&quot;:0},&quot;isEdited&quot;:false,&quot;manualOverride&quot;:{&quot;isManuallyOverridden&quot;:false,&quot;citeprocText&quot;:&quot;[1]&quot;,&quot;manualOverrideText&quot;:&quot;&quot;},&quot;citationTag&quot;:&quot;MENDELEY_CITATION_v3_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&quot;,&quot;citationItems&quot;:[{&quot;id&quot;:&quot;5246948d-a9a1-3347-bd4f-626648939cac&quot;,&quot;itemData&quot;:{&quot;type&quot;:&quot;webpage&quot;,&quot;id&quot;:&quot;5246948d-a9a1-3347-bd4f-626648939cac&quot;,&quot;title&quot;:&quot;Jakarta Servlet&quot;,&quot;author&quot;:[{&quot;family&quot;:&quot;Eclipse Foundation&quot;,&quot;given&quot;:&quot;&quot;,&quot;parse-names&quot;:false,&quot;dropping-particle&quot;:&quot;&quot;,&quot;non-dropping-particle&quot;:&quot;&quot;}],&quot;accessed&quot;:{&quot;date-parts&quot;:[[2026,7,15]]},&quot;URL&quot;:&quot;https://jakarta.ee/learn/docs/jakartaee-tutorial/current/web/servlets/servlets.html&quot;,&quot;container-title-short&quot;:&quot;&quot;},&quot;isTemporary&quot;:false,&quot;suppress-author&quot;:false,&quot;composite&quot;:false,&quot;author-only&quot;:false}]},{&quot;citationID&quot;:&quot;MENDELEY_CITATION_f0836816-6ef3-4924-8f4f-094d8fb8c244&quot;,&quot;properties&quot;:{&quot;noteIndex&quot;:0},&quot;isEdited&quot;:false,&quot;manualOverride&quot;:{&quot;isManuallyOverridden&quot;:false,&quot;citeprocText&quot;:&quot;[2]&quot;,&quot;manualOverrideText&quot;:&quot;&quot;},&quot;citationTag&quot;:&quot;MENDELEY_CITATION_v3_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&quot;,&quot;citationItems&quot;:[{&quot;id&quot;:&quot;a61821f4-1e99-38a1-86f5-3afdba1da3a6&quot;,&quot;itemData&quot;:{&quot;type&quot;:&quot;webpage&quot;,&quot;id&quot;:&quot;a61821f4-1e99-38a1-86f5-3afdba1da3a6&quot;,&quot;title&quot;:&quot;Superglobals&quot;,&quot;author&quot;:[{&quot;family&quot;:&quot;The PHP Group&quot;,&quot;given&quot;:&quot;&quot;,&quot;parse-names&quot;:false,&quot;dropping-particle&quot;:&quot;&quot;,&quot;non-dropping-particle&quot;:&quot;&quot;}],&quot;accessed&quot;:{&quot;date-parts&quot;:[[2026,7,15]]},&quot;URL&quot;:&quot;https://www.php.net/manual/en/language.variables.superglobals.php&quot;,&quot;container-title-short&quot;:&quot;&quot;},&quot;isTemporary&quot;:false,&quot;suppress-author&quot;:false,&quot;composite&quot;:false,&quot;author-only&quot;:false}]},{&quot;citationID&quot;:&quot;MENDELEY_CITATION_8f8ae8bc-86d0-4c81-bb20-a7faf28f0183&quot;,&quot;properties&quot;:{&quot;noteIndex&quot;:0},&quot;isEdited&quot;:false,&quot;manualOverride&quot;:{&quot;isManuallyOverridden&quot;:false,&quot;citeprocText&quot;:&quot;[3]&quot;,&quot;manualOverrideText&quot;:&quot;&quot;},&quot;citationTag&quot;:&quot;MENDELEY_CITATION_v3_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&quot;,&quot;citationItems&quot;:[{&quot;id&quot;:&quot;c8fe192c-4200-321d-8565-c1bfad8d7212&quot;,&quot;itemData&quot;:{&quot;type&quot;:&quot;webpage&quot;,&quot;id&quot;:&quot;c8fe192c-4200-321d-8565-c1bfad8d7212&quot;,&quot;title&quot;:&quot;Session and app state in ASP.NET Core&quot;,&quot;author&quot;:[{&quot;family&quot;:&quot;Microsoft&quot;,&quot;given&quot;:&quot;&quot;,&quot;parse-names&quot;:false,&quot;dropping-particle&quot;:&quot;&quot;,&quot;non-dropping-particle&quot;:&quot;&quot;}],&quot;accessed&quot;:{&quot;date-parts&quot;:[[2026,7,15]]},&quot;URL&quot;:&quot;https://learn.microsoft.com/en-us/aspnet/core/fundamentals/app-state?view=aspnetcore-10.0&quot;,&quot;container-title-short&quot;:&quot;&quot;},&quot;isTemporary&quot;:false,&quot;suppress-author&quot;:false,&quot;composite&quot;:false,&quot;author-only&quot;:false}]},{&quot;citationID&quot;:&quot;MENDELEY_CITATION_4685483d-742a-45c0-ad4e-6b636e487447&quot;,&quot;properties&quot;:{&quot;noteIndex&quot;:0},&quot;isEdited&quot;:false,&quot;manualOverride&quot;:{&quot;isManuallyOverridden&quot;:false,&quot;citeprocText&quot;:&quot;[3]&quot;,&quot;manualOverrideText&quot;:&quot;&quot;},&quot;citationTag&quot;:&quot;MENDELEY_CITATION_v3_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&quot;,&quot;citationItems&quot;:[{&quot;id&quot;:&quot;c8fe192c-4200-321d-8565-c1bfad8d7212&quot;,&quot;itemData&quot;:{&quot;type&quot;:&quot;webpage&quot;,&quot;id&quot;:&quot;c8fe192c-4200-321d-8565-c1bfad8d7212&quot;,&quot;title&quot;:&quot;Session and app state in ASP.NET Core&quot;,&quot;author&quot;:[{&quot;family&quot;:&quot;Microsoft&quot;,&quot;given&quot;:&quot;&quot;,&quot;parse-names&quot;:false,&quot;dropping-particle&quot;:&quot;&quot;,&quot;non-dropping-particle&quot;:&quot;&quot;}],&quot;accessed&quot;:{&quot;date-parts&quot;:[[2026,7,15]]},&quot;URL&quot;:&quot;https://learn.microsoft.com/en-us/aspnet/core/fundamentals/app-state?view=aspnetcore-10.0&quot;,&quot;container-title-short&quot;:&quot;&quot;},&quot;isTemporary&quot;:false,&quot;suppress-author&quot;:false,&quot;composite&quot;:false,&quot;author-only&quot;:false}]},{&quot;citationID&quot;:&quot;MENDELEY_CITATION_2b1ded95-e485-4651-a2c3-d797da679752&quot;,&quot;properties&quot;:{&quot;noteIndex&quot;:0},&quot;isEdited&quot;:false,&quot;manualOverride&quot;:{&quot;isManuallyOverridden&quot;:false,&quot;citeprocText&quot;:&quot;[3]&quot;,&quot;manualOverrideText&quot;:&quot;&quot;},&quot;citationTag&quot;:&quot;MENDELEY_CITATION_v3_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&quot;,&quot;citationItems&quot;:[{&quot;id&quot;:&quot;c8fe192c-4200-321d-8565-c1bfad8d7212&quot;,&quot;itemData&quot;:{&quot;type&quot;:&quot;webpage&quot;,&quot;id&quot;:&quot;c8fe192c-4200-321d-8565-c1bfad8d7212&quot;,&quot;title&quot;:&quot;Session and app state in ASP.NET Core&quot;,&quot;author&quot;:[{&quot;family&quot;:&quot;Microsoft&quot;,&quot;given&quot;:&quot;&quot;,&quot;parse-names&quot;:false,&quot;dropping-particle&quot;:&quot;&quot;,&quot;non-dropping-particle&quot;:&quot;&quot;}],&quot;accessed&quot;:{&quot;date-parts&quot;:[[2026,7,15]]},&quot;URL&quot;:&quot;https://learn.microsoft.com/en-us/aspnet/core/fundamentals/app-state?view=aspnetcore-10.0&quot;,&quot;container-title-short&quot;:&quot;&quot;},&quot;isTemporary&quot;:false,&quot;suppress-author&quot;:false,&quot;composite&quot;:false,&quot;author-only&quot;:false}]},{&quot;citationID&quot;:&quot;MENDELEY_CITATION_6086a87d-27f2-4867-8024-31e37d2f36a1&quot;,&quot;properties&quot;:{&quot;noteIndex&quot;:0},&quot;isEdited&quot;:false,&quot;manualOverride&quot;:{&quot;isManuallyOverridden&quot;:false,&quot;citeprocText&quot;:&quot;[1]&quot;,&quot;manualOverrideText&quot;:&quot;&quot;},&quot;citationTag&quot;:&quot;MENDELEY_CITATION_v3_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&quot;,&quot;citationItems&quot;:[{&quot;id&quot;:&quot;5246948d-a9a1-3347-bd4f-626648939cac&quot;,&quot;itemData&quot;:{&quot;type&quot;:&quot;webpage&quot;,&quot;id&quot;:&quot;5246948d-a9a1-3347-bd4f-626648939cac&quot;,&quot;title&quot;:&quot;Jakarta Servlet&quot;,&quot;author&quot;:[{&quot;family&quot;:&quot;Eclipse Foundation&quot;,&quot;given&quot;:&quot;&quot;,&quot;parse-names&quot;:false,&quot;dropping-particle&quot;:&quot;&quot;,&quot;non-dropping-particle&quot;:&quot;&quot;}],&quot;accessed&quot;:{&quot;date-parts&quot;:[[2026,7,15]]},&quot;URL&quot;:&quot;https://jakarta.ee/learn/docs/jakartaee-tutorial/current/web/servlets/servlets.html&quot;,&quot;container-title-short&quot;:&quot;&quot;},&quot;isTemporary&quot;:false,&quot;suppress-author&quot;:false,&quot;composite&quot;:false,&quot;author-only&quot;:false}]},{&quot;citationID&quot;:&quot;MENDELEY_CITATION_feef250f-b3a6-4c1f-b1a8-953ba99155d0&quot;,&quot;properties&quot;:{&quot;noteIndex&quot;:0},&quot;isEdited&quot;:false,&quot;manualOverride&quot;:{&quot;isManuallyOverridden&quot;:false,&quot;citeprocText&quot;:&quot;[4]&quot;,&quot;manualOverrideText&quot;:&quot;&quot;},&quot;citationTag&quot;:&quot;MENDELEY_CITATION_v3_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&quot;,&quot;citationItems&quot;:[{&quot;id&quot;:&quot;2341f895-6a0f-36fb-91bf-1dae3f2d0cc3&quot;,&quot;itemData&quot;:{&quot;type&quot;:&quot;webpage&quot;,&quot;id&quot;:&quot;2341f895-6a0f-36fb-91bf-1dae3f2d0cc3&quot;,&quot;title&quot;:&quot;Lesson: JDBC Basics&quot;,&quot;author&quot;:[{&quot;family&quot;:&quot;Oracle&quot;,&quot;given&quot;:&quot;&quot;,&quot;parse-names&quot;:false,&quot;dropping-particle&quot;:&quot;&quot;,&quot;non-dropping-particle&quot;:&quot;&quot;}],&quot;accessed&quot;:{&quot;date-parts&quot;:[[2026,7,15]]},&quot;URL&quot;:&quot;https://docs.oracle.com/javase/tutorial/jdbc/basics/index.html&quot;,&quot;container-title-short&quot;:&quot;&quot;},&quot;isTemporary&quot;:false,&quot;suppress-author&quot;:false,&quot;composite&quot;:false,&quot;author-only&quot;:false}]},{&quot;citationID&quot;:&quot;MENDELEY_CITATION_0f0059fd-8685-4145-b6b9-d5c29cf15c58&quot;,&quot;properties&quot;:{&quot;noteIndex&quot;:0},&quot;isEdited&quot;:false,&quot;manualOverride&quot;:{&quot;isManuallyOverridden&quot;:false,&quot;citeprocText&quot;:&quot;[5]&quot;,&quot;manualOverrideText&quot;:&quot;&quot;},&quot;citationTag&quot;:&quot;MENDELEY_CITATION_v3_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&quot;,&quot;citationItems&quot;:[{&quot;id&quot;:&quot;0f8126e1-8960-3687-8d78-ff0c3ec6c458&quot;,&quot;itemData&quot;:{&quot;type&quot;:&quot;webpage&quot;,&quot;id&quot;:&quot;0f8126e1-8960-3687-8d78-ff0c3ec6c458&quot;,&quot;title&quot;:&quot;PDO&quot;,&quot;author&quot;:[{&quot;family&quot;:&quot;The PHP Group&quot;,&quot;given&quot;:&quot;&quot;,&quot;parse-names&quot;:false,&quot;dropping-particle&quot;:&quot;&quot;,&quot;non-dropping-particle&quot;:&quot;&quot;}],&quot;accessed&quot;:{&quot;date-parts&quot;:[[2026,7,15]]},&quot;URL&quot;:&quot;https://www.php.net/manual/en/book.pdo.php&quot;,&quot;container-title-short&quot;:&quot;&quot;},&quot;isTemporary&quot;:false,&quot;suppress-author&quot;:false,&quot;composite&quot;:false,&quot;author-only&quot;:false}]},{&quot;citationID&quot;:&quot;MENDELEY_CITATION_9a109af2-7bf3-4044-98b4-f5125a1ce03f&quot;,&quot;properties&quot;:{&quot;noteIndex&quot;:0},&quot;isEdited&quot;:false,&quot;manualOverride&quot;:{&quot;isManuallyOverridden&quot;:false,&quot;citeprocText&quot;:&quot;[4]&quot;,&quot;manualOverrideText&quot;:&quot;&quot;},&quot;citationTag&quot;:&quot;MENDELEY_CITATION_v3_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&quot;,&quot;citationItems&quot;:[{&quot;id&quot;:&quot;2341f895-6a0f-36fb-91bf-1dae3f2d0cc3&quot;,&quot;itemData&quot;:{&quot;type&quot;:&quot;webpage&quot;,&quot;id&quot;:&quot;2341f895-6a0f-36fb-91bf-1dae3f2d0cc3&quot;,&quot;title&quot;:&quot;Lesson: JDBC Basics&quot;,&quot;author&quot;:[{&quot;family&quot;:&quot;Oracle&quot;,&quot;given&quot;:&quot;&quot;,&quot;parse-names&quot;:false,&quot;dropping-particle&quot;:&quot;&quot;,&quot;non-dropping-particle&quot;:&quot;&quot;}],&quot;accessed&quot;:{&quot;date-parts&quot;:[[2026,7,15]]},&quot;URL&quot;:&quot;https://docs.oracle.com/javase/tutorial/jdbc/basics/index.html&quot;,&quot;container-title-short&quot;:&quot;&quot;},&quot;isTemporary&quot;:false,&quot;suppress-author&quot;:false,&quot;composite&quot;:false,&quot;author-only&quot;:false}]},{&quot;citationID&quot;:&quot;MENDELEY_CITATION_6078f0b4-a7f1-4be5-82eb-a86385206db0&quot;,&quot;properties&quot;:{&quot;noteIndex&quot;:0},&quot;isEdited&quot;:false,&quot;manualOverride&quot;:{&quot;isManuallyOverridden&quot;:false,&quot;citeprocText&quot;:&quot;[5]&quot;,&quot;manualOverrideText&quot;:&quot;&quot;},&quot;citationTag&quot;:&quot;MENDELEY_CITATION_v3_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&quot;,&quot;citationItems&quot;:[{&quot;id&quot;:&quot;0f8126e1-8960-3687-8d78-ff0c3ec6c458&quot;,&quot;itemData&quot;:{&quot;type&quot;:&quot;webpage&quot;,&quot;id&quot;:&quot;0f8126e1-8960-3687-8d78-ff0c3ec6c458&quot;,&quot;title&quot;:&quot;PDO&quot;,&quot;author&quot;:[{&quot;family&quot;:&quot;The PHP Group&quot;,&quot;given&quot;:&quot;&quot;,&quot;parse-names&quot;:false,&quot;dropping-particle&quot;:&quot;&quot;,&quot;non-dropping-particle&quot;:&quot;&quot;}],&quot;accessed&quot;:{&quot;date-parts&quot;:[[2026,7,15]]},&quot;URL&quot;:&quot;https://www.php.net/manual/en/book.pdo.php&quot;,&quot;container-title-short&quot;:&quot;&quot;},&quot;isTemporary&quot;:false,&quot;suppress-author&quot;:false,&quot;composite&quot;:false,&quot;author-only&quot;:false}]},{&quot;citationID&quot;:&quot;MENDELEY_CITATION_2e03e530-e8fd-4d20-a43e-f7a2cf563431&quot;,&quot;properties&quot;:{&quot;noteIndex&quot;:0},&quot;isEdited&quot;:false,&quot;manualOverride&quot;:{&quot;isManuallyOverridden&quot;:false,&quot;citeprocText&quot;:&quot;[6]&quot;,&quot;manualOverrideText&quot;:&quot;&quot;},&quot;citationTag&quot;:&quot;MENDELEY_CITATION_v3_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&quot;,&quot;citationItems&quot;:[{&quot;id&quot;:&quot;423bf9f3-29fb-399a-ac24-688086f07946&quot;,&quot;itemData&quot;:{&quot;type&quot;:&quot;webpage&quot;,&quot;id&quot;:&quot;423bf9f3-29fb-399a-ac24-688086f07946&quot;,&quot;title&quot;:&quot;CREATE PROCEDURE&quot;,&quot;author&quot;:[{&quot;family&quot;:&quot;PostgreSQL Global Development Group&quot;,&quot;given&quot;:&quot;&quot;,&quot;parse-names&quot;:false,&quot;dropping-particle&quot;:&quot;&quot;,&quot;non-dropping-particle&quot;:&quot;&quot;}],&quot;accessed&quot;:{&quot;date-parts&quot;:[[2026,7,15]]},&quot;URL&quot;:&quot;https://www.postgresql.org/docs/current/sql-createprocedure.html&quot;,&quot;container-title-short&quot;:&quot;&quot;},&quot;isTemporary&quot;:false,&quot;suppress-author&quot;:false,&quot;composite&quot;:false,&quot;author-only&quot;:false}]},{&quot;citationID&quot;:&quot;MENDELEY_CITATION_f9beb473-ffb6-42e4-9f68-b3721c1241b8&quot;,&quot;properties&quot;:{&quot;noteIndex&quot;:0},&quot;isEdited&quot;:false,&quot;manualOverride&quot;:{&quot;isManuallyOverridden&quot;:false,&quot;citeprocText&quot;:&quot;[7]&quot;,&quot;manualOverrideText&quot;:&quot;&quot;},&quot;citationTag&quot;:&quot;MENDELEY_CITATION_v3_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&quot;,&quot;citationItems&quot;:[{&quot;id&quot;:&quot;3bdb57c6-313e-3e0d-a285-86251bb00338&quot;,&quot;itemData&quot;:{&quot;type&quot;:&quot;webpage&quot;,&quot;id&quot;:&quot;3bdb57c6-313e-3e0d-a285-86251bb00338&quot;,&quot;title&quot;:&quot;Jakarta Persistence 3.0 Specification&quot;,&quot;author&quot;:[{&quot;family&quot;:&quot;Eclipse Foundation&quot;,&quot;given&quot;:&quot;&quot;,&quot;parse-names&quot;:false,&quot;dropping-particle&quot;:&quot;&quot;,&quot;non-dropping-particle&quot;:&quot;&quot;}],&quot;accessed&quot;:{&quot;date-parts&quot;:[[2026,7,15]]},&quot;URL&quot;:&quot;https://jakarta.ee/specifications/persistence/3.0/jakarta-persistence-spec-3.0.html&quot;,&quot;issued&quot;:{&quot;date-parts&quot;:[[2020]]},&quot;container-title-short&quot;:&quot;&quot;},&quot;isTemporary&quot;:false,&quot;suppress-author&quot;:false,&quot;composite&quot;:false,&quot;author-only&quot;:false}]},{&quot;citationID&quot;:&quot;MENDELEY_CITATION_477878e4-70f0-4483-a48e-db51aae0b3ae&quot;,&quot;properties&quot;:{&quot;noteIndex&quot;:0},&quot;isEdited&quot;:false,&quot;manualOverride&quot;:{&quot;isManuallyOverridden&quot;:false,&quot;citeprocText&quot;:&quot;[8]&quot;,&quot;manualOverrideText&quot;:&quot;&quot;},&quot;citationTag&quot;:&quot;MENDELEY_CITATION_v3_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&quot;,&quot;citationItems&quot;:[{&quot;id&quot;:&quot;1dc84731-1c16-333c-a9d0-7326625217a8&quot;,&quot;itemData&quot;:{&quot;type&quot;:&quot;webpage&quot;,&quot;id&quot;:&quot;1dc84731-1c16-333c-a9d0-7326625217a8&quot;,&quot;title&quot;:&quot;Guide to the Software Engineering Body of Knowledge (SWEBOK), versión 4.0&quot;,&quot;author&quot;:[{&quot;family&quot;:&quot;IEEE Computer Society&quot;,&quot;given&quot;:&quot;&quot;,&quot;parse-names&quot;:false,&quot;dropping-particle&quot;:&quot;&quot;,&quot;non-dropping-particle&quot;:&quot;&quot;}],&quot;accessed&quot;:{&quot;date-parts&quot;:[[2026,7,15]]},&quot;URL&quot;:&quot;https://ieeecs-media.computer.org/media/education/swebok/swebok-v4.pdf&quot;,&quot;issued&quot;:{&quot;date-parts&quot;:[[2024]]},&quot;container-title-short&quot;:&quot;&quot;},&quot;isTemporary&quot;:false,&quot;suppress-author&quot;:false,&quot;composite&quot;:false,&quot;author-only&quot;:false}]},{&quot;citationID&quot;:&quot;MENDELEY_CITATION_00356c08-f0c3-4cc6-b29f-cf3a19026be9&quot;,&quot;properties&quot;:{&quot;noteIndex&quot;:0},&quot;isEdited&quot;:false,&quot;manualOverride&quot;:{&quot;isManuallyOverridden&quot;:false,&quot;citeprocText&quot;:&quot;[8]&quot;,&quot;manualOverrideText&quot;:&quot;&quot;},&quot;citationTag&quot;:&quot;MENDELEY_CITATION_v3_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&quot;,&quot;citationItems&quot;:[{&quot;id&quot;:&quot;1dc84731-1c16-333c-a9d0-7326625217a8&quot;,&quot;itemData&quot;:{&quot;type&quot;:&quot;webpage&quot;,&quot;id&quot;:&quot;1dc84731-1c16-333c-a9d0-7326625217a8&quot;,&quot;title&quot;:&quot;Guide to the Software Engineering Body of Knowledge (SWEBOK), versión 4.0&quot;,&quot;author&quot;:[{&quot;family&quot;:&quot;IEEE Computer Society&quot;,&quot;given&quot;:&quot;&quot;,&quot;parse-names&quot;:false,&quot;dropping-particle&quot;:&quot;&quot;,&quot;non-dropping-particle&quot;:&quot;&quot;}],&quot;accessed&quot;:{&quot;date-parts&quot;:[[2026,7,15]]},&quot;URL&quot;:&quot;https://ieeecs-media.computer.org/media/education/swebok/swebok-v4.pdf&quot;,&quot;issued&quot;:{&quot;date-parts&quot;:[[2024]]},&quot;container-title-short&quot;:&quot;&quot;},&quot;isTemporary&quot;:false,&quot;suppress-author&quot;:false,&quot;composite&quot;:false,&quot;author-only&quot;:false}]},{&quot;citationID&quot;:&quot;MENDELEY_CITATION_2d3f6b7c-c3b8-4bac-a98e-5dad1ad11c4f&quot;,&quot;properties&quot;:{&quot;noteIndex&quot;:0},&quot;isEdited&quot;:false,&quot;manualOverride&quot;:{&quot;isManuallyOverridden&quot;:false,&quot;citeprocText&quot;:&quot;[9]&quot;,&quot;manualOverrideText&quot;:&quot;&quot;},&quot;citationTag&quot;:&quot;MENDELEY_CITATION_v3_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&quot;,&quot;citationItems&quot;:[{&quot;id&quot;:&quot;b5d5c9b6-734d-30de-86a9-bf8f4b4c0427&quot;,&quot;itemData&quot;:{&quot;type&quot;:&quot;report&quot;,&quot;id&quot;:&quot;b5d5c9b6-734d-30de-86a9-bf8f4b4c0427&quot;,&quot;title&quot;:&quot;An Introduction to Software Architecture&quot;,&quot;author&quot;:[{&quot;family&quot;:&quot;Garlan&quot;,&quot;given&quot;:&quot;David&quot;,&quot;parse-names&quot;:false,&quot;dropping-particle&quot;:&quot;&quot;,&quot;non-dropping-particle&quot;:&quot;&quot;},{&quot;family&quot;:&quot;Shaw&quot;,&quot;given&quot;:&quot;Mary&quot;,&quot;parse-names&quot;:false,&quot;dropping-particle&quot;:&quot;&quot;,&quot;non-dropping-particle&quot;:&quot;&quot;}],&quot;accessed&quot;:{&quot;date-parts&quot;:[[2026,7,15]]},&quot;URL&quot;:&quot;http://sunnyday.mit.edu/16.355/intro_softarch.pdf&quot;,&quot;issued&quot;:{&quot;date-parts&quot;:[[1994]]},&quot;container-title-short&quot;:&quot;&quot;},&quot;isTemporary&quot;:false,&quot;suppress-author&quot;:false,&quot;composite&quot;:false,&quot;author-only&quot;:false}]},{&quot;citationID&quot;:&quot;MENDELEY_CITATION_5e89cc3b-629f-463b-8948-81f1057b60ab&quot;,&quot;properties&quot;:{&quot;noteIndex&quot;:0},&quot;isEdited&quot;:false,&quot;manualOverride&quot;:{&quot;isManuallyOverridden&quot;:false,&quot;citeprocText&quot;:&quot;[9]&quot;,&quot;manualOverrideText&quot;:&quot;&quot;},&quot;citationTag&quot;:&quot;MENDELEY_CITATION_v3_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&quot;,&quot;citationItems&quot;:[{&quot;id&quot;:&quot;b5d5c9b6-734d-30de-86a9-bf8f4b4c0427&quot;,&quot;itemData&quot;:{&quot;type&quot;:&quot;report&quot;,&quot;id&quot;:&quot;b5d5c9b6-734d-30de-86a9-bf8f4b4c0427&quot;,&quot;title&quot;:&quot;An Introduction to Software Architecture&quot;,&quot;author&quot;:[{&quot;family&quot;:&quot;Garlan&quot;,&quot;given&quot;:&quot;David&quot;,&quot;parse-names&quot;:false,&quot;dropping-particle&quot;:&quot;&quot;,&quot;non-dropping-particle&quot;:&quot;&quot;},{&quot;family&quot;:&quot;Shaw&quot;,&quot;given&quot;:&quot;Mary&quot;,&quot;parse-names&quot;:false,&quot;dropping-particle&quot;:&quot;&quot;,&quot;non-dropping-particle&quot;:&quot;&quot;}],&quot;accessed&quot;:{&quot;date-parts&quot;:[[2026,7,15]]},&quot;URL&quot;:&quot;http://sunnyday.mit.edu/16.355/intro_softarch.pdf&quot;,&quot;issued&quot;:{&quot;date-parts&quot;:[[1994]]},&quot;container-title-short&quot;:&quot;&quot;},&quot;isTemporary&quot;:false,&quot;suppress-author&quot;:false,&quot;composite&quot;:false,&quot;author-only&quot;:false}]},{&quot;citationID&quot;:&quot;MENDELEY_CITATION_ca1e0d21-5dbf-43f0-9b88-f33a4d5dc003&quot;,&quot;properties&quot;:{&quot;noteIndex&quot;:0},&quot;isEdited&quot;:false,&quot;manualOverride&quot;:{&quot;isManuallyOverridden&quot;:false,&quot;citeprocText&quot;:&quot;[9]&quot;,&quot;manualOverrideText&quot;:&quot;&quot;},&quot;citationTag&quot;:&quot;MENDELEY_CITATION_v3_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&quot;,&quot;citationItems&quot;:[{&quot;id&quot;:&quot;b5d5c9b6-734d-30de-86a9-bf8f4b4c0427&quot;,&quot;itemData&quot;:{&quot;type&quot;:&quot;report&quot;,&quot;id&quot;:&quot;b5d5c9b6-734d-30de-86a9-bf8f4b4c0427&quot;,&quot;title&quot;:&quot;An Introduction to Software Architecture&quot;,&quot;author&quot;:[{&quot;family&quot;:&quot;Garlan&quot;,&quot;given&quot;:&quot;David&quot;,&quot;parse-names&quot;:false,&quot;dropping-particle&quot;:&quot;&quot;,&quot;non-dropping-particle&quot;:&quot;&quot;},{&quot;family&quot;:&quot;Shaw&quot;,&quot;given&quot;:&quot;Mary&quot;,&quot;parse-names&quot;:false,&quot;dropping-particle&quot;:&quot;&quot;,&quot;non-dropping-particle&quot;:&quot;&quot;}],&quot;accessed&quot;:{&quot;date-parts&quot;:[[2026,7,15]]},&quot;URL&quot;:&quot;http://sunnyday.mit.edu/16.355/intro_softarch.pdf&quot;,&quot;issued&quot;:{&quot;date-parts&quot;:[[1994]]},&quot;container-title-short&quot;:&quot;&quot;},&quot;isTemporary&quot;:false,&quot;suppress-author&quot;:false,&quot;composite&quot;:false,&quot;author-only&quot;:false}]},{&quot;citationID&quot;:&quot;MENDELEY_CITATION_8eac902e-950d-488a-88f4-09b609caaa80&quot;,&quot;properties&quot;:{&quot;noteIndex&quot;:0},&quot;isEdited&quot;:false,&quot;manualOverride&quot;:{&quot;isManuallyOverridden&quot;:false,&quot;citeprocText&quot;:&quot;[9]&quot;,&quot;manualOverrideText&quot;:&quot;&quot;},&quot;citationTag&quot;:&quot;MENDELEY_CITATION_v3_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&quot;,&quot;citationItems&quot;:[{&quot;id&quot;:&quot;b5d5c9b6-734d-30de-86a9-bf8f4b4c0427&quot;,&quot;itemData&quot;:{&quot;type&quot;:&quot;report&quot;,&quot;id&quot;:&quot;b5d5c9b6-734d-30de-86a9-bf8f4b4c0427&quot;,&quot;title&quot;:&quot;An Introduction to Software Architecture&quot;,&quot;author&quot;:[{&quot;family&quot;:&quot;Garlan&quot;,&quot;given&quot;:&quot;David&quot;,&quot;parse-names&quot;:false,&quot;dropping-particle&quot;:&quot;&quot;,&quot;non-dropping-particle&quot;:&quot;&quot;},{&quot;family&quot;:&quot;Shaw&quot;,&quot;given&quot;:&quot;Mary&quot;,&quot;parse-names&quot;:false,&quot;dropping-particle&quot;:&quot;&quot;,&quot;non-dropping-particle&quot;:&quot;&quot;}],&quot;accessed&quot;:{&quot;date-parts&quot;:[[2026,7,15]]},&quot;URL&quot;:&quot;http://sunnyday.mit.edu/16.355/intro_softarch.pdf&quot;,&quot;issued&quot;:{&quot;date-parts&quot;:[[1994]]},&quot;container-title-short&quot;:&quot;&quot;},&quot;isTemporary&quot;:false,&quot;suppress-author&quot;:false,&quot;composite&quot;:false,&quot;author-only&quot;:false}]},{&quot;citationID&quot;:&quot;MENDELEY_CITATION_c419aa87-246c-46f3-9f04-3c521ede062b&quot;,&quot;properties&quot;:{&quot;noteIndex&quot;:0},&quot;isEdited&quot;:false,&quot;manualOverride&quot;:{&quot;isManuallyOverridden&quot;:false,&quot;citeprocText&quot;:&quot;[10]&quot;,&quot;manualOverrideText&quot;:&quot;&quot;},&quot;citationTag&quot;:&quot;MENDELEY_CITATION_v3_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&quot;,&quot;citationItems&quot;:[{&quot;id&quot;:&quot;021b7429-b007-3e73-b270-5d7f64fecad0&quot;,&quot;itemData&quot;:{&quot;type&quot;:&quot;report&quot;,&quot;id&quot;:&quot;021b7429-b007-3e73-b270-5d7f64fecad0&quot;,&quot;title&quot;:&quot;Reference Model for Service Oriented Architecture 1.0&quot;,&quot;author&quot;:[{&quot;family&quot;:&quot;OASIS&quot;,&quot;given&quot;:&quot;&quot;,&quot;parse-names&quot;:false,&quot;dropping-particle&quot;:&quot;&quot;,&quot;non-dropping-particle&quot;:&quot;&quot;}],&quot;accessed&quot;:{&quot;date-parts&quot;:[[2026,7,15]]},&quot;URL&quot;:&quot;https://docs.oasis-open.org/soa-rm/v1.0/soa-rm.pdf&quot;,&quot;issued&quot;:{&quot;date-parts&quot;:[[2006]]},&quot;container-title-short&quot;:&quot;&quot;},&quot;isTemporary&quot;:false,&quot;suppress-author&quot;:false,&quot;composite&quot;:false,&quot;author-only&quot;:false}]},{&quot;citationID&quot;:&quot;MENDELEY_CITATION_99cedccc-4ece-4306-bd0e-83071b07a706&quot;,&quot;properties&quot;:{&quot;noteIndex&quot;:0},&quot;isEdited&quot;:false,&quot;manualOverride&quot;:{&quot;isManuallyOverridden&quot;:false,&quot;citeprocText&quot;:&quot;[10]&quot;,&quot;manualOverrideText&quot;:&quot;&quot;},&quot;citationTag&quot;:&quot;MENDELEY_CITATION_v3_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&quot;,&quot;citationItems&quot;:[{&quot;id&quot;:&quot;021b7429-b007-3e73-b270-5d7f64fecad0&quot;,&quot;itemData&quot;:{&quot;type&quot;:&quot;report&quot;,&quot;id&quot;:&quot;021b7429-b007-3e73-b270-5d7f64fecad0&quot;,&quot;title&quot;:&quot;Reference Model for Service Oriented Architecture 1.0&quot;,&quot;author&quot;:[{&quot;family&quot;:&quot;OASIS&quot;,&quot;given&quot;:&quot;&quot;,&quot;parse-names&quot;:false,&quot;dropping-particle&quot;:&quot;&quot;,&quot;non-dropping-particle&quot;:&quot;&quot;}],&quot;accessed&quot;:{&quot;date-parts&quot;:[[2026,7,15]]},&quot;URL&quot;:&quot;https://docs.oasis-open.org/soa-rm/v1.0/soa-rm.pdf&quot;,&quot;issued&quot;:{&quot;date-parts&quot;:[[2006]]},&quot;container-title-short&quot;:&quot;&quot;},&quot;isTemporary&quot;:false,&quot;suppress-author&quot;:false,&quot;composite&quot;:false,&quot;author-only&quot;:false}]},{&quot;citationID&quot;:&quot;MENDELEY_CITATION_e462d249-f04b-4129-9a2a-720051c4562a&quot;,&quot;properties&quot;:{&quot;noteIndex&quot;:0},&quot;isEdited&quot;:false,&quot;manualOverride&quot;:{&quot;isManuallyOverridden&quot;:false,&quot;citeprocText&quot;:&quot;[11]&quot;,&quot;manualOverrideText&quot;:&quot;&quot;},&quot;citationTag&quot;:&quot;MENDELEY_CITATION_v3_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&quot;,&quot;citationItems&quot;:[{&quot;id&quot;:&quot;18046565-f8ca-3742-8dc7-37930e69a7be&quot;,&quot;itemData&quot;:{&quot;type&quot;:&quot;webpage&quot;,&quot;id&quot;:&quot;18046565-f8ca-3742-8dc7-37930e69a7be&quot;,&quot;title&quot;:&quot;Microservices: a definition of this new architectural term&quot;,&quot;author&quot;:[{&quot;family&quot;:&quot;Fowler&quot;,&quot;given&quot;:&quot;Martin&quot;,&quot;parse-names&quot;:false,&quot;dropping-particle&quot;:&quot;&quot;,&quot;non-dropping-particle&quot;:&quot;&quot;}],&quot;accessed&quot;:{&quot;date-parts&quot;:[[2026,7,15]]},&quot;URL&quot;:&quot;https://martinfowler.com/articles/microservices.html&quot;,&quot;issued&quot;:{&quot;date-parts&quot;:[[2015]]},&quot;container-title-short&quot;:&quot;&quot;},&quot;isTemporary&quot;:false,&quot;suppress-author&quot;:false,&quot;composite&quot;:false,&quot;author-only&quot;:false}]}]"/>
+    <we:property name="MENDELEY_BIBLIOGRAPHY_LAST_MODIFIED" value="1784245222360"/>
+    <we:property name="MENDELEY_CITATIONS" value="[{&quot;citationID&quot;:&quot;MENDELEY_CITATION_cbaa5770-f04b-43bc-88b3-1745ece311b1&quot;,&quot;properties&quot;:{&quot;noteIndex&quot;:0},&quot;isEdited&quot;:false,&quot;manualOverride&quot;:{&quot;isManuallyOverridden&quot;:false,&quot;citeprocText&quot;:&quot;[1]&quot;,&quot;manualOverrideText&quot;:&quot;&quot;},&quot;citationTag&quot;:&quot;MENDELEY_CITATION_v3_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&quot;,&quot;citationItems&quot;:[{&quot;id&quot;:&quot;5246948d-a9a1-3347-bd4f-626648939cac&quot;,&quot;itemData&quot;:{&quot;type&quot;:&quot;webpage&quot;,&quot;id&quot;:&quot;5246948d-a9a1-3347-bd4f-626648939cac&quot;,&quot;title&quot;:&quot;Jakarta Servlet&quot;,&quot;author&quot;:[{&quot;family&quot;:&quot;Eclipse Foundation&quot;,&quot;given&quot;:&quot;&quot;,&quot;parse-names&quot;:false,&quot;dropping-particle&quot;:&quot;&quot;,&quot;non-dropping-particle&quot;:&quot;&quot;}],&quot;accessed&quot;:{&quot;date-parts&quot;:[[2026,7,15]]},&quot;URL&quot;:&quot;https://jakarta.ee/learn/docs/jakartaee-tutorial/current/web/servlets/servlets.html&quot;,&quot;container-title-short&quot;:&quot;&quot;},&quot;isTemporary&quot;:false,&quot;suppress-author&quot;:false,&quot;composite&quot;:false,&quot;author-only&quot;:false}]},{&quot;citationID&quot;:&quot;MENDELEY_CITATION_8adb0b72-409f-461e-8b00-d24574021135&quot;,&quot;properties&quot;:{&quot;noteIndex&quot;:0},&quot;isEdited&quot;:false,&quot;manualOverride&quot;:{&quot;isManuallyOverridden&quot;:false,&quot;citeprocText&quot;:&quot;[2]&quot;,&quot;manualOverrideText&quot;:&quot;&quot;},&quot;citationTag&quot;:&quot;MENDELEY_CITATION_v3_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&quot;,&quot;citationItems&quot;:[{&quot;id&quot;:&quot;a61821f4-1e99-38a1-86f5-3afdba1da3a6&quot;,&quot;itemData&quot;:{&quot;type&quot;:&quot;webpage&quot;,&quot;id&quot;:&quot;a61821f4-1e99-38a1-86f5-3afdba1da3a6&quot;,&quot;title&quot;:&quot;Superglobals&quot;,&quot;author&quot;:[{&quot;family&quot;:&quot;The PHP Group&quot;,&quot;given&quot;:&quot;&quot;,&quot;parse-names&quot;:false,&quot;dropping-particle&quot;:&quot;&quot;,&quot;non-dropping-particle&quot;:&quot;&quot;}],&quot;accessed&quot;:{&quot;date-parts&quot;:[[2026,7,15]]},&quot;URL&quot;:&quot;https://www.php.net/manual/en/language.variables.superglobals.php&quot;,&quot;container-title-short&quot;:&quot;&quot;},&quot;isTemporary&quot;:false,&quot;suppress-author&quot;:false,&quot;composite&quot;:false,&quot;author-only&quot;:false}]},{&quot;citationID&quot;:&quot;MENDELEY_CITATION_1e4da306-d171-44f0-8ccf-97b236f521d6&quot;,&quot;properties&quot;:{&quot;noteIndex&quot;:0},&quot;isEdited&quot;:false,&quot;manualOverride&quot;:{&quot;isManuallyOverridden&quot;:false,&quot;citeprocText&quot;:&quot;[1]&quot;,&quot;manualOverrideText&quot;:&quot;&quot;},&quot;citationTag&quot;:&quot;MENDELEY_CITATION_v3_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&quot;,&quot;citationItems&quot;:[{&quot;id&quot;:&quot;5246948d-a9a1-3347-bd4f-626648939cac&quot;,&quot;itemData&quot;:{&quot;type&quot;:&quot;webpage&quot;,&quot;id&quot;:&quot;5246948d-a9a1-3347-bd4f-626648939cac&quot;,&quot;title&quot;:&quot;Jakarta Servlet&quot;,&quot;author&quot;:[{&quot;family&quot;:&quot;Eclipse Foundation&quot;,&quot;given&quot;:&quot;&quot;,&quot;parse-names&quot;:false,&quot;dropping-particle&quot;:&quot;&quot;,&quot;non-dropping-particle&quot;:&quot;&quot;}],&quot;accessed&quot;:{&quot;date-parts&quot;:[[2026,7,15]]},&quot;URL&quot;:&quot;https://jakarta.ee/learn/docs/jakartaee-tutorial/current/web/servlets/servlets.html&quot;,&quot;container-title-short&quot;:&quot;&quot;},&quot;isTemporary&quot;:false,&quot;suppress-author&quot;:false,&quot;composite&quot;:false,&quot;author-only&quot;:false}]},{&quot;citationID&quot;:&quot;MENDELEY_CITATION_84be9df0-ec47-42fa-8e5e-a3ee77241e57&quot;,&quot;properties&quot;:{&quot;noteIndex&quot;:0},&quot;isEdited&quot;:false,&quot;manualOverride&quot;:{&quot;isManuallyOverridden&quot;:false,&quot;citeprocText&quot;:&quot;[3]&quot;,&quot;manualOverrideText&quot;:&quot;&quot;},&quot;citationTag&quot;:&quot;MENDELEY_CITATION_v3_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&quot;,&quot;citationItems&quot;:[{&quot;id&quot;:&quot;c8fe192c-4200-321d-8565-c1bfad8d7212&quot;,&quot;itemData&quot;:{&quot;type&quot;:&quot;webpage&quot;,&quot;id&quot;:&quot;c8fe192c-4200-321d-8565-c1bfad8d7212&quot;,&quot;title&quot;:&quot;Session and app state in ASP.NET Core&quot;,&quot;author&quot;:[{&quot;family&quot;:&quot;Microsoft&quot;,&quot;given&quot;:&quot;&quot;,&quot;parse-names&quot;:false,&quot;dropping-particle&quot;:&quot;&quot;,&quot;non-dropping-particle&quot;:&quot;&quot;}],&quot;accessed&quot;:{&quot;date-parts&quot;:[[2026,7,15]]},&quot;URL&quot;:&quot;https://learn.microsoft.com/en-us/aspnet/core/fundamentals/app-state?view=aspnetcore-10.0&quot;,&quot;container-title-short&quot;:&quot;&quot;},&quot;isTemporary&quot;:false,&quot;suppress-author&quot;:false,&quot;composite&quot;:false,&quot;author-only&quot;:false}]},{&quot;citationID&quot;:&quot;MENDELEY_CITATION_bb0cb89d-82c6-4e01-bce6-f8adc5fed633&quot;,&quot;properties&quot;:{&quot;noteIndex&quot;:0},&quot;isEdited&quot;:false,&quot;manualOverride&quot;:{&quot;isManuallyOverridden&quot;:false,&quot;citeprocText&quot;:&quot;[3]&quot;,&quot;manualOverrideText&quot;:&quot;&quot;},&quot;citationTag&quot;:&quot;MENDELEY_CITATION_v3_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&quot;,&quot;citationItems&quot;:[{&quot;id&quot;:&quot;c8fe192c-4200-321d-8565-c1bfad8d7212&quot;,&quot;itemData&quot;:{&quot;type&quot;:&quot;webpage&quot;,&quot;id&quot;:&quot;c8fe192c-4200-321d-8565-c1bfad8d7212&quot;,&quot;title&quot;:&quot;Session and app state in ASP.NET Core&quot;,&quot;author&quot;:[{&quot;family&quot;:&quot;Microsoft&quot;,&quot;given&quot;:&quot;&quot;,&quot;parse-names&quot;:false,&quot;dropping-particle&quot;:&quot;&quot;,&quot;non-dropping-particle&quot;:&quot;&quot;}],&quot;accessed&quot;:{&quot;date-parts&quot;:[[2026,7,15]]},&quot;URL&quot;:&quot;https://learn.microsoft.com/en-us/aspnet/core/fundamentals/app-state?view=aspnetcore-10.0&quot;,&quot;container-title-short&quot;:&quot;&quot;},&quot;isTemporary&quot;:false,&quot;suppress-author&quot;:false,&quot;composite&quot;:false,&quot;author-only&quot;:false}]},{&quot;citationID&quot;:&quot;MENDELEY_CITATION_72ff4076-a3b9-4da3-ba08-6bb61c005f1f&quot;,&quot;properties&quot;:{&quot;noteIndex&quot;:0},&quot;isEdited&quot;:false,&quot;manualOverride&quot;:{&quot;isManuallyOverridden&quot;:false,&quot;citeprocText&quot;:&quot;[1]&quot;,&quot;manualOverrideText&quot;:&quot;&quot;},&quot;citationTag&quot;:&quot;MENDELEY_CITATION_v3_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&quot;,&quot;citationItems&quot;:[{&quot;id&quot;:&quot;5246948d-a9a1-3347-bd4f-626648939cac&quot;,&quot;itemData&quot;:{&quot;type&quot;:&quot;webpage&quot;,&quot;id&quot;:&quot;5246948d-a9a1-3347-bd4f-626648939cac&quot;,&quot;title&quot;:&quot;Jakarta Servlet&quot;,&quot;author&quot;:[{&quot;family&quot;:&quot;Eclipse Foundation&quot;,&quot;given&quot;:&quot;&quot;,&quot;parse-names&quot;:false,&quot;dropping-particle&quot;:&quot;&quot;,&quot;non-dropping-particle&quot;:&quot;&quot;}],&quot;accessed&quot;:{&quot;date-parts&quot;:[[2026,7,15]]},&quot;URL&quot;:&quot;https://jakarta.ee/learn/docs/jakartaee-tutorial/current/web/servlets/servlets.html&quot;,&quot;container-title-short&quot;:&quot;&quot;},&quot;isTemporary&quot;:false,&quot;suppress-author&quot;:false,&quot;composite&quot;:false,&quot;author-only&quot;:false}]},{&quot;citationID&quot;:&quot;MENDELEY_CITATION_f0836816-6ef3-4924-8f4f-094d8fb8c244&quot;,&quot;properties&quot;:{&quot;noteIndex&quot;:0},&quot;isEdited&quot;:false,&quot;manualOverride&quot;:{&quot;isManuallyOverridden&quot;:false,&quot;citeprocText&quot;:&quot;[2]&quot;,&quot;manualOverrideText&quot;:&quot;&quot;},&quot;citationTag&quot;:&quot;MENDELEY_CITATION_v3_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&quot;,&quot;citationItems&quot;:[{&quot;id&quot;:&quot;a61821f4-1e99-38a1-86f5-3afdba1da3a6&quot;,&quot;itemData&quot;:{&quot;type&quot;:&quot;webpage&quot;,&quot;id&quot;:&quot;a61821f4-1e99-38a1-86f5-3afdba1da3a6&quot;,&quot;title&quot;:&quot;Superglobals&quot;,&quot;author&quot;:[{&quot;family&quot;:&quot;The PHP Group&quot;,&quot;given&quot;:&quot;&quot;,&quot;parse-names&quot;:false,&quot;dropping-particle&quot;:&quot;&quot;,&quot;non-dropping-particle&quot;:&quot;&quot;}],&quot;accessed&quot;:{&quot;date-parts&quot;:[[2026,7,15]]},&quot;URL&quot;:&quot;https://www.php.net/manual/en/language.variables.superglobals.php&quot;,&quot;container-title-short&quot;:&quot;&quot;},&quot;isTemporary&quot;:false,&quot;suppress-author&quot;:false,&quot;composite&quot;:false,&quot;author-only&quot;:false}]},{&quot;citationID&quot;:&quot;MENDELEY_CITATION_8f8ae8bc-86d0-4c81-bb20-a7faf28f0183&quot;,&quot;properties&quot;:{&quot;noteIndex&quot;:0},&quot;isEdited&quot;:false,&quot;manualOverride&quot;:{&quot;isManuallyOverridden&quot;:false,&quot;citeprocText&quot;:&quot;[3]&quot;,&quot;manualOverrideText&quot;:&quot;&quot;},&quot;citationTag&quot;:&quot;MENDELEY_CITATION_v3_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&quot;,&quot;citationItems&quot;:[{&quot;id&quot;:&quot;c8fe192c-4200-321d-8565-c1bfad8d7212&quot;,&quot;itemData&quot;:{&quot;type&quot;:&quot;webpage&quot;,&quot;id&quot;:&quot;c8fe192c-4200-321d-8565-c1bfad8d7212&quot;,&quot;title&quot;:&quot;Session and app state in ASP.NET Core&quot;,&quot;author&quot;:[{&quot;family&quot;:&quot;Microsoft&quot;,&quot;given&quot;:&quot;&quot;,&quot;parse-names&quot;:false,&quot;dropping-particle&quot;:&quot;&quot;,&quot;non-dropping-particle&quot;:&quot;&quot;}],&quot;accessed&quot;:{&quot;date-parts&quot;:[[2026,7,15]]},&quot;URL&quot;:&quot;https://learn.microsoft.com/en-us/aspnet/core/fundamentals/app-state?view=aspnetcore-10.0&quot;,&quot;container-title-short&quot;:&quot;&quot;},&quot;isTemporary&quot;:false,&quot;suppress-author&quot;:false,&quot;composite&quot;:false,&quot;author-only&quot;:false}]},{&quot;citationID&quot;:&quot;MENDELEY_CITATION_4685483d-742a-45c0-ad4e-6b636e487447&quot;,&quot;properties&quot;:{&quot;noteIndex&quot;:0},&quot;isEdited&quot;:false,&quot;manualOverride&quot;:{&quot;isManuallyOverridden&quot;:false,&quot;citeprocText&quot;:&quot;[3]&quot;,&quot;manualOverrideText&quot;:&quot;&quot;},&quot;citationTag&quot;:&quot;MENDELEY_CITATION_v3_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&quot;,&quot;citationItems&quot;:[{&quot;id&quot;:&quot;c8fe192c-4200-321d-8565-c1bfad8d7212&quot;,&quot;itemData&quot;:{&quot;type&quot;:&quot;webpage&quot;,&quot;id&quot;:&quot;c8fe192c-4200-321d-8565-c1bfad8d7212&quot;,&quot;title&quot;:&quot;Session and app state in ASP.NET Core&quot;,&quot;author&quot;:[{&quot;family&quot;:&quot;Microsoft&quot;,&quot;given&quot;:&quot;&quot;,&quot;parse-names&quot;:false,&quot;dropping-particle&quot;:&quot;&quot;,&quot;non-dropping-particle&quot;:&quot;&quot;}],&quot;accessed&quot;:{&quot;date-parts&quot;:[[2026,7,15]]},&quot;URL&quot;:&quot;https://learn.microsoft.com/en-us/aspnet/core/fundamentals/app-state?view=aspnetcore-10.0&quot;,&quot;container-title-short&quot;:&quot;&quot;},&quot;isTemporary&quot;:false,&quot;suppress-author&quot;:false,&quot;composite&quot;:false,&quot;author-only&quot;:false}]},{&quot;citationID&quot;:&quot;MENDELEY_CITATION_2b1ded95-e485-4651-a2c3-d797da679752&quot;,&quot;properties&quot;:{&quot;noteIndex&quot;:0},&quot;isEdited&quot;:false,&quot;manualOverride&quot;:{&quot;isManuallyOverridden&quot;:false,&quot;citeprocText&quot;:&quot;[3]&quot;,&quot;manualOverrideText&quot;:&quot;&quot;},&quot;citationTag&quot;:&quot;MENDELEY_CITATION_v3_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&quot;,&quot;citationItems&quot;:[{&quot;id&quot;:&quot;c8fe192c-4200-321d-8565-c1bfad8d7212&quot;,&quot;itemData&quot;:{&quot;type&quot;:&quot;webpage&quot;,&quot;id&quot;:&quot;c8fe192c-4200-321d-8565-c1bfad8d7212&quot;,&quot;title&quot;:&quot;Session and app state in ASP.NET Core&quot;,&quot;author&quot;:[{&quot;family&quot;:&quot;Microsoft&quot;,&quot;given&quot;:&quot;&quot;,&quot;parse-names&quot;:false,&quot;dropping-particle&quot;:&quot;&quot;,&quot;non-dropping-particle&quot;:&quot;&quot;}],&quot;accessed&quot;:{&quot;date-parts&quot;:[[2026,7,15]]},&quot;URL&quot;:&quot;https://learn.microsoft.com/en-us/aspnet/core/fundamentals/app-state?view=aspnetcore-10.0&quot;,&quot;container-title-short&quot;:&quot;&quot;},&quot;isTemporary&quot;:false,&quot;suppress-author&quot;:false,&quot;composite&quot;:false,&quot;author-only&quot;:false}]},{&quot;citationID&quot;:&quot;MENDELEY_CITATION_6086a87d-27f2-4867-8024-31e37d2f36a1&quot;,&quot;properties&quot;:{&quot;noteIndex&quot;:0},&quot;isEdited&quot;:false,&quot;manualOverride&quot;:{&quot;isManuallyOverridden&quot;:false,&quot;citeprocText&quot;:&quot;[1]&quot;,&quot;manualOverrideText&quot;:&quot;&quot;},&quot;citationTag&quot;:&quot;MENDELEY_CITATION_v3_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&quot;,&quot;citationItems&quot;:[{&quot;id&quot;:&quot;5246948d-a9a1-3347-bd4f-626648939cac&quot;,&quot;itemData&quot;:{&quot;type&quot;:&quot;webpage&quot;,&quot;id&quot;:&quot;5246948d-a9a1-3347-bd4f-626648939cac&quot;,&quot;title&quot;:&quot;Jakarta Servlet&quot;,&quot;author&quot;:[{&quot;family&quot;:&quot;Eclipse Foundation&quot;,&quot;given&quot;:&quot;&quot;,&quot;parse-names&quot;:false,&quot;dropping-particle&quot;:&quot;&quot;,&quot;non-dropping-particle&quot;:&quot;&quot;}],&quot;accessed&quot;:{&quot;date-parts&quot;:[[2026,7,15]]},&quot;URL&quot;:&quot;https://jakarta.ee/learn/docs/jakartaee-tutorial/current/web/servlets/servlets.html&quot;,&quot;container-title-short&quot;:&quot;&quot;},&quot;isTemporary&quot;:false,&quot;suppress-author&quot;:false,&quot;composite&quot;:false,&quot;author-only&quot;:false}]},{&quot;citationID&quot;:&quot;MENDELEY_CITATION_feef250f-b3a6-4c1f-b1a8-953ba99155d0&quot;,&quot;properties&quot;:{&quot;noteIndex&quot;:0},&quot;isEdited&quot;:false,&quot;manualOverride&quot;:{&quot;isManuallyOverridden&quot;:false,&quot;citeprocText&quot;:&quot;[4]&quot;,&quot;manualOverrideText&quot;:&quot;&quot;},&quot;citationTag&quot;:&quot;MENDELEY_CITATION_v3_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&quot;,&quot;citationItems&quot;:[{&quot;id&quot;:&quot;2341f895-6a0f-36fb-91bf-1dae3f2d0cc3&quot;,&quot;itemData&quot;:{&quot;type&quot;:&quot;webpage&quot;,&quot;id&quot;:&quot;2341f895-6a0f-36fb-91bf-1dae3f2d0cc3&quot;,&quot;title&quot;:&quot;Lesson: JDBC Basics&quot;,&quot;author&quot;:[{&quot;family&quot;:&quot;Oracle&quot;,&quot;given&quot;:&quot;&quot;,&quot;parse-names&quot;:false,&quot;dropping-particle&quot;:&quot;&quot;,&quot;non-dropping-particle&quot;:&quot;&quot;}],&quot;accessed&quot;:{&quot;date-parts&quot;:[[2026,7,15]]},&quot;URL&quot;:&quot;https://docs.oracle.com/javase/tutorial/jdbc/basics/index.html&quot;,&quot;container-title-short&quot;:&quot;&quot;},&quot;isTemporary&quot;:false,&quot;suppress-author&quot;:false,&quot;composite&quot;:false,&quot;author-only&quot;:false}]},{&quot;citationID&quot;:&quot;MENDELEY_CITATION_0f0059fd-8685-4145-b6b9-d5c29cf15c58&quot;,&quot;properties&quot;:{&quot;noteIndex&quot;:0},&quot;isEdited&quot;:false,&quot;manualOverride&quot;:{&quot;isManuallyOverridden&quot;:false,&quot;citeprocText&quot;:&quot;[5]&quot;,&quot;manualOverrideText&quot;:&quot;&quot;},&quot;citationTag&quot;:&quot;MENDELEY_CITATION_v3_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&quot;,&quot;citationItems&quot;:[{&quot;id&quot;:&quot;0f8126e1-8960-3687-8d78-ff0c3ec6c458&quot;,&quot;itemData&quot;:{&quot;type&quot;:&quot;webpage&quot;,&quot;id&quot;:&quot;0f8126e1-8960-3687-8d78-ff0c3ec6c458&quot;,&quot;title&quot;:&quot;PDO&quot;,&quot;author&quot;:[{&quot;family&quot;:&quot;The PHP Group&quot;,&quot;given&quot;:&quot;&quot;,&quot;parse-names&quot;:false,&quot;dropping-particle&quot;:&quot;&quot;,&quot;non-dropping-particle&quot;:&quot;&quot;}],&quot;accessed&quot;:{&quot;date-parts&quot;:[[2026,7,15]]},&quot;URL&quot;:&quot;https://www.php.net/manual/en/book.pdo.php&quot;,&quot;container-title-short&quot;:&quot;&quot;},&quot;isTemporary&quot;:false,&quot;suppress-author&quot;:false,&quot;composite&quot;:false,&quot;author-only&quot;:false}]},{&quot;citationID&quot;:&quot;MENDELEY_CITATION_9a109af2-7bf3-4044-98b4-f5125a1ce03f&quot;,&quot;properties&quot;:{&quot;noteIndex&quot;:0},&quot;isEdited&quot;:false,&quot;manualOverride&quot;:{&quot;isManuallyOverridden&quot;:false,&quot;citeprocText&quot;:&quot;[4]&quot;,&quot;manualOverrideText&quot;:&quot;&quot;},&quot;citationTag&quot;:&quot;MENDELEY_CITATION_v3_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&quot;,&quot;citationItems&quot;:[{&quot;id&quot;:&quot;2341f895-6a0f-36fb-91bf-1dae3f2d0cc3&quot;,&quot;itemData&quot;:{&quot;type&quot;:&quot;webpage&quot;,&quot;id&quot;:&quot;2341f895-6a0f-36fb-91bf-1dae3f2d0cc3&quot;,&quot;title&quot;:&quot;Lesson: JDBC Basics&quot;,&quot;author&quot;:[{&quot;family&quot;:&quot;Oracle&quot;,&quot;given&quot;:&quot;&quot;,&quot;parse-names&quot;:false,&quot;dropping-particle&quot;:&quot;&quot;,&quot;non-dropping-particle&quot;:&quot;&quot;}],&quot;accessed&quot;:{&quot;date-parts&quot;:[[2026,7,15]]},&quot;URL&quot;:&quot;https://docs.oracle.com/javase/tutorial/jdbc/basics/index.html&quot;,&quot;container-title-short&quot;:&quot;&quot;},&quot;isTemporary&quot;:false,&quot;suppress-author&quot;:false,&quot;composite&quot;:false,&quot;author-only&quot;:false}]},{&quot;citationID&quot;:&quot;MENDELEY_CITATION_6078f0b4-a7f1-4be5-82eb-a86385206db0&quot;,&quot;properties&quot;:{&quot;noteIndex&quot;:0},&quot;isEdited&quot;:false,&quot;manualOverride&quot;:{&quot;isManuallyOverridden&quot;:false,&quot;citeprocText&quot;:&quot;[5]&quot;,&quot;manualOverrideText&quot;:&quot;&quot;},&quot;citationTag&quot;:&quot;MENDELEY_CITATION_v3_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&quot;,&quot;citationItems&quot;:[{&quot;id&quot;:&quot;0f8126e1-8960-3687-8d78-ff0c3ec6c458&quot;,&quot;itemData&quot;:{&quot;type&quot;:&quot;webpage&quot;,&quot;id&quot;:&quot;0f8126e1-8960-3687-8d78-ff0c3ec6c458&quot;,&quot;title&quot;:&quot;PDO&quot;,&quot;author&quot;:[{&quot;family&quot;:&quot;The PHP Group&quot;,&quot;given&quot;:&quot;&quot;,&quot;parse-names&quot;:false,&quot;dropping-particle&quot;:&quot;&quot;,&quot;non-dropping-particle&quot;:&quot;&quot;}],&quot;accessed&quot;:{&quot;date-parts&quot;:[[2026,7,15]]},&quot;URL&quot;:&quot;https://www.php.net/manual/en/book.pdo.php&quot;,&quot;container-title-short&quot;:&quot;&quot;},&quot;isTemporary&quot;:false,&quot;suppress-author&quot;:false,&quot;composite&quot;:false,&quot;author-only&quot;:false}]},{&quot;citationID&quot;:&quot;MENDELEY_CITATION_2e03e530-e8fd-4d20-a43e-f7a2cf563431&quot;,&quot;properties&quot;:{&quot;noteIndex&quot;:0},&quot;isEdited&quot;:false,&quot;manualOverride&quot;:{&quot;isManuallyOverridden&quot;:false,&quot;citeprocText&quot;:&quot;[6]&quot;,&quot;manualOverrideText&quot;:&quot;&quot;},&quot;citationTag&quot;:&quot;MENDELEY_CITATION_v3_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&quot;,&quot;citationItems&quot;:[{&quot;id&quot;:&quot;423bf9f3-29fb-399a-ac24-688086f07946&quot;,&quot;itemData&quot;:{&quot;type&quot;:&quot;webpage&quot;,&quot;id&quot;:&quot;423bf9f3-29fb-399a-ac24-688086f07946&quot;,&quot;title&quot;:&quot;CREATE PROCEDURE&quot;,&quot;author&quot;:[{&quot;family&quot;:&quot;PostgreSQL Global Development Group&quot;,&quot;given&quot;:&quot;&quot;,&quot;parse-names&quot;:false,&quot;dropping-particle&quot;:&quot;&quot;,&quot;non-dropping-particle&quot;:&quot;&quot;}],&quot;accessed&quot;:{&quot;date-parts&quot;:[[2026,7,15]]},&quot;URL&quot;:&quot;https://www.postgresql.org/docs/current/sql-createprocedure.html&quot;,&quot;container-title-short&quot;:&quot;&quot;},&quot;isTemporary&quot;:false,&quot;suppress-author&quot;:false,&quot;composite&quot;:false,&quot;author-only&quot;:false}]},{&quot;citationID&quot;:&quot;MENDELEY_CITATION_f9beb473-ffb6-42e4-9f68-b3721c1241b8&quot;,&quot;properties&quot;:{&quot;noteIndex&quot;:0},&quot;isEdited&quot;:false,&quot;manualOverride&quot;:{&quot;isManuallyOverridden&quot;:false,&quot;citeprocText&quot;:&quot;[7]&quot;,&quot;manualOverrideText&quot;:&quot;&quot;},&quot;citationTag&quot;:&quot;MENDELEY_CITATION_v3_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&quot;,&quot;citationItems&quot;:[{&quot;id&quot;:&quot;3bdb57c6-313e-3e0d-a285-86251bb00338&quot;,&quot;itemData&quot;:{&quot;type&quot;:&quot;webpage&quot;,&quot;id&quot;:&quot;3bdb57c6-313e-3e0d-a285-86251bb00338&quot;,&quot;title&quot;:&quot;Jakarta Persistence 3.0 Specification&quot;,&quot;author&quot;:[{&quot;family&quot;:&quot;Eclipse Foundation&quot;,&quot;given&quot;:&quot;&quot;,&quot;parse-names&quot;:false,&quot;dropping-particle&quot;:&quot;&quot;,&quot;non-dropping-particle&quot;:&quot;&quot;}],&quot;accessed&quot;:{&quot;date-parts&quot;:[[2026,7,15]]},&quot;URL&quot;:&quot;https://jakarta.ee/specifications/persistence/3.0/jakarta-persistence-spec-3.0.html&quot;,&quot;issued&quot;:{&quot;date-parts&quot;:[[2020]]},&quot;container-title-short&quot;:&quot;&quot;},&quot;isTemporary&quot;:false,&quot;suppress-author&quot;:false,&quot;composite&quot;:false,&quot;author-only&quot;:false}]},{&quot;citationID&quot;:&quot;MENDELEY_CITATION_477878e4-70f0-4483-a48e-db51aae0b3ae&quot;,&quot;properties&quot;:{&quot;noteIndex&quot;:0},&quot;isEdited&quot;:false,&quot;manualOverride&quot;:{&quot;isManuallyOverridden&quot;:false,&quot;citeprocText&quot;:&quot;[8]&quot;,&quot;manualOverrideText&quot;:&quot;&quot;},&quot;citationTag&quot;:&quot;MENDELEY_CITATION_v3_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&quot;,&quot;citationItems&quot;:[{&quot;id&quot;:&quot;1dc84731-1c16-333c-a9d0-7326625217a8&quot;,&quot;itemData&quot;:{&quot;type&quot;:&quot;webpage&quot;,&quot;id&quot;:&quot;1dc84731-1c16-333c-a9d0-7326625217a8&quot;,&quot;title&quot;:&quot;Guide to the Software Engineering Body of Knowledge (SWEBOK), versión 4.0&quot;,&quot;author&quot;:[{&quot;family&quot;:&quot;IEEE Computer Society&quot;,&quot;given&quot;:&quot;&quot;,&quot;parse-names&quot;:false,&quot;dropping-particle&quot;:&quot;&quot;,&quot;non-dropping-particle&quot;:&quot;&quot;}],&quot;accessed&quot;:{&quot;date-parts&quot;:[[2026,7,15]]},&quot;URL&quot;:&quot;https://ieeecs-media.computer.org/media/education/swebok/swebok-v4.pdf&quot;,&quot;issued&quot;:{&quot;date-parts&quot;:[[2024]]},&quot;container-title-short&quot;:&quot;&quot;},&quot;isTemporary&quot;:false,&quot;suppress-author&quot;:false,&quot;composite&quot;:false,&quot;author-only&quot;:false}]},{&quot;citationID&quot;:&quot;MENDELEY_CITATION_00356c08-f0c3-4cc6-b29f-cf3a19026be9&quot;,&quot;properties&quot;:{&quot;noteIndex&quot;:0},&quot;isEdited&quot;:false,&quot;manualOverride&quot;:{&quot;isManuallyOverridden&quot;:false,&quot;citeprocText&quot;:&quot;[8]&quot;,&quot;manualOverrideText&quot;:&quot;&quot;},&quot;citationTag&quot;:&quot;MENDELEY_CITATION_v3_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&quot;,&quot;citationItems&quot;:[{&quot;id&quot;:&quot;1dc84731-1c16-333c-a9d0-7326625217a8&quot;,&quot;itemData&quot;:{&quot;type&quot;:&quot;webpage&quot;,&quot;id&quot;:&quot;1dc84731-1c16-333c-a9d0-7326625217a8&quot;,&quot;title&quot;:&quot;Guide to the Software Engineering Body of Knowledge (SWEBOK), versión 4.0&quot;,&quot;author&quot;:[{&quot;family&quot;:&quot;IEEE Computer Society&quot;,&quot;given&quot;:&quot;&quot;,&quot;parse-names&quot;:false,&quot;dropping-particle&quot;:&quot;&quot;,&quot;non-dropping-particle&quot;:&quot;&quot;}],&quot;accessed&quot;:{&quot;date-parts&quot;:[[2026,7,15]]},&quot;URL&quot;:&quot;https://ieeecs-media.computer.org/media/education/swebok/swebok-v4.pdf&quot;,&quot;issued&quot;:{&quot;date-parts&quot;:[[2024]]},&quot;container-title-short&quot;:&quot;&quot;},&quot;isTemporary&quot;:false,&quot;suppress-author&quot;:false,&quot;composite&quot;:false,&quot;author-only&quot;:false}]},{&quot;citationID&quot;:&quot;MENDELEY_CITATION_2d3f6b7c-c3b8-4bac-a98e-5dad1ad11c4f&quot;,&quot;properties&quot;:{&quot;noteIndex&quot;:0},&quot;isEdited&quot;:false,&quot;manualOverride&quot;:{&quot;isManuallyOverridden&quot;:false,&quot;citeprocText&quot;:&quot;[9]&quot;,&quot;manualOverrideText&quot;:&quot;&quot;},&quot;citationTag&quot;:&quot;MENDELEY_CITATION_v3_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&quot;,&quot;citationItems&quot;:[{&quot;id&quot;:&quot;b5d5c9b6-734d-30de-86a9-bf8f4b4c0427&quot;,&quot;itemData&quot;:{&quot;type&quot;:&quot;report&quot;,&quot;id&quot;:&quot;b5d5c9b6-734d-30de-86a9-bf8f4b4c0427&quot;,&quot;title&quot;:&quot;An Introduction to Software Architecture&quot;,&quot;author&quot;:[{&quot;family&quot;:&quot;Garlan&quot;,&quot;given&quot;:&quot;David&quot;,&quot;parse-names&quot;:false,&quot;dropping-particle&quot;:&quot;&quot;,&quot;non-dropping-particle&quot;:&quot;&quot;},{&quot;family&quot;:&quot;Shaw&quot;,&quot;given&quot;:&quot;Mary&quot;,&quot;parse-names&quot;:false,&quot;dropping-particle&quot;:&quot;&quot;,&quot;non-dropping-particle&quot;:&quot;&quot;}],&quot;accessed&quot;:{&quot;date-parts&quot;:[[2026,7,15]]},&quot;URL&quot;:&quot;http://sunnyday.mit.edu/16.355/intro_softarch.pdf&quot;,&quot;issued&quot;:{&quot;date-parts&quot;:[[1994]]},&quot;container-title-short&quot;:&quot;&quot;},&quot;isTemporary&quot;:false,&quot;suppress-author&quot;:false,&quot;composite&quot;:false,&quot;author-only&quot;:false}]},{&quot;citationID&quot;:&quot;MENDELEY_CITATION_5e89cc3b-629f-463b-8948-81f1057b60ab&quot;,&quot;properties&quot;:{&quot;noteIndex&quot;:0},&quot;isEdited&quot;:false,&quot;manualOverride&quot;:{&quot;isManuallyOverridden&quot;:false,&quot;citeprocText&quot;:&quot;[9]&quot;,&quot;manualOverrideText&quot;:&quot;&quot;},&quot;citationTag&quot;:&quot;MENDELEY_CITATION_v3_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&quot;,&quot;citationItems&quot;:[{&quot;id&quot;:&quot;b5d5c9b6-734d-30de-86a9-bf8f4b4c0427&quot;,&quot;itemData&quot;:{&quot;type&quot;:&quot;report&quot;,&quot;id&quot;:&quot;b5d5c9b6-734d-30de-86a9-bf8f4b4c0427&quot;,&quot;title&quot;:&quot;An Introduction to Software Architecture&quot;,&quot;author&quot;:[{&quot;family&quot;:&quot;Garlan&quot;,&quot;given&quot;:&quot;David&quot;,&quot;parse-names&quot;:false,&quot;dropping-particle&quot;:&quot;&quot;,&quot;non-dropping-particle&quot;:&quot;&quot;},{&quot;family&quot;:&quot;Shaw&quot;,&quot;given&quot;:&quot;Mary&quot;,&quot;parse-names&quot;:false,&quot;dropping-particle&quot;:&quot;&quot;,&quot;non-dropping-particle&quot;:&quot;&quot;}],&quot;accessed&quot;:{&quot;date-parts&quot;:[[2026,7,15]]},&quot;URL&quot;:&quot;http://sunnyday.mit.edu/16.355/intro_softarch.pdf&quot;,&quot;issued&quot;:{&quot;date-parts&quot;:[[1994]]},&quot;container-title-short&quot;:&quot;&quot;},&quot;isTemporary&quot;:false,&quot;suppress-author&quot;:false,&quot;composite&quot;:false,&quot;author-only&quot;:false}]},{&quot;citationID&quot;:&quot;MENDELEY_CITATION_ca1e0d21-5dbf-43f0-9b88-f33a4d5dc003&quot;,&quot;properties&quot;:{&quot;noteIndex&quot;:0},&quot;isEdited&quot;:false,&quot;manualOverride&quot;:{&quot;isManuallyOverridden&quot;:false,&quot;citeprocText&quot;:&quot;[9]&quot;,&quot;manualOverrideText&quot;:&quot;&quot;},&quot;citationTag&quot;:&quot;MENDELEY_CITATION_v3_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&quot;,&quot;citationItems&quot;:[{&quot;id&quot;:&quot;b5d5c9b6-734d-30de-86a9-bf8f4b4c0427&quot;,&quot;itemData&quot;:{&quot;type&quot;:&quot;report&quot;,&quot;id&quot;:&quot;b5d5c9b6-734d-30de-86a9-bf8f4b4c0427&quot;,&quot;title&quot;:&quot;An Introduction to Software Architecture&quot;,&quot;author&quot;:[{&quot;family&quot;:&quot;Garlan&quot;,&quot;given&quot;:&quot;David&quot;,&quot;parse-names&quot;:false,&quot;dropping-particle&quot;:&quot;&quot;,&quot;non-dropping-particle&quot;:&quot;&quot;},{&quot;family&quot;:&quot;Shaw&quot;,&quot;given&quot;:&quot;Mary&quot;,&quot;parse-names&quot;:false,&quot;dropping-particle&quot;:&quot;&quot;,&quot;non-dropping-particle&quot;:&quot;&quot;}],&quot;accessed&quot;:{&quot;date-parts&quot;:[[2026,7,15]]},&quot;URL&quot;:&quot;http://sunnyday.mit.edu/16.355/intro_softarch.pdf&quot;,&quot;issued&quot;:{&quot;date-parts&quot;:[[1994]]},&quot;container-title-short&quot;:&quot;&quot;},&quot;isTemporary&quot;:false,&quot;suppress-author&quot;:false,&quot;composite&quot;:false,&quot;author-only&quot;:false}]},{&quot;citationID&quot;:&quot;MENDELEY_CITATION_8eac902e-950d-488a-88f4-09b609caaa80&quot;,&quot;properties&quot;:{&quot;noteIndex&quot;:0},&quot;isEdited&quot;:false,&quot;manualOverride&quot;:{&quot;isManuallyOverridden&quot;:false,&quot;citeprocText&quot;:&quot;[9]&quot;,&quot;manualOverrideText&quot;:&quot;&quot;},&quot;citationTag&quot;:&quot;MENDELEY_CITATION_v3_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&quot;,&quot;citationItems&quot;:[{&quot;id&quot;:&quot;b5d5c9b6-734d-30de-86a9-bf8f4b4c0427&quot;,&quot;itemData&quot;:{&quot;type&quot;:&quot;report&quot;,&quot;id&quot;:&quot;b5d5c9b6-734d-30de-86a9-bf8f4b4c0427&quot;,&quot;title&quot;:&quot;An Introduction to Software Architecture&quot;,&quot;author&quot;:[{&quot;family&quot;:&quot;Garlan&quot;,&quot;given&quot;:&quot;David&quot;,&quot;parse-names&quot;:false,&quot;dropping-particle&quot;:&quot;&quot;,&quot;non-dropping-particle&quot;:&quot;&quot;},{&quot;family&quot;:&quot;Shaw&quot;,&quot;given&quot;:&quot;Mary&quot;,&quot;parse-names&quot;:false,&quot;dropping-particle&quot;:&quot;&quot;,&quot;non-dropping-particle&quot;:&quot;&quot;}],&quot;accessed&quot;:{&quot;date-parts&quot;:[[2026,7,15]]},&quot;URL&quot;:&quot;http://sunnyday.mit.edu/16.355/intro_softarch.pdf&quot;,&quot;issued&quot;:{&quot;date-parts&quot;:[[1994]]},&quot;container-title-short&quot;:&quot;&quot;},&quot;isTemporary&quot;:false,&quot;suppress-author&quot;:false,&quot;composite&quot;:false,&quot;author-only&quot;:false}]},{&quot;citationID&quot;:&quot;MENDELEY_CITATION_c419aa87-246c-46f3-9f04-3c521ede062b&quot;,&quot;properties&quot;:{&quot;noteIndex&quot;:0},&quot;isEdited&quot;:false,&quot;manualOverride&quot;:{&quot;isManuallyOverridden&quot;:false,&quot;citeprocText&quot;:&quot;[10]&quot;,&quot;manualOverrideText&quot;:&quot;&quot;},&quot;citationTag&quot;:&quot;MENDELEY_CITATION_v3_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&quot;,&quot;citationItems&quot;:[{&quot;id&quot;:&quot;021b7429-b007-3e73-b270-5d7f64fecad0&quot;,&quot;itemData&quot;:{&quot;type&quot;:&quot;report&quot;,&quot;id&quot;:&quot;021b7429-b007-3e73-b270-5d7f64fecad0&quot;,&quot;title&quot;:&quot;Reference Model for Service Oriented Architecture 1.0&quot;,&quot;author&quot;:[{&quot;family&quot;:&quot;OASIS&quot;,&quot;given&quot;:&quot;&quot;,&quot;parse-names&quot;:false,&quot;dropping-particle&quot;:&quot;&quot;,&quot;non-dropping-particle&quot;:&quot;&quot;}],&quot;accessed&quot;:{&quot;date-parts&quot;:[[2026,7,15]]},&quot;URL&quot;:&quot;https://docs.oasis-open.org/soa-rm/v1.0/soa-rm.pdf&quot;,&quot;issued&quot;:{&quot;date-parts&quot;:[[2006]]},&quot;container-title-short&quot;:&quot;&quot;},&quot;isTemporary&quot;:false,&quot;suppress-author&quot;:false,&quot;composite&quot;:false,&quot;author-only&quot;:false}]},{&quot;citationID&quot;:&quot;MENDELEY_CITATION_99cedccc-4ece-4306-bd0e-83071b07a706&quot;,&quot;properties&quot;:{&quot;noteIndex&quot;:0},&quot;isEdited&quot;:false,&quot;manualOverride&quot;:{&quot;isManuallyOverridden&quot;:false,&quot;citeprocText&quot;:&quot;[10]&quot;,&quot;manualOverrideText&quot;:&quot;&quot;},&quot;citationTag&quot;:&quot;MENDELEY_CITATION_v3_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&quot;,&quot;citationItems&quot;:[{&quot;id&quot;:&quot;021b7429-b007-3e73-b270-5d7f64fecad0&quot;,&quot;itemData&quot;:{&quot;type&quot;:&quot;report&quot;,&quot;id&quot;:&quot;021b7429-b007-3e73-b270-5d7f64fecad0&quot;,&quot;title&quot;:&quot;Reference Model for Service Oriented Architecture 1.0&quot;,&quot;author&quot;:[{&quot;family&quot;:&quot;OASIS&quot;,&quot;given&quot;:&quot;&quot;,&quot;parse-names&quot;:false,&quot;dropping-particle&quot;:&quot;&quot;,&quot;non-dropping-particle&quot;:&quot;&quot;}],&quot;accessed&quot;:{&quot;date-parts&quot;:[[2026,7,15]]},&quot;URL&quot;:&quot;https://docs.oasis-open.org/soa-rm/v1.0/soa-rm.pdf&quot;,&quot;issued&quot;:{&quot;date-parts&quot;:[[2006]]},&quot;container-title-short&quot;:&quot;&quot;},&quot;isTemporary&quot;:false,&quot;suppress-author&quot;:false,&quot;composite&quot;:false,&quot;author-only&quot;:false}]},{&quot;citationID&quot;:&quot;MENDELEY_CITATION_e462d249-f04b-4129-9a2a-720051c4562a&quot;,&quot;properties&quot;:{&quot;noteIndex&quot;:0},&quot;isEdited&quot;:false,&quot;manualOverride&quot;:{&quot;isManuallyOverridden&quot;:false,&quot;citeprocText&quot;:&quot;[11]&quot;,&quot;manualOverrideText&quot;:&quot;&quot;},&quot;citationTag&quot;:&quot;MENDELEY_CITATION_v3_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&quot;,&quot;citationItems&quot;:[{&quot;id&quot;:&quot;18046565-f8ca-3742-8dc7-37930e69a7be&quot;,&quot;itemData&quot;:{&quot;type&quot;:&quot;webpage&quot;,&quot;id&quot;:&quot;18046565-f8ca-3742-8dc7-37930e69a7be&quot;,&quot;title&quot;:&quot;Microservices: a definition of this new architectural term&quot;,&quot;author&quot;:[{&quot;family&quot;:&quot;Fowler&quot;,&quot;given&quot;:&quot;Martin&quot;,&quot;parse-names&quot;:false,&quot;dropping-particle&quot;:&quot;&quot;,&quot;non-dropping-particle&quot;:&quot;&quot;}],&quot;accessed&quot;:{&quot;date-parts&quot;:[[2026,7,15]]},&quot;URL&quot;:&quot;https://martinfowler.com/articles/microservices.html&quot;,&quot;issued&quot;:{&quot;date-parts&quot;:[[2015]]},&quot;container-title-short&quot;:&quot;&quot;},&quot;isTemporary&quot;:false,&quot;suppress-author&quot;:false,&quot;composite&quot;:false,&quot;author-only&quot;:false}]},{&quot;citationID&quot;:&quot;MENDELEY_CITATION_26a353f8-3850-4466-aea9-c52cefb3a795&quot;,&quot;properties&quot;:{&quot;noteIndex&quot;:0},&quot;isEdited&quot;:false,&quot;manualOverride&quot;:{&quot;isManuallyOverridden&quot;:false,&quot;citeprocText&quot;:&quot;[12]&quot;,&quot;manualOverrideText&quot;:&quot;&quot;},&quot;citationTag&quot;:&quot;MENDELEY_CITATION_v3_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&quot;,&quot;citationItems&quot;:[{&quot;id&quot;:&quot;6233b46a-102a-347b-9c56-697d4e0913a3&quot;,&quot;itemData&quot;:{&quot;type&quot;:&quot;paper-conference&quot;,&quot;id&quot;:&quot;6233b46a-102a-347b-9c56-697d4e0913a3&quot;,&quot;title&quot;:&quot;Scaling Memcache at Facebook&quot;,&quot;author&quot;:[{&quot;family&quot;:&quot;Nishtala&quot;,&quot;given&quot;:&quot;Rajesh&quot;,&quot;parse-names&quot;:false,&quot;dropping-particle&quot;:&quot;&quot;,&quot;non-dropping-particle&quot;:&quot;&quot;},{&quot;family&quot;:&quot;Fugal&quot;,&quot;given&quot;:&quot;Hans&quot;,&quot;parse-names&quot;:false,&quot;dropping-particle&quot;:&quot;&quot;,&quot;non-dropping-particle&quot;:&quot;&quot;},{&quot;family&quot;:&quot;Grimm&quot;,&quot;given&quot;:&quot;Steven&quot;,&quot;parse-names&quot;:false,&quot;dropping-particle&quot;:&quot;&quot;,&quot;non-dropping-particle&quot;:&quot;&quot;},{&quot;family&quot;:&quot;Kwiatkowski&quot;,&quot;given&quot;:&quot;Marc&quot;,&quot;parse-names&quot;:false,&quot;dropping-particle&quot;:&quot;&quot;,&quot;non-dropping-particle&quot;:&quot;&quot;},{&quot;family&quot;:&quot;Lee&quot;,&quot;given&quot;:&quot;Herman&quot;,&quot;parse-names&quot;:false,&quot;dropping-particle&quot;:&quot;&quot;,&quot;non-dropping-particle&quot;:&quot;&quot;},{&quot;family&quot;:&quot;Li&quot;,&quot;given&quot;:&quot;Harry C.&quot;,&quot;parse-names&quot;:false,&quot;dropping-particle&quot;:&quot;&quot;,&quot;non-dropping-particle&quot;:&quot;&quot;},{&quot;family&quot;:&quot;McElroy&quot;,&quot;given&quot;:&quot;Ryan&quot;,&quot;parse-names&quot;:false,&quot;dropping-particle&quot;:&quot;&quot;,&quot;non-dropping-particle&quot;:&quot;&quot;},{&quot;family&quot;:&quot;Paleczny&quot;,&quot;given&quot;:&quot;Mike&quot;,&quot;parse-names&quot;:false,&quot;dropping-particle&quot;:&quot;&quot;,&quot;non-dropping-particle&quot;:&quot;&quot;},{&quot;family&quot;:&quot;Peek&quot;,&quot;given&quot;:&quot;Daniel&quot;,&quot;parse-names&quot;:false,&quot;dropping-particle&quot;:&quot;&quot;,&quot;non-dropping-particle&quot;:&quot;&quot;},{&quot;family&quot;:&quot;Saab&quot;,&quot;given&quot;:&quot;Paul&quot;,&quot;parse-names&quot;:false,&quot;dropping-particle&quot;:&quot;&quot;,&quot;non-dropping-particle&quot;:&quot;&quot;},{&quot;family&quot;:&quot;Stafford&quot;,&quot;given&quot;:&quot;David&quot;,&quot;parse-names&quot;:false,&quot;dropping-particle&quot;:&quot;&quot;,&quot;non-dropping-particle&quot;:&quot;&quot;},{&quot;family&quot;:&quot;Tung&quot;,&quot;given&quot;:&quot;Tony&quot;,&quot;parse-names&quot;:false,&quot;dropping-particle&quot;:&quot;&quot;,&quot;non-dropping-particle&quot;:&quot;&quot;},{&quot;family&quot;:&quot;Venkataramani&quot;,&quot;given&quot;:&quot;Venkateshwaran&quot;,&quot;parse-names&quot;:false,&quot;dropping-particle&quot;:&quot;&quot;,&quot;non-dropping-particle&quot;:&quot;&quot;}],&quot;container-title&quot;:&quot;10th USENIX Symposium on Networked Systems Design and Implementation (NSDI 13)&quot;,&quot;accessed&quot;:{&quot;date-parts&quot;:[[2026,7,15]]},&quot;URL&quot;:&quot;https://www.usenix.org/system/files/conference/nsdi13/nsdi13-final170_update.pdf&quot;,&quot;issued&quot;:{&quot;date-parts&quot;:[[2013]]},&quot;container-title-short&quot;:&quot;&quot;},&quot;isTemporary&quot;:false,&quot;suppress-author&quot;:false,&quot;composite&quot;:false,&quot;author-only&quot;:false}]},{&quot;citationID&quot;:&quot;MENDELEY_CITATION_4b3a1f74-4d4f-4267-8694-29d5cb35c1f7&quot;,&quot;properties&quot;:{&quot;noteIndex&quot;:0},&quot;isEdited&quot;:false,&quot;manualOverride&quot;:{&quot;isManuallyOverridden&quot;:false,&quot;citeprocText&quot;:&quot;[13]&quot;,&quot;manualOverrideText&quot;:&quot;&quot;},&quot;citationTag&quot;:&quot;MENDELEY_CITATION_v3_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&quot;,&quot;citationItems&quot;:[{&quot;id&quot;:&quot;8c582986-85b1-32c1-bf30-dccf44f4e710&quot;,&quot;itemData&quot;:{&quot;type&quot;:&quot;webpage&quot;,&quot;id&quot;:&quot;8c582986-85b1-32c1-bf30-dccf44f4e710&quot;,&quot;title&quot;:&quot;Cache-Aside pattern&quot;,&quot;author&quot;:[{&quot;family&quot;:&quot;Microsoft&quot;,&quot;given&quot;:&quot;&quot;,&quot;parse-names&quot;:false,&quot;dropping-particle&quot;:&quot;&quot;,&quot;non-dropping-particle&quot;:&quot;&quot;}],&quot;accessed&quot;:{&quot;date-parts&quot;:[[2026,7,15]]},&quot;URL&quot;:&quot;https://learn.microsoft.com/en-us/azure/architecture/patterns/cache-aside&quot;,&quot;container-title-short&quot;:&quot;&quot;},&quot;isTemporary&quot;:false,&quot;suppress-author&quot;:false,&quot;composite&quot;:false,&quot;author-only&quot;:false}]},{&quot;citationID&quot;:&quot;MENDELEY_CITATION_36ff8843-8948-4508-866e-f81b5b6a28e7&quot;,&quot;properties&quot;:{&quot;noteIndex&quot;:0},&quot;isEdited&quot;:false,&quot;manualOverride&quot;:{&quot;isManuallyOverridden&quot;:false,&quot;citeprocText&quot;:&quot;[13]&quot;,&quot;manualOverrideText&quot;:&quot;&quot;},&quot;citationTag&quot;:&quot;MENDELEY_CITATION_v3_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&quot;,&quot;citationItems&quot;:[{&quot;id&quot;:&quot;8c582986-85b1-32c1-bf30-dccf44f4e710&quot;,&quot;itemData&quot;:{&quot;type&quot;:&quot;webpage&quot;,&quot;id&quot;:&quot;8c582986-85b1-32c1-bf30-dccf44f4e710&quot;,&quot;title&quot;:&quot;Cache-Aside pattern&quot;,&quot;author&quot;:[{&quot;family&quot;:&quot;Microsoft&quot;,&quot;given&quot;:&quot;&quot;,&quot;parse-names&quot;:false,&quot;dropping-particle&quot;:&quot;&quot;,&quot;non-dropping-particle&quot;:&quot;&quot;}],&quot;accessed&quot;:{&quot;date-parts&quot;:[[2026,7,15]]},&quot;URL&quot;:&quot;https://learn.microsoft.com/en-us/azure/architecture/patterns/cache-aside&quot;,&quot;container-title-short&quot;:&quot;&quot;},&quot;isTemporary&quot;:false,&quot;suppress-author&quot;:false,&quot;composite&quot;:false,&quot;author-only&quot;:false}]},{&quot;citationID&quot;:&quot;MENDELEY_CITATION_f62a679f-e176-464d-8555-d1d7ea3d2960&quot;,&quot;properties&quot;:{&quot;noteIndex&quot;:0},&quot;isEdited&quot;:false,&quot;manualOverride&quot;:{&quot;isManuallyOverridden&quot;:false,&quot;citeprocText&quot;:&quot;[14]&quot;,&quot;manualOverrideText&quot;:&quot;&quot;},&quot;citationTag&quot;:&quot;MENDELEY_CITATION_v3_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&quot;,&quot;citationItems&quot;:[{&quot;id&quot;:&quot;5dbbd7b6-e8e1-3aeb-bdaf-daff87177b36&quot;,&quot;itemData&quot;:{&quot;type&quot;:&quot;webpage&quot;,&quot;id&quot;:&quot;5dbbd7b6-e8e1-3aeb-bdaf-daff87177b36&quot;,&quot;title&quot;:&quot;Understand Redis data types&quot;,&quot;author&quot;:[{&quot;family&quot;:&quot;Redis&quot;,&quot;given&quot;:&quot;&quot;,&quot;parse-names&quot;:false,&quot;dropping-particle&quot;:&quot;&quot;,&quot;non-dropping-particle&quot;:&quot;&quot;}],&quot;accessed&quot;:{&quot;date-parts&quot;:[[2026,7,15]]},&quot;URL&quot;:&quot;https://redis.io/docs/latest/develop/data-types/&quot;,&quot;container-title-short&quot;:&quot;&quot;},&quot;isTemporary&quot;:false,&quot;suppress-author&quot;:false,&quot;composite&quot;:false,&quot;author-only&quot;:false}]},{&quot;citationID&quot;:&quot;MENDELEY_CITATION_7439f4b3-9c24-41d3-b27d-2520d26b82c1&quot;,&quot;properties&quot;:{&quot;noteIndex&quot;:0},&quot;isEdited&quot;:false,&quot;manualOverride&quot;:{&quot;isManuallyOverridden&quot;:false,&quot;citeprocText&quot;:&quot;[15]&quot;,&quot;manualOverrideText&quot;:&quot;&quot;},&quot;citationTag&quot;:&quot;MENDELEY_CITATION_v3_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&quot;,&quot;citationItems&quot;:[{&quot;id&quot;:&quot;5604af92-8e12-35f8-8d9e-89606439d148&quot;,&quot;itemData&quot;:{&quot;type&quot;:&quot;webpage&quot;,&quot;id&quot;:&quot;5604af92-8e12-35f8-8d9e-89606439d148&quot;,&quot;title&quot;:&quot;The C4 model for visualising software architecture&quot;,&quot;author&quot;:[{&quot;family&quot;:&quot;Brown&quot;,&quot;given&quot;:&quot;Simon&quot;,&quot;parse-names&quot;:false,&quot;dropping-particle&quot;:&quot;&quot;,&quot;non-dropping-particle&quot;:&quot;&quot;}],&quot;accessed&quot;:{&quot;date-parts&quot;:[[2026,7,15]]},&quot;URL&quot;:&quot;https://c4model.com&quot;,&quot;container-title-short&quot;:&quot;&quot;},&quot;isTemporary&quot;:false,&quot;suppress-author&quot;:false,&quot;composite&quot;:false,&quot;author-only&quot;:false}]}]"/>
     <we:property name="MENDELEY_CITATIONS_STYLE" value="{&quot;id&quot;:&quot;http://www.zotero.org/styles/ieee&quot;,&quot;title&quot;:&quot;IEEE Reference Guide version 11.29.2023&quot;,&quot;format&quot;:&quot;numeric&quot;,&quot;defaultLocale&quot;:null,&quot;isLocaleCodeValid&quot;:true}"/>
   </we:properties>
   <we:bindings/>

</xml_diff>